<commit_message>
Update notes: 15-09-2026 19:47
</commit_message>
<xml_diff>
--- a/Global Financial Management/notes (GFM).docx
+++ b/Global Financial Management/notes (GFM).docx
@@ -100,15 +100,7 @@
         </w:numPr>
       </w:pPr>
       <w:r>
-        <w:t xml:space="preserve">Guarantee, Risk management products, advisory services for middle income and credit worthy and </w:t>
-      </w:r>
-      <w:proofErr w:type="gramStart"/>
-      <w:r>
-        <w:t>low income</w:t>
-      </w:r>
-      <w:proofErr w:type="gramEnd"/>
-      <w:r>
-        <w:t xml:space="preserve"> countries </w:t>
+        <w:t xml:space="preserve">Guarantee, Risk management products, advisory services for middle income and credit worthy and low income countries </w:t>
       </w:r>
     </w:p>
     <w:p>
@@ -3749,6 +3741,422 @@
       </w:r>
     </w:p>
     <w:p/>
+    <w:p>
+      <w:r>
+        <w:t>15/09/2026</w:t>
+      </w:r>
+    </w:p>
+    <w:p/>
+    <w:p>
+      <w:r>
+        <w:t>Quoting in the foreign exchange market:</w:t>
+      </w:r>
+    </w:p>
+    <w:p>
+      <w:pPr>
+        <w:pStyle w:val="ListParagraph"/>
+        <w:numPr>
+          <w:ilvl w:val="0"/>
+          <w:numId w:val="25"/>
+        </w:numPr>
+      </w:pPr>
+      <w:r>
+        <w:t>Foreign exchange rates are quoted either for immediate delivery (spot rate)</w:t>
+      </w:r>
+    </w:p>
+    <w:p>
+      <w:pPr>
+        <w:pStyle w:val="ListParagraph"/>
+        <w:numPr>
+          <w:ilvl w:val="0"/>
+          <w:numId w:val="25"/>
+        </w:numPr>
+      </w:pPr>
+      <w:r>
+        <w:t>Or for delivery on a future date (forward rate)</w:t>
+      </w:r>
+    </w:p>
+    <w:p>
+      <w:pPr>
+        <w:pStyle w:val="ListParagraph"/>
+        <w:numPr>
+          <w:ilvl w:val="0"/>
+          <w:numId w:val="25"/>
+        </w:numPr>
+      </w:pPr>
+      <w:r>
+        <w:t>In practice delivery in spot market is made two days later</w:t>
+      </w:r>
+    </w:p>
+    <w:p>
+      <w:pPr>
+        <w:pStyle w:val="ListParagraph"/>
+        <w:numPr>
+          <w:ilvl w:val="0"/>
+          <w:numId w:val="25"/>
+        </w:numPr>
+      </w:pPr>
+      <w:r>
+        <w:t>Quotation is the price of a currency expressed in the units of another currency</w:t>
+      </w:r>
+    </w:p>
+    <w:p/>
+    <w:p>
+      <w:r>
+        <w:t>Types:</w:t>
+      </w:r>
+    </w:p>
+    <w:p>
+      <w:pPr>
+        <w:pStyle w:val="ListParagraph"/>
+        <w:numPr>
+          <w:ilvl w:val="0"/>
+          <w:numId w:val="26"/>
+        </w:numPr>
+      </w:pPr>
+      <w:r>
+        <w:t>Direct</w:t>
+      </w:r>
+    </w:p>
+    <w:p>
+      <w:pPr>
+        <w:pStyle w:val="ListParagraph"/>
+        <w:numPr>
+          <w:ilvl w:val="0"/>
+          <w:numId w:val="26"/>
+        </w:numPr>
+      </w:pPr>
+      <w:r>
+        <w:t>Indirect</w:t>
+      </w:r>
+    </w:p>
+    <w:p>
+      <w:pPr>
+        <w:ind w:left="360"/>
+      </w:pPr>
+      <w:r>
+        <w:t xml:space="preserve">1. direct quotation – so many units of foreign currency as equivalent to a fixed number of units of home currency. Eg in </w:t>
+      </w:r>
+      <w:proofErr w:type="spellStart"/>
+      <w:r>
+        <w:t>india</w:t>
+      </w:r>
+      <w:proofErr w:type="spellEnd"/>
+      <w:r>
+        <w:t xml:space="preserve"> 95.88 INR = 1 USD (is a direct quotation for USD in India)</w:t>
+      </w:r>
+      <w:r>
+        <w:t xml:space="preserve"> </w:t>
+      </w:r>
+    </w:p>
+    <w:p>
+      <w:pPr>
+        <w:ind w:left="360"/>
+      </w:pPr>
+      <w:r>
+        <w:lastRenderedPageBreak/>
+        <w:t xml:space="preserve">2. In </w:t>
+      </w:r>
+      <w:r>
+        <w:t xml:space="preserve">1 </w:t>
+      </w:r>
+      <w:r>
+        <w:t>US</w:t>
+      </w:r>
+      <w:r>
+        <w:t>D</w:t>
+      </w:r>
+      <w:r>
+        <w:t xml:space="preserve"> = </w:t>
+      </w:r>
+      <w:r>
+        <w:t>0.87 EUR</w:t>
+      </w:r>
+    </w:p>
+    <w:p/>
+    <w:p>
+      <w:r>
+        <w:t xml:space="preserve">Spread: the difference between the ask price and bid price </w:t>
+      </w:r>
+    </w:p>
+    <w:p>
+      <w:pPr>
+        <w:rPr>
+          <w:rFonts w:eastAsiaTheme="minorEastAsia"/>
+        </w:rPr>
+      </w:pPr>
+      <w:r>
+        <w:t xml:space="preserve">Per cent spread = </w:t>
+      </w:r>
+      <m:oMath>
+        <m:f>
+          <m:fPr>
+            <m:ctrlPr>
+              <w:rPr>
+                <w:rFonts w:ascii="Cambria Math" w:hAnsi="Cambria Math"/>
+                <w:i/>
+              </w:rPr>
+            </m:ctrlPr>
+          </m:fPr>
+          <m:num>
+            <m:r>
+              <w:rPr>
+                <w:rFonts w:ascii="Cambria Math" w:hAnsi="Cambria Math"/>
+              </w:rPr>
+              <m:t>Ask price - Bid price</m:t>
+            </m:r>
+          </m:num>
+          <m:den>
+            <m:r>
+              <w:rPr>
+                <w:rFonts w:ascii="Cambria Math" w:hAnsi="Cambria Math"/>
+              </w:rPr>
+              <m:t>ask price</m:t>
+            </m:r>
+          </m:den>
+        </m:f>
+        <m:r>
+          <w:rPr>
+            <w:rFonts w:ascii="Cambria Math" w:hAnsi="Cambria Math"/>
+          </w:rPr>
+          <m:t>×100</m:t>
+        </m:r>
+      </m:oMath>
+    </w:p>
+    <w:p>
+      <w:pPr>
+        <w:rPr>
+          <w:rFonts w:eastAsiaTheme="minorEastAsia"/>
+        </w:rPr>
+      </w:pPr>
+      <w:r>
+        <w:rPr>
+          <w:rFonts w:eastAsiaTheme="minorEastAsia"/>
+        </w:rPr>
+        <w:t>Dollar quoted Rs. 95.0000 – 95.0050</w:t>
+      </w:r>
+    </w:p>
+    <w:p>
+      <w:pPr>
+        <w:rPr>
+          <w:rFonts w:eastAsiaTheme="minorEastAsia"/>
+        </w:rPr>
+      </w:pPr>
+      <w:r>
+        <w:rPr>
+          <w:rFonts w:eastAsiaTheme="minorEastAsia"/>
+        </w:rPr>
+        <w:t>The percentage spread equals = 0.014</w:t>
+      </w:r>
+    </w:p>
+    <w:p>
+      <w:pPr>
+        <w:rPr>
+          <w:rFonts w:eastAsiaTheme="minorEastAsia"/>
+        </w:rPr>
+      </w:pPr>
+      <m:oMathPara>
+        <m:oMath>
+          <m:f>
+            <m:fPr>
+              <m:ctrlPr>
+                <w:rPr>
+                  <w:rFonts w:ascii="Cambria Math" w:hAnsi="Cambria Math"/>
+                  <w:i/>
+                </w:rPr>
+              </m:ctrlPr>
+            </m:fPr>
+            <m:num>
+              <m:r>
+                <w:rPr>
+                  <w:rFonts w:ascii="Cambria Math" w:hAnsi="Cambria Math"/>
+                </w:rPr>
+                <m:t>95.0050 - 95.0000</m:t>
+              </m:r>
+            </m:num>
+            <m:den>
+              <m:r>
+                <w:rPr>
+                  <w:rFonts w:ascii="Cambria Math" w:hAnsi="Cambria Math"/>
+                </w:rPr>
+                <m:t>95.0050</m:t>
+              </m:r>
+            </m:den>
+          </m:f>
+          <m:r>
+            <w:rPr>
+              <w:rFonts w:ascii="Cambria Math" w:hAnsi="Cambria Math"/>
+            </w:rPr>
+            <m:t>×100</m:t>
+          </m:r>
+          <m:r>
+            <w:rPr>
+              <w:rFonts w:ascii="Cambria Math" w:eastAsiaTheme="minorEastAsia" w:hAnsi="Cambria Math"/>
+            </w:rPr>
+            <m:t xml:space="preserve"> = 0.00526288%</m:t>
+          </m:r>
+        </m:oMath>
+      </m:oMathPara>
+    </w:p>
+    <w:p>
+      <w:pPr>
+        <w:rPr>
+          <w:rFonts w:eastAsiaTheme="minorEastAsia"/>
+        </w:rPr>
+      </w:pPr>
+    </w:p>
+    <w:p>
+      <w:pPr>
+        <w:rPr>
+          <w:rFonts w:eastAsiaTheme="minorEastAsia"/>
+        </w:rPr>
+      </w:pPr>
+      <w:r>
+        <w:rPr>
+          <w:rFonts w:eastAsiaTheme="minorEastAsia"/>
+        </w:rPr>
+        <w:t>Cross rates: the price of any currency other than the home currency in other words the direct relationship between to non-home currencies in a foreign exchange market</w:t>
+      </w:r>
+    </w:p>
+    <w:p>
+      <w:pPr>
+        <w:rPr>
+          <w:rFonts w:eastAsiaTheme="minorEastAsia"/>
+        </w:rPr>
+      </w:pPr>
+      <w:proofErr w:type="spellStart"/>
+      <w:r>
+        <w:rPr>
+          <w:rFonts w:eastAsiaTheme="minorEastAsia"/>
+        </w:rPr>
+        <w:t>Eg.</w:t>
+      </w:r>
+      <w:proofErr w:type="spellEnd"/>
+      <w:r>
+        <w:rPr>
+          <w:rFonts w:eastAsiaTheme="minorEastAsia"/>
+        </w:rPr>
+        <w:t xml:space="preserve"> USD for EUR, JPY/CNY </w:t>
+      </w:r>
+    </w:p>
+    <w:p>
+      <w:pPr>
+        <w:rPr>
+          <w:rFonts w:eastAsiaTheme="minorEastAsia"/>
+        </w:rPr>
+      </w:pPr>
+    </w:p>
+    <w:p>
+      <w:pPr>
+        <w:rPr>
+          <w:rFonts w:eastAsiaTheme="minorEastAsia"/>
+        </w:rPr>
+      </w:pPr>
+      <w:r>
+        <w:rPr>
+          <w:rFonts w:eastAsiaTheme="minorEastAsia"/>
+        </w:rPr>
+        <w:t xml:space="preserve">Settlements: </w:t>
+      </w:r>
+    </w:p>
+    <w:p>
+      <w:pPr>
+        <w:pStyle w:val="ListParagraph"/>
+        <w:numPr>
+          <w:ilvl w:val="0"/>
+          <w:numId w:val="27"/>
+        </w:numPr>
+        <w:rPr>
+          <w:rFonts w:eastAsiaTheme="minorEastAsia"/>
+        </w:rPr>
+      </w:pPr>
+      <w:r>
+        <w:rPr>
+          <w:rFonts w:eastAsiaTheme="minorEastAsia"/>
+        </w:rPr>
+        <w:t>Cash</w:t>
+      </w:r>
+      <w:r>
+        <w:rPr>
+          <w:rFonts w:eastAsiaTheme="minorEastAsia"/>
+        </w:rPr>
+        <w:t xml:space="preserve">: cash rate or ready rate, is the rate when the exchange of currencies takes place on the date of the deal. </w:t>
+      </w:r>
+    </w:p>
+    <w:p>
+      <w:pPr>
+        <w:pStyle w:val="ListParagraph"/>
+        <w:numPr>
+          <w:ilvl w:val="0"/>
+          <w:numId w:val="27"/>
+        </w:numPr>
+        <w:rPr>
+          <w:rFonts w:eastAsiaTheme="minorEastAsia"/>
+        </w:rPr>
+      </w:pPr>
+      <w:r>
+        <w:rPr>
+          <w:rFonts w:eastAsiaTheme="minorEastAsia"/>
+        </w:rPr>
+        <w:t>TOM (tomorrow rate): exchange of currency on next working day (after the date of deal)</w:t>
+      </w:r>
+    </w:p>
+    <w:p>
+      <w:pPr>
+        <w:pStyle w:val="ListParagraph"/>
+        <w:numPr>
+          <w:ilvl w:val="0"/>
+          <w:numId w:val="27"/>
+        </w:numPr>
+        <w:rPr>
+          <w:rFonts w:eastAsiaTheme="minorEastAsia"/>
+        </w:rPr>
+      </w:pPr>
+      <w:r>
+        <w:rPr>
+          <w:rFonts w:eastAsiaTheme="minorEastAsia"/>
+        </w:rPr>
+        <w:t>SPOT rate: exchange of currencies takes place on 2</w:t>
+      </w:r>
+      <w:r>
+        <w:rPr>
+          <w:rFonts w:eastAsiaTheme="minorEastAsia"/>
+          <w:vertAlign w:val="superscript"/>
+        </w:rPr>
+        <w:t>nd</w:t>
+      </w:r>
+      <w:r>
+        <w:rPr>
+          <w:rFonts w:eastAsiaTheme="minorEastAsia"/>
+        </w:rPr>
+        <w:t xml:space="preserve"> working day </w:t>
+      </w:r>
+    </w:p>
+    <w:p>
+      <w:pPr>
+        <w:pStyle w:val="ListParagraph"/>
+        <w:numPr>
+          <w:ilvl w:val="0"/>
+          <w:numId w:val="27"/>
+        </w:numPr>
+        <w:rPr>
+          <w:rFonts w:eastAsiaTheme="minorEastAsia"/>
+        </w:rPr>
+      </w:pPr>
+      <w:r>
+        <w:rPr>
+          <w:rFonts w:eastAsiaTheme="minorEastAsia"/>
+        </w:rPr>
+        <w:t xml:space="preserve">Forward rate: exchange of currencies takes place after a certain period from the date of the deal (more than 2 working days) </w:t>
+      </w:r>
+    </w:p>
+    <w:p>
+      <w:pPr>
+        <w:rPr>
+          <w:rFonts w:eastAsiaTheme="minorEastAsia"/>
+        </w:rPr>
+      </w:pPr>
+    </w:p>
     <w:sectPr>
       <w:pgSz w:w="11906" w:h="16838"/>
       <w:pgMar w:top="1440" w:right="1440" w:bottom="1440" w:left="1440" w:header="708" w:footer="708" w:gutter="0"/>
@@ -4074,6 +4482,119 @@
     </w:lvl>
   </w:abstractNum>
   <w:abstractNum w:abstractNumId="3" w15:restartNumberingAfterBreak="0">
+    <w:nsid w:val="0BCE7DF0"/>
+    <w:multiLevelType w:val="hybridMultilevel"/>
+    <w:tmpl w:val="4502F46E"/>
+    <w:lvl w:ilvl="0" w:tplc="40090001">
+      <w:start w:val="1"/>
+      <w:numFmt w:val="bullet"/>
+      <w:lvlText w:val=""/>
+      <w:lvlJc w:val="left"/>
+      <w:pPr>
+        <w:ind w:left="720" w:hanging="360"/>
+      </w:pPr>
+      <w:rPr>
+        <w:rFonts w:ascii="Symbol" w:hAnsi="Symbol" w:hint="default"/>
+      </w:rPr>
+    </w:lvl>
+    <w:lvl w:ilvl="1" w:tplc="40090003" w:tentative="1">
+      <w:start w:val="1"/>
+      <w:numFmt w:val="bullet"/>
+      <w:lvlText w:val="o"/>
+      <w:lvlJc w:val="left"/>
+      <w:pPr>
+        <w:ind w:left="1440" w:hanging="360"/>
+      </w:pPr>
+      <w:rPr>
+        <w:rFonts w:ascii="Courier New" w:hAnsi="Courier New" w:cs="Courier New" w:hint="default"/>
+      </w:rPr>
+    </w:lvl>
+    <w:lvl w:ilvl="2" w:tplc="40090005" w:tentative="1">
+      <w:start w:val="1"/>
+      <w:numFmt w:val="bullet"/>
+      <w:lvlText w:val=""/>
+      <w:lvlJc w:val="left"/>
+      <w:pPr>
+        <w:ind w:left="2160" w:hanging="360"/>
+      </w:pPr>
+      <w:rPr>
+        <w:rFonts w:ascii="Wingdings" w:hAnsi="Wingdings" w:hint="default"/>
+      </w:rPr>
+    </w:lvl>
+    <w:lvl w:ilvl="3" w:tplc="40090001" w:tentative="1">
+      <w:start w:val="1"/>
+      <w:numFmt w:val="bullet"/>
+      <w:lvlText w:val=""/>
+      <w:lvlJc w:val="left"/>
+      <w:pPr>
+        <w:ind w:left="2880" w:hanging="360"/>
+      </w:pPr>
+      <w:rPr>
+        <w:rFonts w:ascii="Symbol" w:hAnsi="Symbol" w:hint="default"/>
+      </w:rPr>
+    </w:lvl>
+    <w:lvl w:ilvl="4" w:tplc="40090003" w:tentative="1">
+      <w:start w:val="1"/>
+      <w:numFmt w:val="bullet"/>
+      <w:lvlText w:val="o"/>
+      <w:lvlJc w:val="left"/>
+      <w:pPr>
+        <w:ind w:left="3600" w:hanging="360"/>
+      </w:pPr>
+      <w:rPr>
+        <w:rFonts w:ascii="Courier New" w:hAnsi="Courier New" w:cs="Courier New" w:hint="default"/>
+      </w:rPr>
+    </w:lvl>
+    <w:lvl w:ilvl="5" w:tplc="40090005" w:tentative="1">
+      <w:start w:val="1"/>
+      <w:numFmt w:val="bullet"/>
+      <w:lvlText w:val=""/>
+      <w:lvlJc w:val="left"/>
+      <w:pPr>
+        <w:ind w:left="4320" w:hanging="360"/>
+      </w:pPr>
+      <w:rPr>
+        <w:rFonts w:ascii="Wingdings" w:hAnsi="Wingdings" w:hint="default"/>
+      </w:rPr>
+    </w:lvl>
+    <w:lvl w:ilvl="6" w:tplc="40090001" w:tentative="1">
+      <w:start w:val="1"/>
+      <w:numFmt w:val="bullet"/>
+      <w:lvlText w:val=""/>
+      <w:lvlJc w:val="left"/>
+      <w:pPr>
+        <w:ind w:left="5040" w:hanging="360"/>
+      </w:pPr>
+      <w:rPr>
+        <w:rFonts w:ascii="Symbol" w:hAnsi="Symbol" w:hint="default"/>
+      </w:rPr>
+    </w:lvl>
+    <w:lvl w:ilvl="7" w:tplc="40090003" w:tentative="1">
+      <w:start w:val="1"/>
+      <w:numFmt w:val="bullet"/>
+      <w:lvlText w:val="o"/>
+      <w:lvlJc w:val="left"/>
+      <w:pPr>
+        <w:ind w:left="5760" w:hanging="360"/>
+      </w:pPr>
+      <w:rPr>
+        <w:rFonts w:ascii="Courier New" w:hAnsi="Courier New" w:cs="Courier New" w:hint="default"/>
+      </w:rPr>
+    </w:lvl>
+    <w:lvl w:ilvl="8" w:tplc="40090005" w:tentative="1">
+      <w:start w:val="1"/>
+      <w:numFmt w:val="bullet"/>
+      <w:lvlText w:val=""/>
+      <w:lvlJc w:val="left"/>
+      <w:pPr>
+        <w:ind w:left="6480" w:hanging="360"/>
+      </w:pPr>
+      <w:rPr>
+        <w:rFonts w:ascii="Wingdings" w:hAnsi="Wingdings" w:hint="default"/>
+      </w:rPr>
+    </w:lvl>
+  </w:abstractNum>
+  <w:abstractNum w:abstractNumId="4" w15:restartNumberingAfterBreak="0">
     <w:nsid w:val="0C0C5C67"/>
     <w:multiLevelType w:val="hybridMultilevel"/>
     <w:tmpl w:val="5924474E"/>
@@ -4159,7 +4680,120 @@
       </w:pPr>
     </w:lvl>
   </w:abstractNum>
-  <w:abstractNum w:abstractNumId="4" w15:restartNumberingAfterBreak="0">
+  <w:abstractNum w:abstractNumId="5" w15:restartNumberingAfterBreak="0">
+    <w:nsid w:val="0DF5196A"/>
+    <w:multiLevelType w:val="hybridMultilevel"/>
+    <w:tmpl w:val="42C02A96"/>
+    <w:lvl w:ilvl="0" w:tplc="40090001">
+      <w:start w:val="1"/>
+      <w:numFmt w:val="bullet"/>
+      <w:lvlText w:val=""/>
+      <w:lvlJc w:val="left"/>
+      <w:pPr>
+        <w:ind w:left="720" w:hanging="360"/>
+      </w:pPr>
+      <w:rPr>
+        <w:rFonts w:ascii="Symbol" w:hAnsi="Symbol" w:hint="default"/>
+      </w:rPr>
+    </w:lvl>
+    <w:lvl w:ilvl="1" w:tplc="40090003" w:tentative="1">
+      <w:start w:val="1"/>
+      <w:numFmt w:val="bullet"/>
+      <w:lvlText w:val="o"/>
+      <w:lvlJc w:val="left"/>
+      <w:pPr>
+        <w:ind w:left="1440" w:hanging="360"/>
+      </w:pPr>
+      <w:rPr>
+        <w:rFonts w:ascii="Courier New" w:hAnsi="Courier New" w:cs="Courier New" w:hint="default"/>
+      </w:rPr>
+    </w:lvl>
+    <w:lvl w:ilvl="2" w:tplc="40090005" w:tentative="1">
+      <w:start w:val="1"/>
+      <w:numFmt w:val="bullet"/>
+      <w:lvlText w:val=""/>
+      <w:lvlJc w:val="left"/>
+      <w:pPr>
+        <w:ind w:left="2160" w:hanging="360"/>
+      </w:pPr>
+      <w:rPr>
+        <w:rFonts w:ascii="Wingdings" w:hAnsi="Wingdings" w:hint="default"/>
+      </w:rPr>
+    </w:lvl>
+    <w:lvl w:ilvl="3" w:tplc="40090001" w:tentative="1">
+      <w:start w:val="1"/>
+      <w:numFmt w:val="bullet"/>
+      <w:lvlText w:val=""/>
+      <w:lvlJc w:val="left"/>
+      <w:pPr>
+        <w:ind w:left="2880" w:hanging="360"/>
+      </w:pPr>
+      <w:rPr>
+        <w:rFonts w:ascii="Symbol" w:hAnsi="Symbol" w:hint="default"/>
+      </w:rPr>
+    </w:lvl>
+    <w:lvl w:ilvl="4" w:tplc="40090003" w:tentative="1">
+      <w:start w:val="1"/>
+      <w:numFmt w:val="bullet"/>
+      <w:lvlText w:val="o"/>
+      <w:lvlJc w:val="left"/>
+      <w:pPr>
+        <w:ind w:left="3600" w:hanging="360"/>
+      </w:pPr>
+      <w:rPr>
+        <w:rFonts w:ascii="Courier New" w:hAnsi="Courier New" w:cs="Courier New" w:hint="default"/>
+      </w:rPr>
+    </w:lvl>
+    <w:lvl w:ilvl="5" w:tplc="40090005" w:tentative="1">
+      <w:start w:val="1"/>
+      <w:numFmt w:val="bullet"/>
+      <w:lvlText w:val=""/>
+      <w:lvlJc w:val="left"/>
+      <w:pPr>
+        <w:ind w:left="4320" w:hanging="360"/>
+      </w:pPr>
+      <w:rPr>
+        <w:rFonts w:ascii="Wingdings" w:hAnsi="Wingdings" w:hint="default"/>
+      </w:rPr>
+    </w:lvl>
+    <w:lvl w:ilvl="6" w:tplc="40090001" w:tentative="1">
+      <w:start w:val="1"/>
+      <w:numFmt w:val="bullet"/>
+      <w:lvlText w:val=""/>
+      <w:lvlJc w:val="left"/>
+      <w:pPr>
+        <w:ind w:left="5040" w:hanging="360"/>
+      </w:pPr>
+      <w:rPr>
+        <w:rFonts w:ascii="Symbol" w:hAnsi="Symbol" w:hint="default"/>
+      </w:rPr>
+    </w:lvl>
+    <w:lvl w:ilvl="7" w:tplc="40090003" w:tentative="1">
+      <w:start w:val="1"/>
+      <w:numFmt w:val="bullet"/>
+      <w:lvlText w:val="o"/>
+      <w:lvlJc w:val="left"/>
+      <w:pPr>
+        <w:ind w:left="5760" w:hanging="360"/>
+      </w:pPr>
+      <w:rPr>
+        <w:rFonts w:ascii="Courier New" w:hAnsi="Courier New" w:cs="Courier New" w:hint="default"/>
+      </w:rPr>
+    </w:lvl>
+    <w:lvl w:ilvl="8" w:tplc="40090005" w:tentative="1">
+      <w:start w:val="1"/>
+      <w:numFmt w:val="bullet"/>
+      <w:lvlText w:val=""/>
+      <w:lvlJc w:val="left"/>
+      <w:pPr>
+        <w:ind w:left="6480" w:hanging="360"/>
+      </w:pPr>
+      <w:rPr>
+        <w:rFonts w:ascii="Wingdings" w:hAnsi="Wingdings" w:hint="default"/>
+      </w:rPr>
+    </w:lvl>
+  </w:abstractNum>
+  <w:abstractNum w:abstractNumId="6" w15:restartNumberingAfterBreak="0">
     <w:nsid w:val="1039038F"/>
     <w:multiLevelType w:val="hybridMultilevel"/>
     <w:tmpl w:val="4AF28FCE"/>
@@ -4272,7 +4906,7 @@
       </w:rPr>
     </w:lvl>
   </w:abstractNum>
-  <w:abstractNum w:abstractNumId="5" w15:restartNumberingAfterBreak="0">
+  <w:abstractNum w:abstractNumId="7" w15:restartNumberingAfterBreak="0">
     <w:nsid w:val="124A5982"/>
     <w:multiLevelType w:val="hybridMultilevel"/>
     <w:tmpl w:val="CC346F0E"/>
@@ -4385,7 +5019,7 @@
       </w:rPr>
     </w:lvl>
   </w:abstractNum>
-  <w:abstractNum w:abstractNumId="6" w15:restartNumberingAfterBreak="0">
+  <w:abstractNum w:abstractNumId="8" w15:restartNumberingAfterBreak="0">
     <w:nsid w:val="12F73C13"/>
     <w:multiLevelType w:val="hybridMultilevel"/>
     <w:tmpl w:val="A456F852"/>
@@ -4498,7 +5132,7 @@
       </w:rPr>
     </w:lvl>
   </w:abstractNum>
-  <w:abstractNum w:abstractNumId="7" w15:restartNumberingAfterBreak="0">
+  <w:abstractNum w:abstractNumId="9" w15:restartNumberingAfterBreak="0">
     <w:nsid w:val="1C4F2E27"/>
     <w:multiLevelType w:val="hybridMultilevel"/>
     <w:tmpl w:val="A8D0E3AA"/>
@@ -4584,7 +5218,7 @@
       </w:pPr>
     </w:lvl>
   </w:abstractNum>
-  <w:abstractNum w:abstractNumId="8" w15:restartNumberingAfterBreak="0">
+  <w:abstractNum w:abstractNumId="10" w15:restartNumberingAfterBreak="0">
     <w:nsid w:val="1C936017"/>
     <w:multiLevelType w:val="hybridMultilevel"/>
     <w:tmpl w:val="4844B798"/>
@@ -4697,7 +5331,7 @@
       </w:rPr>
     </w:lvl>
   </w:abstractNum>
-  <w:abstractNum w:abstractNumId="9" w15:restartNumberingAfterBreak="0">
+  <w:abstractNum w:abstractNumId="11" w15:restartNumberingAfterBreak="0">
     <w:nsid w:val="23C02DA6"/>
     <w:multiLevelType w:val="hybridMultilevel"/>
     <w:tmpl w:val="0DC828C4"/>
@@ -4783,7 +5417,7 @@
       </w:pPr>
     </w:lvl>
   </w:abstractNum>
-  <w:abstractNum w:abstractNumId="10" w15:restartNumberingAfterBreak="0">
+  <w:abstractNum w:abstractNumId="12" w15:restartNumberingAfterBreak="0">
     <w:nsid w:val="29863564"/>
     <w:multiLevelType w:val="hybridMultilevel"/>
     <w:tmpl w:val="E7869C1E"/>
@@ -4896,7 +5530,7 @@
       </w:rPr>
     </w:lvl>
   </w:abstractNum>
-  <w:abstractNum w:abstractNumId="11" w15:restartNumberingAfterBreak="0">
+  <w:abstractNum w:abstractNumId="13" w15:restartNumberingAfterBreak="0">
     <w:nsid w:val="3C8E5C31"/>
     <w:multiLevelType w:val="hybridMultilevel"/>
     <w:tmpl w:val="EA44B09A"/>
@@ -5009,7 +5643,7 @@
       </w:rPr>
     </w:lvl>
   </w:abstractNum>
-  <w:abstractNum w:abstractNumId="12" w15:restartNumberingAfterBreak="0">
+  <w:abstractNum w:abstractNumId="14" w15:restartNumberingAfterBreak="0">
     <w:nsid w:val="41AD58C6"/>
     <w:multiLevelType w:val="multilevel"/>
     <w:tmpl w:val="7E38A916"/>
@@ -5122,7 +5756,7 @@
       </w:rPr>
     </w:lvl>
   </w:abstractNum>
-  <w:abstractNum w:abstractNumId="13" w15:restartNumberingAfterBreak="0">
+  <w:abstractNum w:abstractNumId="15" w15:restartNumberingAfterBreak="0">
     <w:nsid w:val="431D7608"/>
     <w:multiLevelType w:val="hybridMultilevel"/>
     <w:tmpl w:val="C5E69A72"/>
@@ -5235,7 +5869,120 @@
       </w:rPr>
     </w:lvl>
   </w:abstractNum>
-  <w:abstractNum w:abstractNumId="14" w15:restartNumberingAfterBreak="0">
+  <w:abstractNum w:abstractNumId="16" w15:restartNumberingAfterBreak="0">
+    <w:nsid w:val="44A9496F"/>
+    <w:multiLevelType w:val="hybridMultilevel"/>
+    <w:tmpl w:val="E2CE8262"/>
+    <w:lvl w:ilvl="0" w:tplc="40090001">
+      <w:start w:val="1"/>
+      <w:numFmt w:val="bullet"/>
+      <w:lvlText w:val=""/>
+      <w:lvlJc w:val="left"/>
+      <w:pPr>
+        <w:ind w:left="720" w:hanging="360"/>
+      </w:pPr>
+      <w:rPr>
+        <w:rFonts w:ascii="Symbol" w:hAnsi="Symbol" w:hint="default"/>
+      </w:rPr>
+    </w:lvl>
+    <w:lvl w:ilvl="1" w:tplc="40090003" w:tentative="1">
+      <w:start w:val="1"/>
+      <w:numFmt w:val="bullet"/>
+      <w:lvlText w:val="o"/>
+      <w:lvlJc w:val="left"/>
+      <w:pPr>
+        <w:ind w:left="1440" w:hanging="360"/>
+      </w:pPr>
+      <w:rPr>
+        <w:rFonts w:ascii="Courier New" w:hAnsi="Courier New" w:cs="Courier New" w:hint="default"/>
+      </w:rPr>
+    </w:lvl>
+    <w:lvl w:ilvl="2" w:tplc="40090005" w:tentative="1">
+      <w:start w:val="1"/>
+      <w:numFmt w:val="bullet"/>
+      <w:lvlText w:val=""/>
+      <w:lvlJc w:val="left"/>
+      <w:pPr>
+        <w:ind w:left="2160" w:hanging="360"/>
+      </w:pPr>
+      <w:rPr>
+        <w:rFonts w:ascii="Wingdings" w:hAnsi="Wingdings" w:hint="default"/>
+      </w:rPr>
+    </w:lvl>
+    <w:lvl w:ilvl="3" w:tplc="40090001" w:tentative="1">
+      <w:start w:val="1"/>
+      <w:numFmt w:val="bullet"/>
+      <w:lvlText w:val=""/>
+      <w:lvlJc w:val="left"/>
+      <w:pPr>
+        <w:ind w:left="2880" w:hanging="360"/>
+      </w:pPr>
+      <w:rPr>
+        <w:rFonts w:ascii="Symbol" w:hAnsi="Symbol" w:hint="default"/>
+      </w:rPr>
+    </w:lvl>
+    <w:lvl w:ilvl="4" w:tplc="40090003" w:tentative="1">
+      <w:start w:val="1"/>
+      <w:numFmt w:val="bullet"/>
+      <w:lvlText w:val="o"/>
+      <w:lvlJc w:val="left"/>
+      <w:pPr>
+        <w:ind w:left="3600" w:hanging="360"/>
+      </w:pPr>
+      <w:rPr>
+        <w:rFonts w:ascii="Courier New" w:hAnsi="Courier New" w:cs="Courier New" w:hint="default"/>
+      </w:rPr>
+    </w:lvl>
+    <w:lvl w:ilvl="5" w:tplc="40090005" w:tentative="1">
+      <w:start w:val="1"/>
+      <w:numFmt w:val="bullet"/>
+      <w:lvlText w:val=""/>
+      <w:lvlJc w:val="left"/>
+      <w:pPr>
+        <w:ind w:left="4320" w:hanging="360"/>
+      </w:pPr>
+      <w:rPr>
+        <w:rFonts w:ascii="Wingdings" w:hAnsi="Wingdings" w:hint="default"/>
+      </w:rPr>
+    </w:lvl>
+    <w:lvl w:ilvl="6" w:tplc="40090001" w:tentative="1">
+      <w:start w:val="1"/>
+      <w:numFmt w:val="bullet"/>
+      <w:lvlText w:val=""/>
+      <w:lvlJc w:val="left"/>
+      <w:pPr>
+        <w:ind w:left="5040" w:hanging="360"/>
+      </w:pPr>
+      <w:rPr>
+        <w:rFonts w:ascii="Symbol" w:hAnsi="Symbol" w:hint="default"/>
+      </w:rPr>
+    </w:lvl>
+    <w:lvl w:ilvl="7" w:tplc="40090003" w:tentative="1">
+      <w:start w:val="1"/>
+      <w:numFmt w:val="bullet"/>
+      <w:lvlText w:val="o"/>
+      <w:lvlJc w:val="left"/>
+      <w:pPr>
+        <w:ind w:left="5760" w:hanging="360"/>
+      </w:pPr>
+      <w:rPr>
+        <w:rFonts w:ascii="Courier New" w:hAnsi="Courier New" w:cs="Courier New" w:hint="default"/>
+      </w:rPr>
+    </w:lvl>
+    <w:lvl w:ilvl="8" w:tplc="40090005" w:tentative="1">
+      <w:start w:val="1"/>
+      <w:numFmt w:val="bullet"/>
+      <w:lvlText w:val=""/>
+      <w:lvlJc w:val="left"/>
+      <w:pPr>
+        <w:ind w:left="6480" w:hanging="360"/>
+      </w:pPr>
+      <w:rPr>
+        <w:rFonts w:ascii="Wingdings" w:hAnsi="Wingdings" w:hint="default"/>
+      </w:rPr>
+    </w:lvl>
+  </w:abstractNum>
+  <w:abstractNum w:abstractNumId="17" w15:restartNumberingAfterBreak="0">
     <w:nsid w:val="4A8F11C9"/>
     <w:multiLevelType w:val="hybridMultilevel"/>
     <w:tmpl w:val="08621260"/>
@@ -5321,7 +6068,7 @@
       </w:pPr>
     </w:lvl>
   </w:abstractNum>
-  <w:abstractNum w:abstractNumId="15" w15:restartNumberingAfterBreak="0">
+  <w:abstractNum w:abstractNumId="18" w15:restartNumberingAfterBreak="0">
     <w:nsid w:val="4ED20252"/>
     <w:multiLevelType w:val="hybridMultilevel"/>
     <w:tmpl w:val="5080C704"/>
@@ -5407,7 +6154,7 @@
       </w:pPr>
     </w:lvl>
   </w:abstractNum>
-  <w:abstractNum w:abstractNumId="16" w15:restartNumberingAfterBreak="0">
+  <w:abstractNum w:abstractNumId="19" w15:restartNumberingAfterBreak="0">
     <w:nsid w:val="4F0B2763"/>
     <w:multiLevelType w:val="hybridMultilevel"/>
     <w:tmpl w:val="6B24D6BE"/>
@@ -5520,7 +6267,7 @@
       </w:rPr>
     </w:lvl>
   </w:abstractNum>
-  <w:abstractNum w:abstractNumId="17" w15:restartNumberingAfterBreak="0">
+  <w:abstractNum w:abstractNumId="20" w15:restartNumberingAfterBreak="0">
     <w:nsid w:val="516669BC"/>
     <w:multiLevelType w:val="hybridMultilevel"/>
     <w:tmpl w:val="606ECE32"/>
@@ -5633,7 +6380,7 @@
       </w:rPr>
     </w:lvl>
   </w:abstractNum>
-  <w:abstractNum w:abstractNumId="18" w15:restartNumberingAfterBreak="0">
+  <w:abstractNum w:abstractNumId="21" w15:restartNumberingAfterBreak="0">
     <w:nsid w:val="533A2A17"/>
     <w:multiLevelType w:val="hybridMultilevel"/>
     <w:tmpl w:val="E932A4B4"/>
@@ -5746,7 +6493,7 @@
       </w:rPr>
     </w:lvl>
   </w:abstractNum>
-  <w:abstractNum w:abstractNumId="19" w15:restartNumberingAfterBreak="0">
+  <w:abstractNum w:abstractNumId="22" w15:restartNumberingAfterBreak="0">
     <w:nsid w:val="56C46957"/>
     <w:multiLevelType w:val="hybridMultilevel"/>
     <w:tmpl w:val="1D52446E"/>
@@ -5859,7 +6606,7 @@
       </w:rPr>
     </w:lvl>
   </w:abstractNum>
-  <w:abstractNum w:abstractNumId="20" w15:restartNumberingAfterBreak="0">
+  <w:abstractNum w:abstractNumId="23" w15:restartNumberingAfterBreak="0">
     <w:nsid w:val="61374F98"/>
     <w:multiLevelType w:val="hybridMultilevel"/>
     <w:tmpl w:val="6EC269A2"/>
@@ -5972,7 +6719,7 @@
       </w:rPr>
     </w:lvl>
   </w:abstractNum>
-  <w:abstractNum w:abstractNumId="21" w15:restartNumberingAfterBreak="0">
+  <w:abstractNum w:abstractNumId="24" w15:restartNumberingAfterBreak="0">
     <w:nsid w:val="70FC340C"/>
     <w:multiLevelType w:val="hybridMultilevel"/>
     <w:tmpl w:val="D91C80BE"/>
@@ -6058,7 +6805,7 @@
       </w:pPr>
     </w:lvl>
   </w:abstractNum>
-  <w:abstractNum w:abstractNumId="22" w15:restartNumberingAfterBreak="0">
+  <w:abstractNum w:abstractNumId="25" w15:restartNumberingAfterBreak="0">
     <w:nsid w:val="749305D2"/>
     <w:multiLevelType w:val="hybridMultilevel"/>
     <w:tmpl w:val="FAE02A4E"/>
@@ -6171,7 +6918,7 @@
       </w:rPr>
     </w:lvl>
   </w:abstractNum>
-  <w:abstractNum w:abstractNumId="23" w15:restartNumberingAfterBreak="0">
+  <w:abstractNum w:abstractNumId="26" w15:restartNumberingAfterBreak="0">
     <w:nsid w:val="74E66899"/>
     <w:multiLevelType w:val="hybridMultilevel"/>
     <w:tmpl w:val="1EF632D0"/>
@@ -6285,76 +7032,85 @@
     </w:lvl>
   </w:abstractNum>
   <w:num w:numId="1" w16cid:durableId="1540973067">
+    <w:abstractNumId w:val="6"/>
+  </w:num>
+  <w:num w:numId="2" w16cid:durableId="499740590">
+    <w:abstractNumId w:val="11"/>
+  </w:num>
+  <w:num w:numId="3" w16cid:durableId="541132239">
     <w:abstractNumId w:val="4"/>
   </w:num>
-  <w:num w:numId="2" w16cid:durableId="499740590">
-    <w:abstractNumId w:val="9"/>
-  </w:num>
-  <w:num w:numId="3" w16cid:durableId="541132239">
-    <w:abstractNumId w:val="3"/>
-  </w:num>
   <w:num w:numId="4" w16cid:durableId="568883010">
-    <w:abstractNumId w:val="23"/>
+    <w:abstractNumId w:val="26"/>
   </w:num>
   <w:num w:numId="5" w16cid:durableId="845677584">
-    <w:abstractNumId w:val="6"/>
+    <w:abstractNumId w:val="8"/>
   </w:num>
   <w:num w:numId="6" w16cid:durableId="1637027404">
-    <w:abstractNumId w:val="7"/>
+    <w:abstractNumId w:val="9"/>
   </w:num>
   <w:num w:numId="7" w16cid:durableId="1472675406">
     <w:abstractNumId w:val="1"/>
   </w:num>
   <w:num w:numId="8" w16cid:durableId="200286158">
+    <w:abstractNumId w:val="17"/>
+  </w:num>
+  <w:num w:numId="9" w16cid:durableId="1176503610">
+    <w:abstractNumId w:val="15"/>
+  </w:num>
+  <w:num w:numId="10" w16cid:durableId="1796833049">
     <w:abstractNumId w:val="14"/>
   </w:num>
-  <w:num w:numId="9" w16cid:durableId="1176503610">
-    <w:abstractNumId w:val="13"/>
-  </w:num>
-  <w:num w:numId="10" w16cid:durableId="1796833049">
-    <w:abstractNumId w:val="12"/>
-  </w:num>
   <w:num w:numId="11" w16cid:durableId="1996957847">
-    <w:abstractNumId w:val="19"/>
+    <w:abstractNumId w:val="22"/>
   </w:num>
   <w:num w:numId="12" w16cid:durableId="2063482358">
-    <w:abstractNumId w:val="15"/>
+    <w:abstractNumId w:val="18"/>
   </w:num>
   <w:num w:numId="13" w16cid:durableId="1546021224">
     <w:abstractNumId w:val="2"/>
   </w:num>
   <w:num w:numId="14" w16cid:durableId="222566674">
-    <w:abstractNumId w:val="22"/>
+    <w:abstractNumId w:val="25"/>
   </w:num>
   <w:num w:numId="15" w16cid:durableId="1727487960">
-    <w:abstractNumId w:val="8"/>
+    <w:abstractNumId w:val="10"/>
   </w:num>
   <w:num w:numId="16" w16cid:durableId="444738084">
-    <w:abstractNumId w:val="21"/>
+    <w:abstractNumId w:val="24"/>
   </w:num>
   <w:num w:numId="17" w16cid:durableId="1318805403">
     <w:abstractNumId w:val="0"/>
   </w:num>
   <w:num w:numId="18" w16cid:durableId="1115296937">
+    <w:abstractNumId w:val="19"/>
+  </w:num>
+  <w:num w:numId="19" w16cid:durableId="968587252">
+    <w:abstractNumId w:val="7"/>
+  </w:num>
+  <w:num w:numId="20" w16cid:durableId="1912739065">
+    <w:abstractNumId w:val="20"/>
+  </w:num>
+  <w:num w:numId="21" w16cid:durableId="1010789758">
+    <w:abstractNumId w:val="21"/>
+  </w:num>
+  <w:num w:numId="22" w16cid:durableId="129137299">
+    <w:abstractNumId w:val="13"/>
+  </w:num>
+  <w:num w:numId="23" w16cid:durableId="171720229">
+    <w:abstractNumId w:val="23"/>
+  </w:num>
+  <w:num w:numId="24" w16cid:durableId="1035621125">
+    <w:abstractNumId w:val="12"/>
+  </w:num>
+  <w:num w:numId="25" w16cid:durableId="1597206483">
     <w:abstractNumId w:val="16"/>
   </w:num>
-  <w:num w:numId="19" w16cid:durableId="968587252">
+  <w:num w:numId="26" w16cid:durableId="1486238112">
     <w:abstractNumId w:val="5"/>
   </w:num>
-  <w:num w:numId="20" w16cid:durableId="1912739065">
-    <w:abstractNumId w:val="17"/>
-  </w:num>
-  <w:num w:numId="21" w16cid:durableId="1010789758">
-    <w:abstractNumId w:val="18"/>
-  </w:num>
-  <w:num w:numId="22" w16cid:durableId="129137299">
-    <w:abstractNumId w:val="11"/>
-  </w:num>
-  <w:num w:numId="23" w16cid:durableId="171720229">
-    <w:abstractNumId w:val="20"/>
-  </w:num>
-  <w:num w:numId="24" w16cid:durableId="1035621125">
-    <w:abstractNumId w:val="10"/>
+  <w:num w:numId="27" w16cid:durableId="1873151886">
+    <w:abstractNumId w:val="3"/>
   </w:num>
 </w:numbering>
 </file>

</xml_diff>

<commit_message>
feat(financial-math): consolidate multi-chapter formula reference sheet at document end with explicit Where definitions; update rules standard
</commit_message>
<xml_diff>
--- a/Global Financial Management/notes (GFM).docx
+++ b/Global Financial Management/notes (GFM).docx
@@ -871,15 +871,7 @@
         </w:numPr>
       </w:pPr>
       <w:r>
-        <w:t xml:space="preserve">Initiate to cut the </w:t>
-      </w:r>
-      <w:proofErr w:type="spellStart"/>
-      <w:r>
-        <w:t>green house</w:t>
-      </w:r>
-      <w:proofErr w:type="spellEnd"/>
-      <w:r>
-        <w:t xml:space="preserve"> effect </w:t>
+        <w:t xml:space="preserve">Initiate to cut the green house effect </w:t>
       </w:r>
     </w:p>
     <w:p>
@@ -1573,15 +1565,7 @@
         </w:numPr>
       </w:pPr>
       <w:r>
-        <w:t xml:space="preserve">Acquisition or disposal of </w:t>
-      </w:r>
-      <w:proofErr w:type="spellStart"/>
-      <w:r>
-        <w:t>non produced</w:t>
-      </w:r>
-      <w:proofErr w:type="spellEnd"/>
-      <w:r>
-        <w:t xml:space="preserve"> assets </w:t>
+        <w:t xml:space="preserve">Acquisition or disposal of non produced assets </w:t>
       </w:r>
     </w:p>
     <w:p>
@@ -1856,13 +1840,8 @@
         </w:numPr>
       </w:pPr>
       <w:r>
-        <w:t xml:space="preserve">Major functions of </w:t>
-      </w:r>
-      <w:proofErr w:type="spellStart"/>
-      <w:r>
-        <w:t>imf</w:t>
-      </w:r>
-      <w:proofErr w:type="spellEnd"/>
+        <w:t>Major functions of imf</w:t>
+      </w:r>
     </w:p>
     <w:p>
       <w:pPr>
@@ -1872,13 +1851,8 @@
           <w:numId w:val="10"/>
         </w:numPr>
       </w:pPr>
-      <w:proofErr w:type="spellStart"/>
-      <w:r>
-        <w:t>Surveylance</w:t>
-      </w:r>
-      <w:proofErr w:type="spellEnd"/>
-      <w:r>
-        <w:t>, lending, capacity building</w:t>
+      <w:r>
+        <w:t>Surveylance, lending, capacity building</w:t>
       </w:r>
     </w:p>
     <w:p>
@@ -2594,15 +2568,7 @@
         </w:numPr>
       </w:pPr>
       <w:r>
-        <w:t>Support infrastructure development (</w:t>
-      </w:r>
-      <w:proofErr w:type="spellStart"/>
-      <w:r>
-        <w:t>eg.</w:t>
-      </w:r>
-      <w:proofErr w:type="spellEnd"/>
-      <w:r>
-        <w:t xml:space="preserve"> Transport, energy)</w:t>
+        <w:t>Support infrastructure development (eg. Transport, energy)</w:t>
       </w:r>
     </w:p>
     <w:p>
@@ -2769,22 +2735,8 @@
                 <w:lang w:eastAsia="en-IN"/>
                 <w14:ligatures w14:val="none"/>
               </w:rPr>
-              <w:t xml:space="preserve">regional </w:t>
+              <w:t>regional instituition</w:t>
             </w:r>
-            <w:proofErr w:type="spellStart"/>
-            <w:r>
-              <w:rPr>
-                <w:rFonts w:ascii="Calibri" w:eastAsia="Times New Roman" w:hAnsi="Calibri" w:cs="Calibri"/>
-                <w:color w:val="000000"/>
-                <w:kern w:val="0"/>
-                <w:sz w:val="22"/>
-                <w:szCs w:val="22"/>
-                <w:lang w:eastAsia="en-IN"/>
-                <w14:ligatures w14:val="none"/>
-              </w:rPr>
-              <w:t>instituition</w:t>
-            </w:r>
-            <w:proofErr w:type="spellEnd"/>
           </w:p>
         </w:tc>
         <w:tc>
@@ -2806,22 +2758,8 @@
                 <w:lang w:eastAsia="en-IN"/>
                 <w14:ligatures w14:val="none"/>
               </w:rPr>
-              <w:t xml:space="preserve">global </w:t>
+              <w:t>global instituition</w:t>
             </w:r>
-            <w:proofErr w:type="spellStart"/>
-            <w:r>
-              <w:rPr>
-                <w:rFonts w:ascii="Calibri" w:eastAsia="Times New Roman" w:hAnsi="Calibri" w:cs="Calibri"/>
-                <w:color w:val="000000"/>
-                <w:kern w:val="0"/>
-                <w:sz w:val="22"/>
-                <w:szCs w:val="22"/>
-                <w:lang w:eastAsia="en-IN"/>
-                <w14:ligatures w14:val="none"/>
-              </w:rPr>
-              <w:t>instituition</w:t>
-            </w:r>
-            <w:proofErr w:type="spellEnd"/>
           </w:p>
         </w:tc>
       </w:tr>
@@ -2889,33 +2827,7 @@
                 <w:lang w:eastAsia="en-IN"/>
                 <w14:ligatures w14:val="none"/>
               </w:rPr>
-              <w:t xml:space="preserve">support BOP difficulties and macros economic </w:t>
-            </w:r>
-            <w:proofErr w:type="spellStart"/>
-            <w:r>
-              <w:rPr>
-                <w:rFonts w:ascii="Calibri" w:eastAsia="Times New Roman" w:hAnsi="Calibri" w:cs="Calibri"/>
-                <w:color w:val="000000"/>
-                <w:kern w:val="0"/>
-                <w:sz w:val="22"/>
-                <w:szCs w:val="22"/>
-                <w:lang w:eastAsia="en-IN"/>
-                <w14:ligatures w14:val="none"/>
-              </w:rPr>
-              <w:t>stablility</w:t>
-            </w:r>
-            <w:proofErr w:type="spellEnd"/>
-            <w:r>
-              <w:rPr>
-                <w:rFonts w:ascii="Calibri" w:eastAsia="Times New Roman" w:hAnsi="Calibri" w:cs="Calibri"/>
-                <w:color w:val="000000"/>
-                <w:kern w:val="0"/>
-                <w:sz w:val="22"/>
-                <w:szCs w:val="22"/>
-                <w:lang w:eastAsia="en-IN"/>
-                <w14:ligatures w14:val="none"/>
-              </w:rPr>
-              <w:t xml:space="preserve"> </w:t>
+              <w:t xml:space="preserve">support BOP difficulties and macros economic stablility </w:t>
             </w:r>
           </w:p>
         </w:tc>
@@ -3402,15 +3314,7 @@
         </w:numPr>
       </w:pPr>
       <w:r>
-        <w:t xml:space="preserve">tariff and </w:t>
-      </w:r>
-      <w:proofErr w:type="spellStart"/>
-      <w:r>
-        <w:t>non tariff</w:t>
-      </w:r>
-      <w:proofErr w:type="spellEnd"/>
-      <w:r>
-        <w:t xml:space="preserve"> barriers</w:t>
+        <w:t>tariff and non tariff barriers</w:t>
       </w:r>
     </w:p>
     <w:p>
@@ -3484,13 +3388,8 @@
           <w:numId w:val="23"/>
         </w:numPr>
       </w:pPr>
-      <w:proofErr w:type="spellStart"/>
-      <w:r>
-        <w:t>interactual</w:t>
-      </w:r>
-      <w:proofErr w:type="spellEnd"/>
-      <w:r>
-        <w:t xml:space="preserve"> property rights (IPR)</w:t>
+      <w:r>
+        <w:t>interactual property rights (IPR)</w:t>
       </w:r>
     </w:p>
     <w:p>
@@ -3670,15 +3569,7 @@
     </w:p>
     <w:p>
       <w:r>
-        <w:t xml:space="preserve">Foreign exchange market is the market </w:t>
-      </w:r>
-      <w:proofErr w:type="spellStart"/>
-      <w:r>
-        <w:t>market</w:t>
-      </w:r>
-      <w:proofErr w:type="spellEnd"/>
-      <w:r>
-        <w:t xml:space="preserve"> where the currency of one country is exchanged for another country’s currency</w:t>
+        <w:t>Foreign exchange market is the market market where the currency of one country is exchanged for another country’s currency</w:t>
       </w:r>
     </w:p>
     <w:p/>
@@ -3835,15 +3726,7 @@
         <w:ind w:left="360"/>
       </w:pPr>
       <w:r>
-        <w:t xml:space="preserve">1. direct quotation – so many units of foreign currency as equivalent to a fixed number of units of home currency. Eg in </w:t>
-      </w:r>
-      <w:proofErr w:type="spellStart"/>
-      <w:r>
-        <w:t>india</w:t>
-      </w:r>
-      <w:proofErr w:type="spellEnd"/>
-      <w:r>
-        <w:t xml:space="preserve"> 95.88 INR = 1 USD (is a direct quotation for USD in India)</w:t>
+        <w:t>1. direct quotation – so many units of foreign currency as equivalent to a fixed number of units of home currency. Eg in india 95.88 INR = 1 USD (is a direct quotation for USD in India)</w:t>
       </w:r>
       <w:r>
         <w:t xml:space="preserve"> </w:t>
@@ -4024,19 +3907,11 @@
           <w:rFonts w:eastAsiaTheme="minorEastAsia"/>
         </w:rPr>
       </w:pPr>
-      <w:proofErr w:type="spellStart"/>
       <w:r>
         <w:rPr>
           <w:rFonts w:eastAsiaTheme="minorEastAsia"/>
         </w:rPr>
-        <w:t>Eg.</w:t>
-      </w:r>
-      <w:proofErr w:type="spellEnd"/>
-      <w:r>
-        <w:rPr>
-          <w:rFonts w:eastAsiaTheme="minorEastAsia"/>
-        </w:rPr>
-        <w:t xml:space="preserve"> USD for EUR, JPY/CNY </w:t>
+        <w:t xml:space="preserve">Eg. USD for EUR, JPY/CNY </w:t>
       </w:r>
     </w:p>
     <w:p>
@@ -4259,21 +4134,7 @@
         <w:rPr>
           <w:rFonts w:eastAsiaTheme="minorEastAsia"/>
         </w:rPr>
-        <w:t xml:space="preserve">Communications network for international </w:t>
-      </w:r>
-      <w:proofErr w:type="spellStart"/>
-      <w:r>
-        <w:rPr>
-          <w:rFonts w:eastAsiaTheme="minorEastAsia"/>
-        </w:rPr>
-        <w:t>finciacial</w:t>
-      </w:r>
-      <w:proofErr w:type="spellEnd"/>
-      <w:r>
-        <w:rPr>
-          <w:rFonts w:eastAsiaTheme="minorEastAsia"/>
-        </w:rPr>
-        <w:t xml:space="preserve"> market transaction</w:t>
+        <w:t>Communications network for international finciacial market transaction</w:t>
       </w:r>
     </w:p>
     <w:p>
@@ -4322,6 +4183,7 @@
       <w:r>
         <w:rPr>
           <w:rFonts w:eastAsiaTheme="minorEastAsia"/>
+          <w:noProof/>
         </w:rPr>
         <w:lastRenderedPageBreak/>
         <w:drawing>
@@ -4394,21 +4256,7 @@
         <w:rPr>
           <w:rFonts w:eastAsiaTheme="minorEastAsia"/>
         </w:rPr>
-        <w:t xml:space="preserve">In </w:t>
-      </w:r>
-      <w:proofErr w:type="spellStart"/>
-      <w:r>
-        <w:rPr>
-          <w:rFonts w:eastAsiaTheme="minorEastAsia"/>
-        </w:rPr>
-        <w:t>india</w:t>
-      </w:r>
-      <w:proofErr w:type="spellEnd"/>
-      <w:r>
-        <w:rPr>
-          <w:rFonts w:eastAsiaTheme="minorEastAsia"/>
-        </w:rPr>
-        <w:t xml:space="preserve"> regional processing centre is situated in Mumbai</w:t>
+        <w:t>In india regional processing centre is situated in Mumbai</w:t>
       </w:r>
     </w:p>
     <w:p>
@@ -4464,21 +4312,7 @@
         <w:rPr>
           <w:rFonts w:eastAsiaTheme="minorEastAsia"/>
         </w:rPr>
-        <w:t xml:space="preserve">Provide reliable method of sending and </w:t>
-      </w:r>
-      <w:proofErr w:type="spellStart"/>
-      <w:r>
-        <w:rPr>
-          <w:rFonts w:eastAsiaTheme="minorEastAsia"/>
-        </w:rPr>
-        <w:t>receing</w:t>
-      </w:r>
-      <w:proofErr w:type="spellEnd"/>
-      <w:r>
-        <w:rPr>
-          <w:rFonts w:eastAsiaTheme="minorEastAsia"/>
-        </w:rPr>
-        <w:t xml:space="preserve"> messages form of vast number of locations </w:t>
+        <w:t xml:space="preserve">Provide reliable method of sending and receing messages form of vast number of locations </w:t>
       </w:r>
     </w:p>
     <w:p>
@@ -4510,20 +4344,19 @@
           <w:rFonts w:eastAsiaTheme="minorEastAsia"/>
         </w:rPr>
       </w:pPr>
-      <w:proofErr w:type="spellStart"/>
       <w:r>
         <w:rPr>
           <w:rFonts w:eastAsiaTheme="minorEastAsia"/>
         </w:rPr>
-        <w:t>Enalbling</w:t>
-      </w:r>
-      <w:proofErr w:type="spellEnd"/>
-      <w:r>
+        <w:t>Enalbling the counter party to respond immediately</w:t>
+      </w:r>
+    </w:p>
+    <w:p>
+      <w:pPr>
         <w:rPr>
           <w:rFonts w:eastAsiaTheme="minorEastAsia"/>
         </w:rPr>
-        <w:t xml:space="preserve"> the counter party to respond immediately</w:t>
-      </w:r>
+      </w:pPr>
     </w:p>
     <w:p>
       <w:pPr>
@@ -4531,32 +4364,11 @@
           <w:rFonts w:eastAsiaTheme="minorEastAsia"/>
         </w:rPr>
       </w:pPr>
-    </w:p>
-    <w:p>
-      <w:pPr>
+      <w:r>
         <w:rPr>
           <w:rFonts w:eastAsiaTheme="minorEastAsia"/>
         </w:rPr>
-      </w:pPr>
-      <w:r>
-        <w:rPr>
-          <w:rFonts w:eastAsiaTheme="minorEastAsia"/>
-        </w:rPr>
-        <w:t xml:space="preserve">CHIPS – clearing house </w:t>
-      </w:r>
-      <w:proofErr w:type="spellStart"/>
-      <w:r>
-        <w:rPr>
-          <w:rFonts w:eastAsiaTheme="minorEastAsia"/>
-        </w:rPr>
-        <w:t>inter bank</w:t>
-      </w:r>
-      <w:proofErr w:type="spellEnd"/>
-      <w:r>
-        <w:rPr>
-          <w:rFonts w:eastAsiaTheme="minorEastAsia"/>
-        </w:rPr>
-        <w:t xml:space="preserve"> payment system</w:t>
+        <w:t>CHIPS – clearing house inter bank payment system</w:t>
       </w:r>
     </w:p>
     <w:p>
@@ -4575,21 +4387,7 @@
         <w:rPr>
           <w:rFonts w:eastAsiaTheme="minorEastAsia"/>
         </w:rPr>
-        <w:t xml:space="preserve">zero dollar </w:t>
-      </w:r>
-      <w:proofErr w:type="spellStart"/>
-      <w:r>
-        <w:rPr>
-          <w:rFonts w:eastAsiaTheme="minorEastAsia"/>
-        </w:rPr>
-        <w:t>transations</w:t>
-      </w:r>
-      <w:proofErr w:type="spellEnd"/>
-      <w:r>
-        <w:rPr>
-          <w:rFonts w:eastAsiaTheme="minorEastAsia"/>
-        </w:rPr>
-        <w:t xml:space="preserve"> are settled in CHIPS</w:t>
+        <w:t>zero dollar transations are settled in CHIPS</w:t>
       </w:r>
     </w:p>
     <w:p>
@@ -4637,6 +4435,46 @@
           <w:rFonts w:eastAsiaTheme="minorEastAsia"/>
         </w:rPr>
       </w:pPr>
+      <w:r>
+        <w:rPr>
+          <w:rFonts w:eastAsiaTheme="minorEastAsia"/>
+        </w:rPr>
+        <w:drawing>
+          <wp:inline distT="0" distB="0" distL="0" distR="0" wp14:anchorId="52B497C5" wp14:editId="752F505B">
+            <wp:extent cx="4010585" cy="1286054"/>
+            <wp:effectExtent l="0" t="0" r="9525" b="0"/>
+            <wp:docPr id="876312902" name="Picture 1"/>
+            <wp:cNvGraphicFramePr>
+              <a:graphicFrameLocks xmlns:a="http://schemas.openxmlformats.org/drawingml/2006/main" noChangeAspect="1"/>
+            </wp:cNvGraphicFramePr>
+            <a:graphic xmlns:a="http://schemas.openxmlformats.org/drawingml/2006/main">
+              <a:graphicData uri="http://schemas.openxmlformats.org/drawingml/2006/picture">
+                <pic:pic xmlns:pic="http://schemas.openxmlformats.org/drawingml/2006/picture">
+                  <pic:nvPicPr>
+                    <pic:cNvPr id="876312902" name=""/>
+                    <pic:cNvPicPr/>
+                  </pic:nvPicPr>
+                  <pic:blipFill>
+                    <a:blip r:embed="rId21"/>
+                    <a:stretch>
+                      <a:fillRect/>
+                    </a:stretch>
+                  </pic:blipFill>
+                  <pic:spPr>
+                    <a:xfrm>
+                      <a:off x="0" y="0"/>
+                      <a:ext cx="4010585" cy="1286054"/>
+                    </a:xfrm>
+                    <a:prstGeom prst="rect">
+                      <a:avLst/>
+                    </a:prstGeom>
+                  </pic:spPr>
+                </pic:pic>
+              </a:graphicData>
+            </a:graphic>
+          </wp:inline>
+        </w:drawing>
+      </w:r>
     </w:p>
     <w:sectPr>
       <w:pgSz w:w="11906" w:h="16838"/>
@@ -8431,6 +8269,7 @@
   <w:style w:type="character" w:default="1" w:styleId="DefaultParagraphFont">
     <w:name w:val="Default Paragraph Font"/>
     <w:uiPriority w:val="1"/>
+    <w:semiHidden/>
     <w:unhideWhenUsed/>
   </w:style>
   <w:style w:type="table" w:default="1" w:styleId="TableNormal">
@@ -14373,8 +14212,8 @@
       </dsp:nvSpPr>
       <dsp:spPr>
         <a:xfrm>
-          <a:off x="1827212" y="495972"/>
-          <a:ext cx="1199654" cy="208204"/>
+          <a:off x="1827263" y="496059"/>
+          <a:ext cx="1199688" cy="208210"/>
         </a:xfrm>
         <a:custGeom>
           <a:avLst/>
@@ -14388,13 +14227,13 @@
                 <a:pt x="0" y="0"/>
               </a:moveTo>
               <a:lnTo>
-                <a:pt x="0" y="104102"/>
+                <a:pt x="0" y="104105"/>
               </a:lnTo>
               <a:lnTo>
-                <a:pt x="1199654" y="104102"/>
+                <a:pt x="1199688" y="104105"/>
               </a:lnTo>
               <a:lnTo>
-                <a:pt x="1199654" y="208204"/>
+                <a:pt x="1199688" y="208210"/>
               </a:lnTo>
             </a:path>
           </a:pathLst>
@@ -14435,8 +14274,8 @@
       </dsp:nvSpPr>
       <dsp:spPr>
         <a:xfrm>
-          <a:off x="1781492" y="495972"/>
-          <a:ext cx="91440" cy="208204"/>
+          <a:off x="1781543" y="496059"/>
+          <a:ext cx="91440" cy="208210"/>
         </a:xfrm>
         <a:custGeom>
           <a:avLst/>
@@ -14450,7 +14289,7 @@
                 <a:pt x="45720" y="0"/>
               </a:moveTo>
               <a:lnTo>
-                <a:pt x="45720" y="208204"/>
+                <a:pt x="45720" y="208210"/>
               </a:lnTo>
             </a:path>
           </a:pathLst>
@@ -14491,8 +14330,8 @@
       </dsp:nvSpPr>
       <dsp:spPr>
         <a:xfrm>
-          <a:off x="627557" y="495972"/>
-          <a:ext cx="1199654" cy="208204"/>
+          <a:off x="627575" y="496059"/>
+          <a:ext cx="1199688" cy="208210"/>
         </a:xfrm>
         <a:custGeom>
           <a:avLst/>
@@ -14503,16 +14342,16 @@
           <a:pathLst>
             <a:path>
               <a:moveTo>
-                <a:pt x="1199654" y="0"/>
+                <a:pt x="1199688" y="0"/>
               </a:moveTo>
               <a:lnTo>
-                <a:pt x="1199654" y="104102"/>
+                <a:pt x="1199688" y="104105"/>
               </a:lnTo>
               <a:lnTo>
-                <a:pt x="0" y="104102"/>
+                <a:pt x="0" y="104105"/>
               </a:lnTo>
               <a:lnTo>
-                <a:pt x="0" y="208204"/>
+                <a:pt x="0" y="208210"/>
               </a:lnTo>
             </a:path>
           </a:pathLst>
@@ -14553,8 +14392,8 @@
       </dsp:nvSpPr>
       <dsp:spPr>
         <a:xfrm>
-          <a:off x="1331487" y="247"/>
-          <a:ext cx="991450" cy="495725"/>
+          <a:off x="1331524" y="320"/>
+          <a:ext cx="991477" cy="495738"/>
         </a:xfrm>
         <a:prstGeom prst="rect">
           <a:avLst/>
@@ -14621,8 +14460,8 @@
         </a:p>
       </dsp:txBody>
       <dsp:txXfrm>
-        <a:off x="1331487" y="247"/>
-        <a:ext cx="991450" cy="495725"/>
+        <a:off x="1331524" y="320"/>
+        <a:ext cx="991477" cy="495738"/>
       </dsp:txXfrm>
     </dsp:sp>
     <dsp:sp modelId="{A93A665A-F33F-4DB5-94BE-486082FDBC3D}">
@@ -14632,8 +14471,8 @@
       </dsp:nvSpPr>
       <dsp:spPr>
         <a:xfrm>
-          <a:off x="131832" y="704177"/>
-          <a:ext cx="991450" cy="495725"/>
+          <a:off x="131836" y="704269"/>
+          <a:ext cx="991477" cy="495738"/>
         </a:xfrm>
         <a:prstGeom prst="rect">
           <a:avLst/>
@@ -14700,8 +14539,8 @@
         </a:p>
       </dsp:txBody>
       <dsp:txXfrm>
-        <a:off x="131832" y="704177"/>
-        <a:ext cx="991450" cy="495725"/>
+        <a:off x="131836" y="704269"/>
+        <a:ext cx="991477" cy="495738"/>
       </dsp:txXfrm>
     </dsp:sp>
     <dsp:sp modelId="{50CC0BEB-3C0F-4582-A3E0-FA59552C9929}">
@@ -14711,8 +14550,8 @@
       </dsp:nvSpPr>
       <dsp:spPr>
         <a:xfrm>
-          <a:off x="1331487" y="704177"/>
-          <a:ext cx="991450" cy="495725"/>
+          <a:off x="1331524" y="704269"/>
+          <a:ext cx="991477" cy="495738"/>
         </a:xfrm>
         <a:prstGeom prst="rect">
           <a:avLst/>
@@ -14779,8 +14618,8 @@
         </a:p>
       </dsp:txBody>
       <dsp:txXfrm>
-        <a:off x="1331487" y="704177"/>
-        <a:ext cx="991450" cy="495725"/>
+        <a:off x="1331524" y="704269"/>
+        <a:ext cx="991477" cy="495738"/>
       </dsp:txXfrm>
     </dsp:sp>
     <dsp:sp modelId="{9941037D-EBE0-4FF2-9728-5E6C4E54456E}">
@@ -14790,8 +14629,8 @@
       </dsp:nvSpPr>
       <dsp:spPr>
         <a:xfrm>
-          <a:off x="2531142" y="704177"/>
-          <a:ext cx="991450" cy="495725"/>
+          <a:off x="2531212" y="704269"/>
+          <a:ext cx="991477" cy="495738"/>
         </a:xfrm>
         <a:prstGeom prst="rect">
           <a:avLst/>
@@ -14858,8 +14697,8 @@
         </a:p>
       </dsp:txBody>
       <dsp:txXfrm>
-        <a:off x="2531142" y="704177"/>
-        <a:ext cx="991450" cy="495725"/>
+        <a:off x="2531212" y="704269"/>
+        <a:ext cx="991477" cy="495738"/>
       </dsp:txXfrm>
     </dsp:sp>
   </dsp:spTree>

</xml_diff>

<commit_message>
Add GFM Section 1.9, Chapter 2 (Forex Market), Formula Reference Sheet, and Time Series notes (07/09 - 21/09/2026)
</commit_message>
<xml_diff>
--- a/Global Financial Management/notes (GFM).docx
+++ b/Global Financial Management/notes (GFM).docx
@@ -100,7 +100,15 @@
         </w:numPr>
       </w:pPr>
       <w:r>
-        <w:t xml:space="preserve">Guarantee, Risk management products, advisory services for middle income and credit worthy and low income countries </w:t>
+        <w:t xml:space="preserve">Guarantee, Risk management products, advisory services for middle income and credit worthy and </w:t>
+      </w:r>
+      <w:proofErr w:type="gramStart"/>
+      <w:r>
+        <w:t>low income</w:t>
+      </w:r>
+      <w:proofErr w:type="gramEnd"/>
+      <w:r>
+        <w:t xml:space="preserve"> countries </w:t>
       </w:r>
     </w:p>
     <w:p>
@@ -4241,7 +4249,21 @@
         <w:rPr>
           <w:rFonts w:eastAsiaTheme="minorEastAsia"/>
         </w:rPr>
-        <w:t>Registered in brussels, Belgium</w:t>
+        <w:t xml:space="preserve">Registered in </w:t>
+      </w:r>
+      <w:proofErr w:type="gramStart"/>
+      <w:r>
+        <w:rPr>
+          <w:rFonts w:eastAsiaTheme="minorEastAsia"/>
+        </w:rPr>
+        <w:t>brussels</w:t>
+      </w:r>
+      <w:proofErr w:type="gramEnd"/>
+      <w:r>
+        <w:rPr>
+          <w:rFonts w:eastAsiaTheme="minorEastAsia"/>
+        </w:rPr>
+        <w:t>, Belgium</w:t>
       </w:r>
     </w:p>
     <w:p>
@@ -4570,13 +4592,35 @@
         <w:rPr>
           <w:rFonts w:eastAsiaTheme="minorEastAsia"/>
         </w:rPr>
-        <w:t xml:space="preserve">Electronic payment system 12 private commercial banks constituting the new York clearing house association. CHIPS begin operation in 1971. It is the largest payment system in the world. It deals with forex and </w:t>
-      </w:r>
-      <w:r>
-        <w:rPr>
-          <w:rFonts w:eastAsiaTheme="minorEastAsia"/>
-        </w:rPr>
-        <w:t xml:space="preserve">zero dollar </w:t>
+        <w:t xml:space="preserve">Electronic payment system 12 private commercial banks constituting the </w:t>
+      </w:r>
+      <w:proofErr w:type="gramStart"/>
+      <w:r>
+        <w:rPr>
+          <w:rFonts w:eastAsiaTheme="minorEastAsia"/>
+        </w:rPr>
+        <w:t>new York</w:t>
+      </w:r>
+      <w:proofErr w:type="gramEnd"/>
+      <w:r>
+        <w:rPr>
+          <w:rFonts w:eastAsiaTheme="minorEastAsia"/>
+        </w:rPr>
+        <w:t xml:space="preserve"> clearing house association. CHIPS begin operation in 1971. It is the largest payment system in the world. It deals with forex and </w:t>
+      </w:r>
+      <w:proofErr w:type="gramStart"/>
+      <w:r>
+        <w:rPr>
+          <w:rFonts w:eastAsiaTheme="minorEastAsia"/>
+        </w:rPr>
+        <w:t>zero dollar</w:t>
+      </w:r>
+      <w:proofErr w:type="gramEnd"/>
+      <w:r>
+        <w:rPr>
+          <w:rFonts w:eastAsiaTheme="minorEastAsia"/>
+        </w:rPr>
+        <w:t xml:space="preserve"> </w:t>
       </w:r>
       <w:proofErr w:type="spellStart"/>
       <w:r>
@@ -4750,11 +4794,19 @@
           <w:rFonts w:eastAsiaTheme="minorEastAsia"/>
         </w:rPr>
       </w:pPr>
-      <w:r>
-        <w:rPr>
-          <w:rFonts w:eastAsiaTheme="minorEastAsia"/>
-        </w:rPr>
-        <w:t xml:space="preserve">Two way quotation – rate quoted by the market maker indicate two ways </w:t>
+      <w:proofErr w:type="gramStart"/>
+      <w:r>
+        <w:rPr>
+          <w:rFonts w:eastAsiaTheme="minorEastAsia"/>
+        </w:rPr>
+        <w:t>Two way</w:t>
+      </w:r>
+      <w:proofErr w:type="gramEnd"/>
+      <w:r>
+        <w:rPr>
+          <w:rFonts w:eastAsiaTheme="minorEastAsia"/>
+        </w:rPr>
+        <w:t xml:space="preserve"> quotation – rate quoted by the market maker indicate two ways </w:t>
       </w:r>
     </w:p>
     <w:p>
@@ -4866,13 +4918,7 @@
         <w:rPr>
           <w:rFonts w:eastAsiaTheme="minorEastAsia"/>
         </w:rPr>
-        <w:t>SPOT</w:t>
-      </w:r>
-      <w:r>
-        <w:rPr>
-          <w:rFonts w:eastAsiaTheme="minorEastAsia"/>
-        </w:rPr>
-        <w:t xml:space="preserve"> (or) ready (or) cash transaction </w:t>
+        <w:t xml:space="preserve">SPOT (or) ready (or) cash transaction </w:t>
       </w:r>
     </w:p>
     <w:p>
@@ -5001,6 +5047,7 @@
       <w:r>
         <w:rPr>
           <w:rFonts w:eastAsiaTheme="minorEastAsia"/>
+          <w:noProof/>
         </w:rPr>
         <w:drawing>
           <wp:inline distT="0" distB="0" distL="0" distR="0" wp14:anchorId="3ED5A8BA" wp14:editId="5C3C8F6C">
@@ -5057,7 +5104,21 @@
         <w:rPr>
           <w:rFonts w:eastAsiaTheme="minorEastAsia"/>
         </w:rPr>
-        <w:t xml:space="preserve">Two points need be constantly kept in mind while taking of foreign transactions is always talk of from the bankers point of view </w:t>
+        <w:t xml:space="preserve">Two points need be constantly kept in mind while taking of foreign transactions is always talk of from the </w:t>
+      </w:r>
+      <w:proofErr w:type="gramStart"/>
+      <w:r>
+        <w:rPr>
+          <w:rFonts w:eastAsiaTheme="minorEastAsia"/>
+        </w:rPr>
+        <w:t>bankers</w:t>
+      </w:r>
+      <w:proofErr w:type="gramEnd"/>
+      <w:r>
+        <w:rPr>
+          <w:rFonts w:eastAsiaTheme="minorEastAsia"/>
+        </w:rPr>
+        <w:t xml:space="preserve"> point of view </w:t>
       </w:r>
     </w:p>
     <w:p>
@@ -5199,6 +5260,2585 @@
           <w:rFonts w:eastAsiaTheme="minorEastAsia"/>
         </w:rPr>
         <w:t xml:space="preserve">It has sold foreign currency </w:t>
+      </w:r>
+    </w:p>
+    <w:p>
+      <w:pPr>
+        <w:rPr>
+          <w:rFonts w:eastAsiaTheme="minorEastAsia"/>
+        </w:rPr>
+      </w:pPr>
+    </w:p>
+    <w:p>
+      <w:pPr>
+        <w:rPr>
+          <w:rFonts w:eastAsiaTheme="minorEastAsia"/>
+        </w:rPr>
+      </w:pPr>
+    </w:p>
+    <w:p>
+      <w:pPr>
+        <w:rPr>
+          <w:rFonts w:eastAsiaTheme="minorEastAsia"/>
+        </w:rPr>
+      </w:pPr>
+      <w:r>
+        <w:rPr>
+          <w:rFonts w:eastAsiaTheme="minorEastAsia"/>
+        </w:rPr>
+        <w:t>18/09/2026</w:t>
+      </w:r>
+    </w:p>
+    <w:p>
+      <w:pPr>
+        <w:rPr>
+          <w:rFonts w:eastAsiaTheme="minorEastAsia"/>
+        </w:rPr>
+      </w:pPr>
+    </w:p>
+    <w:p>
+      <w:pPr>
+        <w:rPr>
+          <w:rFonts w:eastAsiaTheme="minorEastAsia"/>
+        </w:rPr>
+      </w:pPr>
+      <w:r>
+        <w:rPr>
+          <w:rFonts w:eastAsiaTheme="minorEastAsia"/>
+        </w:rPr>
+        <w:t>Q. Summarize the explanation given, determine the which of the following transactions constitute: 1) purchase, 2) sale of foreign exchange</w:t>
+      </w:r>
+    </w:p>
+    <w:p>
+      <w:pPr>
+        <w:rPr>
+          <w:rFonts w:eastAsiaTheme="minorEastAsia"/>
+        </w:rPr>
+      </w:pPr>
+      <w:r>
+        <w:rPr>
+          <w:rFonts w:eastAsiaTheme="minorEastAsia"/>
+        </w:rPr>
+        <w:t>1. the bank issues a DD on London for 100 EUR</w:t>
+      </w:r>
+    </w:p>
+    <w:p>
+      <w:pPr>
+        <w:rPr>
+          <w:rFonts w:eastAsiaTheme="minorEastAsia"/>
+        </w:rPr>
+      </w:pPr>
+      <w:r>
+        <w:rPr>
+          <w:rFonts w:eastAsiaTheme="minorEastAsia"/>
+        </w:rPr>
+        <w:t xml:space="preserve">2. the customer of the bank purchase a telegraphic transfer on </w:t>
+      </w:r>
+      <w:proofErr w:type="gramStart"/>
+      <w:r>
+        <w:rPr>
+          <w:rFonts w:eastAsiaTheme="minorEastAsia"/>
+        </w:rPr>
+        <w:t>new York</w:t>
+      </w:r>
+      <w:proofErr w:type="gramEnd"/>
+      <w:r>
+        <w:rPr>
+          <w:rFonts w:eastAsiaTheme="minorEastAsia"/>
+        </w:rPr>
+        <w:t xml:space="preserve"> for 500 EUR</w:t>
+      </w:r>
+    </w:p>
+    <w:p>
+      <w:pPr>
+        <w:rPr>
+          <w:rFonts w:eastAsiaTheme="minorEastAsia"/>
+        </w:rPr>
+      </w:pPr>
+      <w:r>
+        <w:rPr>
+          <w:rFonts w:eastAsiaTheme="minorEastAsia"/>
+        </w:rPr>
+        <w:t>3. a traveller encashes at the bank, a traveller cheque for 50 EUR</w:t>
+      </w:r>
+    </w:p>
+    <w:p>
+      <w:pPr>
+        <w:rPr>
+          <w:rFonts w:eastAsiaTheme="minorEastAsia"/>
+        </w:rPr>
+      </w:pPr>
+      <w:r>
+        <w:rPr>
+          <w:rFonts w:eastAsiaTheme="minorEastAsia"/>
+        </w:rPr>
+        <w:t>4. a bank purchases a DD drawn on London for 500 EUR</w:t>
+      </w:r>
+    </w:p>
+    <w:p>
+      <w:pPr>
+        <w:rPr>
+          <w:rFonts w:eastAsiaTheme="minorEastAsia"/>
+        </w:rPr>
+      </w:pPr>
+    </w:p>
+    <w:p>
+      <w:pPr>
+        <w:rPr>
+          <w:rFonts w:eastAsiaTheme="minorEastAsia"/>
+        </w:rPr>
+      </w:pPr>
+      <w:r>
+        <w:rPr>
+          <w:rFonts w:eastAsiaTheme="minorEastAsia"/>
+        </w:rPr>
+        <w:t xml:space="preserve">Sol: </w:t>
+      </w:r>
+    </w:p>
+    <w:p>
+      <w:pPr>
+        <w:pStyle w:val="ListParagraph"/>
+        <w:numPr>
+          <w:ilvl w:val="0"/>
+          <w:numId w:val="36"/>
+        </w:numPr>
+        <w:rPr>
+          <w:rFonts w:eastAsiaTheme="minorEastAsia"/>
+        </w:rPr>
+      </w:pPr>
+      <w:r>
+        <w:rPr>
+          <w:rFonts w:eastAsiaTheme="minorEastAsia"/>
+        </w:rPr>
+        <w:t>Sale of FX</w:t>
+      </w:r>
+    </w:p>
+    <w:p>
+      <w:pPr>
+        <w:pStyle w:val="ListParagraph"/>
+        <w:numPr>
+          <w:ilvl w:val="0"/>
+          <w:numId w:val="36"/>
+        </w:numPr>
+        <w:rPr>
+          <w:rFonts w:eastAsiaTheme="minorEastAsia"/>
+        </w:rPr>
+      </w:pPr>
+      <w:r>
+        <w:rPr>
+          <w:rFonts w:eastAsiaTheme="minorEastAsia"/>
+        </w:rPr>
+        <w:t>Sale of FX</w:t>
+      </w:r>
+    </w:p>
+    <w:p>
+      <w:pPr>
+        <w:pStyle w:val="ListParagraph"/>
+        <w:numPr>
+          <w:ilvl w:val="0"/>
+          <w:numId w:val="36"/>
+        </w:numPr>
+        <w:rPr>
+          <w:rFonts w:eastAsiaTheme="minorEastAsia"/>
+        </w:rPr>
+      </w:pPr>
+      <w:r>
+        <w:rPr>
+          <w:rFonts w:eastAsiaTheme="minorEastAsia"/>
+        </w:rPr>
+        <w:t>Purchase of FX</w:t>
+      </w:r>
+    </w:p>
+    <w:p>
+      <w:pPr>
+        <w:pStyle w:val="ListParagraph"/>
+        <w:numPr>
+          <w:ilvl w:val="0"/>
+          <w:numId w:val="36"/>
+        </w:numPr>
+        <w:rPr>
+          <w:rFonts w:eastAsiaTheme="minorEastAsia"/>
+        </w:rPr>
+      </w:pPr>
+      <w:r>
+        <w:rPr>
+          <w:rFonts w:eastAsiaTheme="minorEastAsia"/>
+        </w:rPr>
+        <w:t xml:space="preserve">Purchase of FX </w:t>
+      </w:r>
+    </w:p>
+    <w:p>
+      <w:pPr>
+        <w:rPr>
+          <w:rFonts w:eastAsiaTheme="minorEastAsia"/>
+        </w:rPr>
+      </w:pPr>
+    </w:p>
+    <w:p>
+      <w:pPr>
+        <w:rPr>
+          <w:rFonts w:eastAsiaTheme="minorEastAsia"/>
+        </w:rPr>
+      </w:pPr>
+      <w:r>
+        <w:rPr>
+          <w:rFonts w:eastAsiaTheme="minorEastAsia"/>
+        </w:rPr>
+        <w:t>USD is quoted as under: interbank market on 25</w:t>
+      </w:r>
+      <w:r>
+        <w:rPr>
+          <w:rFonts w:eastAsiaTheme="minorEastAsia"/>
+          <w:vertAlign w:val="superscript"/>
+        </w:rPr>
+        <w:t>th</w:t>
+      </w:r>
+      <w:r>
+        <w:rPr>
+          <w:rFonts w:eastAsiaTheme="minorEastAsia"/>
+        </w:rPr>
+        <w:t xml:space="preserve"> January </w:t>
+      </w:r>
+    </w:p>
+    <w:p>
+      <w:pPr>
+        <w:rPr>
+          <w:rFonts w:eastAsiaTheme="minorEastAsia"/>
+        </w:rPr>
+      </w:pPr>
+      <w:r>
+        <w:rPr>
+          <w:rFonts w:eastAsiaTheme="minorEastAsia"/>
+        </w:rPr>
+        <w:lastRenderedPageBreak/>
+        <w:t xml:space="preserve">Market quotation for a currency </w:t>
+      </w:r>
+      <w:proofErr w:type="gramStart"/>
+      <w:r>
+        <w:rPr>
+          <w:rFonts w:eastAsiaTheme="minorEastAsia"/>
+        </w:rPr>
+        <w:t>consist</w:t>
+      </w:r>
+      <w:proofErr w:type="gramEnd"/>
+      <w:r>
+        <w:rPr>
+          <w:rFonts w:eastAsiaTheme="minorEastAsia"/>
+        </w:rPr>
+        <w:t xml:space="preserve"> of SWOT rate and forward margin </w:t>
+      </w:r>
+    </w:p>
+    <w:p>
+      <w:pPr>
+        <w:rPr>
+          <w:rFonts w:eastAsiaTheme="minorEastAsia"/>
+        </w:rPr>
+      </w:pPr>
+    </w:p>
+    <w:p>
+      <w:pPr>
+        <w:rPr>
+          <w:rFonts w:eastAsiaTheme="minorEastAsia"/>
+        </w:rPr>
+      </w:pPr>
+      <w:r>
+        <w:rPr>
+          <w:rFonts w:eastAsiaTheme="minorEastAsia"/>
+        </w:rPr>
+        <w:t>Calculation of forward rates under direct quotation</w:t>
+      </w:r>
+    </w:p>
+    <w:p>
+      <w:pPr>
+        <w:rPr>
+          <w:rFonts w:eastAsiaTheme="minorEastAsia"/>
+        </w:rPr>
+      </w:pPr>
+      <w:r>
+        <w:rPr>
+          <w:rFonts w:eastAsiaTheme="minorEastAsia"/>
+        </w:rPr>
+        <w:t>SPOT</w:t>
+      </w:r>
+      <w:r>
+        <w:rPr>
+          <w:rFonts w:eastAsiaTheme="minorEastAsia"/>
+        </w:rPr>
+        <w:tab/>
+      </w:r>
+      <w:r>
+        <w:rPr>
+          <w:rFonts w:eastAsiaTheme="minorEastAsia"/>
+        </w:rPr>
+        <w:tab/>
+      </w:r>
+      <w:r>
+        <w:rPr>
+          <w:rFonts w:eastAsiaTheme="minorEastAsia"/>
+        </w:rPr>
+        <w:tab/>
+        <w:t>1 USD = Rs. 95.4000 / 4200</w:t>
+      </w:r>
+    </w:p>
+    <w:p>
+      <w:pPr>
+        <w:rPr>
+          <w:rFonts w:eastAsiaTheme="minorEastAsia"/>
+        </w:rPr>
+      </w:pPr>
+      <w:r>
+        <w:rPr>
+          <w:rFonts w:eastAsiaTheme="minorEastAsia"/>
+        </w:rPr>
+        <w:t>SPOT / February</w:t>
+      </w:r>
+      <w:r>
+        <w:rPr>
+          <w:rFonts w:eastAsiaTheme="minorEastAsia"/>
+        </w:rPr>
+        <w:tab/>
+      </w:r>
+      <w:r>
+        <w:rPr>
+          <w:rFonts w:eastAsiaTheme="minorEastAsia"/>
+        </w:rPr>
+        <w:tab/>
+        <w:t xml:space="preserve">= </w:t>
+      </w:r>
+      <w:r>
+        <w:rPr>
+          <w:rFonts w:eastAsiaTheme="minorEastAsia"/>
+        </w:rPr>
+        <w:tab/>
+        <w:t>.2000 / 2100</w:t>
+      </w:r>
+    </w:p>
+    <w:p>
+      <w:pPr>
+        <w:rPr>
+          <w:rFonts w:eastAsiaTheme="minorEastAsia"/>
+        </w:rPr>
+      </w:pPr>
+      <w:r>
+        <w:rPr>
+          <w:rFonts w:eastAsiaTheme="minorEastAsia"/>
+        </w:rPr>
+        <w:t xml:space="preserve">SPOT /March </w:t>
+      </w:r>
+      <w:r>
+        <w:rPr>
+          <w:rFonts w:eastAsiaTheme="minorEastAsia"/>
+        </w:rPr>
+        <w:tab/>
+      </w:r>
+      <w:r>
+        <w:rPr>
+          <w:rFonts w:eastAsiaTheme="minorEastAsia"/>
+        </w:rPr>
+        <w:tab/>
+      </w:r>
+      <w:r>
+        <w:rPr>
+          <w:rFonts w:eastAsiaTheme="minorEastAsia"/>
+        </w:rPr>
+        <w:tab/>
+        <w:t xml:space="preserve">= </w:t>
+      </w:r>
+      <w:r>
+        <w:rPr>
+          <w:rFonts w:eastAsiaTheme="minorEastAsia"/>
+        </w:rPr>
+        <w:tab/>
+        <w:t>.3500 / 3600</w:t>
+      </w:r>
+    </w:p>
+    <w:p>
+      <w:pPr>
+        <w:rPr>
+          <w:rFonts w:eastAsiaTheme="minorEastAsia"/>
+        </w:rPr>
+      </w:pPr>
+    </w:p>
+    <w:p>
+      <w:pPr>
+        <w:rPr>
+          <w:rFonts w:eastAsiaTheme="minorEastAsia"/>
+        </w:rPr>
+      </w:pPr>
+      <w:r>
+        <w:rPr>
+          <w:rFonts w:eastAsiaTheme="minorEastAsia"/>
+        </w:rPr>
+        <w:t>Determining the forward margin:</w:t>
+      </w:r>
+    </w:p>
+    <w:p>
+      <w:pPr>
+        <w:rPr>
+          <w:rFonts w:eastAsiaTheme="minorEastAsia"/>
+        </w:rPr>
+      </w:pPr>
+      <w:r>
+        <w:rPr>
+          <w:rFonts w:eastAsiaTheme="minorEastAsia"/>
+        </w:rPr>
+        <w:t xml:space="preserve">The SPOT rate for USD is 95 </w:t>
+      </w:r>
+      <w:proofErr w:type="gramStart"/>
+      <w:r>
+        <w:rPr>
+          <w:rFonts w:eastAsiaTheme="minorEastAsia"/>
+        </w:rPr>
+        <w:t>INR,</w:t>
+      </w:r>
+      <w:proofErr w:type="gramEnd"/>
+      <w:r>
+        <w:rPr>
+          <w:rFonts w:eastAsiaTheme="minorEastAsia"/>
+        </w:rPr>
+        <w:t xml:space="preserve"> the rate of interest is 8% per annum at </w:t>
+      </w:r>
+      <w:proofErr w:type="gramStart"/>
+      <w:r>
+        <w:rPr>
+          <w:rFonts w:eastAsiaTheme="minorEastAsia"/>
+        </w:rPr>
+        <w:t>new York</w:t>
+      </w:r>
+      <w:proofErr w:type="gramEnd"/>
+      <w:r>
+        <w:rPr>
+          <w:rFonts w:eastAsiaTheme="minorEastAsia"/>
+        </w:rPr>
+        <w:t xml:space="preserve"> it is 5% per annum </w:t>
+      </w:r>
+    </w:p>
+    <w:p>
+      <w:pPr>
+        <w:rPr>
+          <w:rFonts w:eastAsiaTheme="minorEastAsia"/>
+        </w:rPr>
+      </w:pPr>
+      <w:r>
+        <w:rPr>
+          <w:rFonts w:eastAsiaTheme="minorEastAsia"/>
+        </w:rPr>
+        <w:t xml:space="preserve">The bank has a quote three months selling rate to a customer. Assuming that the operation is for 10,000 USD and the entire interest loss or gain is passed on to customer. (1 USD = 95 INR). Calculate the forward rate. </w:t>
+      </w:r>
+    </w:p>
+    <w:p>
+      <w:pPr>
+        <w:rPr>
+          <w:rFonts w:eastAsiaTheme="minorEastAsia"/>
+        </w:rPr>
+      </w:pPr>
+    </w:p>
+    <w:p>
+      <w:pPr>
+        <w:rPr>
+          <w:rFonts w:eastAsiaTheme="minorEastAsia"/>
+        </w:rPr>
+      </w:pPr>
+      <w:r>
+        <w:rPr>
+          <w:rFonts w:eastAsiaTheme="minorEastAsia"/>
+        </w:rPr>
+        <w:t xml:space="preserve">SOL: </w:t>
+      </w:r>
+    </w:p>
+    <w:p>
+      <w:pPr>
+        <w:rPr>
+          <w:rFonts w:eastAsiaTheme="minorEastAsia"/>
+        </w:rPr>
+      </w:pPr>
+      <w:r>
+        <w:rPr>
+          <w:rFonts w:eastAsiaTheme="minorEastAsia"/>
+          <w:noProof/>
+        </w:rPr>
+        <w:drawing>
+          <wp:inline distT="0" distB="0" distL="0" distR="0" wp14:anchorId="71F3869C" wp14:editId="2EB15D6C">
+            <wp:extent cx="5306695" cy="1733550"/>
+            <wp:effectExtent l="0" t="0" r="8255" b="0"/>
+            <wp:docPr id="1452083551" name="Picture 2"/>
+            <wp:cNvGraphicFramePr>
+              <a:graphicFrameLocks xmlns:a="http://schemas.openxmlformats.org/drawingml/2006/main" noChangeAspect="1"/>
+            </wp:cNvGraphicFramePr>
+            <a:graphic xmlns:a="http://schemas.openxmlformats.org/drawingml/2006/main">
+              <a:graphicData uri="http://schemas.openxmlformats.org/drawingml/2006/picture">
+                <pic:pic xmlns:pic="http://schemas.openxmlformats.org/drawingml/2006/picture">
+                  <pic:nvPicPr>
+                    <pic:cNvPr id="0" name="Picture 2"/>
+                    <pic:cNvPicPr>
+                      <a:picLocks noChangeAspect="1" noChangeArrowheads="1"/>
+                    </pic:cNvPicPr>
+                  </pic:nvPicPr>
+                  <pic:blipFill>
+                    <a:blip r:embed="rId27">
+                      <a:extLst>
+                        <a:ext uri="{28A0092B-C50C-407E-A947-70E740481C1C}">
+                          <a14:useLocalDpi xmlns:a14="http://schemas.microsoft.com/office/drawing/2010/main" val="0"/>
+                        </a:ext>
+                      </a:extLst>
+                    </a:blip>
+                    <a:srcRect/>
+                    <a:stretch>
+                      <a:fillRect/>
+                    </a:stretch>
+                  </pic:blipFill>
+                  <pic:spPr bwMode="auto">
+                    <a:xfrm>
+                      <a:off x="0" y="0"/>
+                      <a:ext cx="5306695" cy="1733550"/>
+                    </a:xfrm>
+                    <a:prstGeom prst="rect">
+                      <a:avLst/>
+                    </a:prstGeom>
+                    <a:noFill/>
+                    <a:ln>
+                      <a:noFill/>
+                    </a:ln>
+                  </pic:spPr>
+                </pic:pic>
+              </a:graphicData>
+            </a:graphic>
+          </wp:inline>
+        </w:drawing>
+      </w:r>
+    </w:p>
+    <w:p>
+      <w:pPr>
+        <w:rPr>
+          <w:rFonts w:eastAsiaTheme="minorEastAsia"/>
+        </w:rPr>
+      </w:pPr>
+    </w:p>
+    <w:p>
+      <w:pPr>
+        <w:rPr>
+          <w:rFonts w:eastAsiaTheme="minorEastAsia"/>
+        </w:rPr>
+      </w:pPr>
+      <m:oMathPara>
+        <m:oMath>
+          <m:f>
+            <m:fPr>
+              <m:ctrlPr>
+                <w:rPr>
+                  <w:rFonts w:ascii="Cambria Math" w:eastAsiaTheme="minorEastAsia" w:hAnsi="Cambria Math"/>
+                  <w:i/>
+                </w:rPr>
+              </m:ctrlPr>
+            </m:fPr>
+            <m:num>
+              <m:r>
+                <w:rPr>
+                  <w:rFonts w:ascii="Cambria Math" w:eastAsiaTheme="minorEastAsia" w:hAnsi="Cambria Math"/>
+                </w:rPr>
+                <m:t>969000</m:t>
+              </m:r>
+            </m:num>
+            <m:den>
+              <m:r>
+                <w:rPr>
+                  <w:rFonts w:ascii="Cambria Math" w:eastAsiaTheme="minorEastAsia" w:hAnsi="Cambria Math"/>
+                </w:rPr>
+                <m:t>10125</m:t>
+              </m:r>
+            </m:den>
+          </m:f>
+          <m:r>
+            <w:rPr>
+              <w:rFonts w:ascii="Cambria Math" w:eastAsiaTheme="minorEastAsia" w:hAnsi="Cambria Math"/>
+            </w:rPr>
+            <m:t>=95.7037</m:t>
+          </m:r>
+        </m:oMath>
+      </m:oMathPara>
+    </w:p>
+    <w:p>
+      <w:pPr>
+        <w:rPr>
+          <w:rFonts w:eastAsiaTheme="minorEastAsia"/>
+        </w:rPr>
+      </w:pPr>
+      <w:r>
+        <w:rPr>
+          <w:rFonts w:eastAsiaTheme="minorEastAsia"/>
+        </w:rPr>
+        <w:t>Difference between 95.7037 and 95.7125 is 0.0088 which is called forward premium</w:t>
+      </w:r>
+    </w:p>
+    <w:p>
+      <w:pPr>
+        <w:rPr>
+          <w:rFonts w:eastAsiaTheme="minorEastAsia"/>
+        </w:rPr>
+      </w:pPr>
+      <w:r>
+        <w:rPr>
+          <w:rFonts w:eastAsiaTheme="minorEastAsia"/>
+        </w:rPr>
+        <w:t>The bank should get Rs. 969,000 against USD</w:t>
+      </w:r>
+    </w:p>
+    <w:p>
+      <w:pPr>
+        <w:rPr>
+          <w:rFonts w:eastAsiaTheme="minorEastAsia"/>
+          <w:iCs/>
+        </w:rPr>
+      </w:pPr>
+      <m:oMathPara>
+        <m:oMath>
+          <m:r>
+            <m:rPr>
+              <m:sty m:val="p"/>
+            </m:rPr>
+            <w:rPr>
+              <w:rFonts w:ascii="Cambria Math" w:eastAsiaTheme="minorEastAsia" w:hAnsi="Cambria Math"/>
+            </w:rPr>
+            <m:t xml:space="preserve">forward margin = </m:t>
+          </m:r>
+          <m:f>
+            <m:fPr>
+              <m:ctrlPr>
+                <w:rPr>
+                  <w:rFonts w:ascii="Cambria Math" w:eastAsiaTheme="minorEastAsia" w:hAnsi="Cambria Math"/>
+                  <w:iCs/>
+                </w:rPr>
+              </m:ctrlPr>
+            </m:fPr>
+            <m:num>
+              <m:r>
+                <w:rPr>
+                  <w:rFonts w:ascii="Cambria Math" w:eastAsiaTheme="minorEastAsia" w:hAnsi="Cambria Math"/>
+                </w:rPr>
+                <m:t>SPOT rate x forward period x Interest differntiation</m:t>
+              </m:r>
+            </m:num>
+            <m:den>
+              <m:r>
+                <w:rPr>
+                  <w:rFonts w:ascii="Cambria Math" w:eastAsiaTheme="minorEastAsia" w:hAnsi="Cambria Math"/>
+                </w:rPr>
+                <m:t>100xtime</m:t>
+              </m:r>
+            </m:den>
+          </m:f>
+        </m:oMath>
+      </m:oMathPara>
+    </w:p>
+    <w:p>
+      <w:pPr>
+        <w:rPr>
+          <w:rFonts w:eastAsiaTheme="minorEastAsia"/>
+          <w:iCs/>
+        </w:rPr>
+      </w:pPr>
+      <m:oMathPara>
+        <m:oMath>
+          <m:r>
+            <w:rPr>
+              <w:rFonts w:ascii="Cambria Math" w:eastAsiaTheme="minorEastAsia" w:hAnsi="Cambria Math"/>
+            </w:rPr>
+            <m:t xml:space="preserve">= </m:t>
+          </m:r>
+          <m:f>
+            <m:fPr>
+              <m:ctrlPr>
+                <w:rPr>
+                  <w:rFonts w:ascii="Cambria Math" w:eastAsiaTheme="minorEastAsia" w:hAnsi="Cambria Math"/>
+                  <w:i/>
+                  <w:iCs/>
+                </w:rPr>
+              </m:ctrlPr>
+            </m:fPr>
+            <m:num>
+              <m:r>
+                <w:rPr>
+                  <w:rFonts w:ascii="Cambria Math" w:eastAsiaTheme="minorEastAsia" w:hAnsi="Cambria Math"/>
+                </w:rPr>
+                <m:t>95×3</m:t>
+              </m:r>
+              <m:r>
+                <w:rPr>
+                  <w:rFonts w:ascii="Cambria Math" w:eastAsiaTheme="minorEastAsia" w:hAnsi="Cambria Math"/>
+                </w:rPr>
+                <m:t>×</m:t>
+              </m:r>
+              <m:r>
+                <w:rPr>
+                  <w:rFonts w:ascii="Cambria Math" w:eastAsiaTheme="minorEastAsia" w:hAnsi="Cambria Math"/>
+                </w:rPr>
+                <m:t>3</m:t>
+              </m:r>
+            </m:num>
+            <m:den>
+              <m:r>
+                <w:rPr>
+                  <w:rFonts w:ascii="Cambria Math" w:eastAsiaTheme="minorEastAsia" w:hAnsi="Cambria Math"/>
+                </w:rPr>
+                <m:t>100</m:t>
+              </m:r>
+              <m:r>
+                <w:rPr>
+                  <w:rFonts w:ascii="Cambria Math" w:eastAsiaTheme="minorEastAsia" w:hAnsi="Cambria Math"/>
+                </w:rPr>
+                <m:t>×</m:t>
+              </m:r>
+              <m:r>
+                <w:rPr>
+                  <w:rFonts w:ascii="Cambria Math" w:eastAsiaTheme="minorEastAsia" w:hAnsi="Cambria Math"/>
+                </w:rPr>
+                <m:t>12</m:t>
+              </m:r>
+            </m:den>
+          </m:f>
+          <m:r>
+            <w:rPr>
+              <w:rFonts w:ascii="Cambria Math" w:eastAsiaTheme="minorEastAsia" w:hAnsi="Cambria Math"/>
+            </w:rPr>
+            <m:t>=0.7125</m:t>
+          </m:r>
+        </m:oMath>
+      </m:oMathPara>
+    </w:p>
+    <w:p>
+      <w:pPr>
+        <w:rPr>
+          <w:rFonts w:eastAsiaTheme="minorEastAsia"/>
+        </w:rPr>
+      </w:pPr>
+    </w:p>
+    <w:p>
+      <w:pPr>
+        <w:rPr>
+          <w:rFonts w:eastAsiaTheme="minorEastAsia"/>
+        </w:rPr>
+      </w:pPr>
+      <w:r>
+        <w:rPr>
+          <w:rFonts w:eastAsiaTheme="minorEastAsia"/>
+        </w:rPr>
+        <w:t xml:space="preserve">Two types of buying rates in </w:t>
+      </w:r>
+      <w:proofErr w:type="spellStart"/>
+      <w:r>
+        <w:rPr>
+          <w:rFonts w:eastAsiaTheme="minorEastAsia"/>
+        </w:rPr>
+        <w:t>india</w:t>
+      </w:r>
+      <w:proofErr w:type="spellEnd"/>
+      <w:r>
+        <w:rPr>
+          <w:rFonts w:eastAsiaTheme="minorEastAsia"/>
+        </w:rPr>
+        <w:t xml:space="preserve">, namely: </w:t>
+      </w:r>
+    </w:p>
+    <w:p>
+      <w:pPr>
+        <w:pStyle w:val="ListParagraph"/>
+        <w:numPr>
+          <w:ilvl w:val="0"/>
+          <w:numId w:val="37"/>
+        </w:numPr>
+        <w:rPr>
+          <w:rFonts w:eastAsiaTheme="minorEastAsia"/>
+        </w:rPr>
+      </w:pPr>
+      <w:r>
+        <w:rPr>
+          <w:rFonts w:eastAsiaTheme="minorEastAsia"/>
+        </w:rPr>
+        <w:t>TT buying rate (Telegraphic transfer)</w:t>
+      </w:r>
+    </w:p>
+    <w:p>
+      <w:pPr>
+        <w:pStyle w:val="ListParagraph"/>
+        <w:numPr>
+          <w:ilvl w:val="0"/>
+          <w:numId w:val="37"/>
+        </w:numPr>
+        <w:rPr>
+          <w:rFonts w:eastAsiaTheme="minorEastAsia"/>
+        </w:rPr>
+      </w:pPr>
+      <w:r>
+        <w:rPr>
+          <w:rFonts w:eastAsiaTheme="minorEastAsia"/>
+        </w:rPr>
+        <w:t xml:space="preserve">Bill buying rate </w:t>
+      </w:r>
+    </w:p>
+    <w:p>
+      <w:pPr>
+        <w:rPr>
+          <w:rFonts w:eastAsiaTheme="minorEastAsia"/>
+        </w:rPr>
+      </w:pPr>
+    </w:p>
+    <w:p>
+      <w:pPr>
+        <w:rPr>
+          <w:rFonts w:eastAsiaTheme="minorEastAsia"/>
+        </w:rPr>
+      </w:pPr>
+      <w:r>
+        <w:rPr>
+          <w:rFonts w:eastAsiaTheme="minorEastAsia"/>
+        </w:rPr>
+        <w:t>TT rate is applied for three situations:</w:t>
+      </w:r>
+    </w:p>
+    <w:p>
+      <w:pPr>
+        <w:pStyle w:val="ListParagraph"/>
+        <w:numPr>
+          <w:ilvl w:val="0"/>
+          <w:numId w:val="38"/>
+        </w:numPr>
+        <w:rPr>
+          <w:rFonts w:eastAsiaTheme="minorEastAsia"/>
+        </w:rPr>
+      </w:pPr>
+      <w:r>
+        <w:rPr>
+          <w:rFonts w:eastAsiaTheme="minorEastAsia"/>
+        </w:rPr>
+        <w:t>Payment of DD, mail transfer, telegraphic transfer</w:t>
+      </w:r>
+    </w:p>
+    <w:p>
+      <w:pPr>
+        <w:pStyle w:val="ListParagraph"/>
+        <w:numPr>
+          <w:ilvl w:val="0"/>
+          <w:numId w:val="38"/>
+        </w:numPr>
+        <w:rPr>
+          <w:rFonts w:eastAsiaTheme="minorEastAsia"/>
+        </w:rPr>
+      </w:pPr>
+      <w:r>
+        <w:rPr>
+          <w:rFonts w:eastAsiaTheme="minorEastAsia"/>
+        </w:rPr>
+        <w:t xml:space="preserve">Foreign bills collected, the banker pays the exporter </w:t>
+      </w:r>
+    </w:p>
+    <w:p>
+      <w:pPr>
+        <w:pStyle w:val="ListParagraph"/>
+        <w:numPr>
+          <w:ilvl w:val="0"/>
+          <w:numId w:val="38"/>
+        </w:numPr>
+        <w:rPr>
+          <w:rFonts w:eastAsiaTheme="minorEastAsia"/>
+        </w:rPr>
+      </w:pPr>
+      <w:r>
+        <w:rPr>
+          <w:rFonts w:eastAsiaTheme="minorEastAsia"/>
+        </w:rPr>
+        <w:t xml:space="preserve">Cancelation of foreign exchange (sold earlier) </w:t>
+      </w:r>
+    </w:p>
+    <w:p>
+      <w:pPr>
+        <w:rPr>
+          <w:rFonts w:eastAsiaTheme="minorEastAsia"/>
+        </w:rPr>
+      </w:pPr>
+      <w:r>
+        <w:rPr>
+          <w:rFonts w:eastAsiaTheme="minorEastAsia"/>
+        </w:rPr>
+        <w:t xml:space="preserve">TT buying rate format: </w:t>
+      </w:r>
+    </w:p>
+    <w:p>
+      <w:pPr>
+        <w:rPr>
+          <w:rFonts w:eastAsiaTheme="minorEastAsia"/>
+        </w:rPr>
+      </w:pPr>
+    </w:p>
+    <w:p>
+      <w:pPr>
+        <w:rPr>
+          <w:rFonts w:eastAsiaTheme="minorEastAsia"/>
+        </w:rPr>
+      </w:pPr>
+      <w:r>
+        <w:rPr>
+          <w:rFonts w:eastAsiaTheme="minorEastAsia"/>
+          <w:noProof/>
+        </w:rPr>
+        <w:drawing>
+          <wp:inline distT="0" distB="0" distL="0" distR="0" wp14:anchorId="7787224C" wp14:editId="01B49253">
+            <wp:extent cx="3212465" cy="1151890"/>
+            <wp:effectExtent l="0" t="0" r="6985" b="0"/>
+            <wp:docPr id="524152240" name="Picture 1"/>
+            <wp:cNvGraphicFramePr>
+              <a:graphicFrameLocks xmlns:a="http://schemas.openxmlformats.org/drawingml/2006/main" noChangeAspect="1"/>
+            </wp:cNvGraphicFramePr>
+            <a:graphic xmlns:a="http://schemas.openxmlformats.org/drawingml/2006/main">
+              <a:graphicData uri="http://schemas.openxmlformats.org/drawingml/2006/picture">
+                <pic:pic xmlns:pic="http://schemas.openxmlformats.org/drawingml/2006/picture">
+                  <pic:nvPicPr>
+                    <pic:cNvPr id="0" name="Picture 1"/>
+                    <pic:cNvPicPr>
+                      <a:picLocks noChangeAspect="1" noChangeArrowheads="1"/>
+                    </pic:cNvPicPr>
+                  </pic:nvPicPr>
+                  <pic:blipFill>
+                    <a:blip r:embed="rId28">
+                      <a:extLst>
+                        <a:ext uri="{28A0092B-C50C-407E-A947-70E740481C1C}">
+                          <a14:useLocalDpi xmlns:a14="http://schemas.microsoft.com/office/drawing/2010/main" val="0"/>
+                        </a:ext>
+                      </a:extLst>
+                    </a:blip>
+                    <a:srcRect/>
+                    <a:stretch>
+                      <a:fillRect/>
+                    </a:stretch>
+                  </pic:blipFill>
+                  <pic:spPr bwMode="auto">
+                    <a:xfrm>
+                      <a:off x="0" y="0"/>
+                      <a:ext cx="3212465" cy="1151890"/>
+                    </a:xfrm>
+                    <a:prstGeom prst="rect">
+                      <a:avLst/>
+                    </a:prstGeom>
+                    <a:noFill/>
+                    <a:ln>
+                      <a:noFill/>
+                    </a:ln>
+                  </pic:spPr>
+                </pic:pic>
+              </a:graphicData>
+            </a:graphic>
+          </wp:inline>
+        </w:drawing>
+      </w:r>
+    </w:p>
+    <w:p>
+      <w:pPr>
+        <w:pStyle w:val="ListParagraph"/>
+        <w:numPr>
+          <w:ilvl w:val="0"/>
+          <w:numId w:val="29"/>
+        </w:numPr>
+        <w:rPr>
+          <w:rFonts w:eastAsiaTheme="minorEastAsia"/>
+        </w:rPr>
+      </w:pPr>
+      <w:r>
+        <w:rPr>
+          <w:rFonts w:eastAsiaTheme="minorEastAsia"/>
+        </w:rPr>
+        <w:t>Round off to nearest multiple of 0.0025</w:t>
+      </w:r>
+    </w:p>
+    <w:p>
+      <w:pPr>
+        <w:rPr>
+          <w:rFonts w:eastAsiaTheme="minorEastAsia"/>
+        </w:rPr>
+      </w:pPr>
+    </w:p>
+    <w:p>
+      <w:pPr>
+        <w:rPr>
+          <w:rFonts w:eastAsiaTheme="minorEastAsia"/>
+        </w:rPr>
+      </w:pPr>
+    </w:p>
+    <w:p>
+      <w:pPr>
+        <w:rPr>
+          <w:rFonts w:eastAsiaTheme="minorEastAsia"/>
+        </w:rPr>
+      </w:pPr>
+      <w:r>
+        <w:rPr>
+          <w:rFonts w:eastAsiaTheme="minorEastAsia"/>
+        </w:rPr>
+        <w:t xml:space="preserve">Q. </w:t>
+      </w:r>
+      <w:r>
+        <w:rPr>
+          <w:rFonts w:eastAsiaTheme="minorEastAsia"/>
+        </w:rPr>
+        <w:t>On 15</w:t>
+      </w:r>
+      <w:r>
+        <w:rPr>
+          <w:rFonts w:eastAsiaTheme="minorEastAsia"/>
+          <w:vertAlign w:val="superscript"/>
+        </w:rPr>
+        <w:t>th</w:t>
+      </w:r>
+      <w:r>
+        <w:rPr>
+          <w:rFonts w:eastAsiaTheme="minorEastAsia"/>
+        </w:rPr>
+        <w:t xml:space="preserve"> September you will receive a mail transfer </w:t>
+      </w:r>
+      <w:proofErr w:type="spellStart"/>
+      <w:r>
+        <w:rPr>
+          <w:rFonts w:eastAsiaTheme="minorEastAsia"/>
+        </w:rPr>
+        <w:t>form</w:t>
+      </w:r>
+      <w:proofErr w:type="spellEnd"/>
+      <w:r>
+        <w:rPr>
+          <w:rFonts w:eastAsiaTheme="minorEastAsia"/>
+        </w:rPr>
+        <w:t xml:space="preserve"> </w:t>
+      </w:r>
+      <w:proofErr w:type="gramStart"/>
+      <w:r>
+        <w:rPr>
+          <w:rFonts w:eastAsiaTheme="minorEastAsia"/>
+        </w:rPr>
+        <w:t>new York</w:t>
+      </w:r>
+      <w:proofErr w:type="gramEnd"/>
+      <w:r>
+        <w:rPr>
+          <w:rFonts w:eastAsiaTheme="minorEastAsia"/>
+        </w:rPr>
+        <w:t xml:space="preserve"> correspondent for 5000 USD payable to your customer. You’re account to the correspondent bank has been credited with the amount of the mail transfer in re-investment. Assuming rupee/dollar are quoted in the local interbank market as under </w:t>
+      </w:r>
+    </w:p>
+    <w:p>
+      <w:pPr>
+        <w:rPr>
+          <w:rFonts w:eastAsiaTheme="minorEastAsia"/>
+        </w:rPr>
+      </w:pPr>
+      <w:r>
+        <w:rPr>
+          <w:rFonts w:eastAsiaTheme="minorEastAsia"/>
+        </w:rPr>
+        <w:t xml:space="preserve">SPOT </w:t>
+      </w:r>
+      <w:r>
+        <w:rPr>
+          <w:rFonts w:eastAsiaTheme="minorEastAsia"/>
+        </w:rPr>
+        <w:tab/>
+      </w:r>
+      <w:r>
+        <w:rPr>
+          <w:rFonts w:eastAsiaTheme="minorEastAsia"/>
+        </w:rPr>
+        <w:tab/>
+      </w:r>
+      <w:r>
+        <w:rPr>
+          <w:rFonts w:eastAsiaTheme="minorEastAsia"/>
+        </w:rPr>
+        <w:tab/>
+        <w:t xml:space="preserve">1 USD = </w:t>
+      </w:r>
+      <w:r>
+        <w:rPr>
+          <w:rFonts w:eastAsiaTheme="minorEastAsia"/>
+        </w:rPr>
+        <w:tab/>
+        <w:t>95.</w:t>
+      </w:r>
+      <w:r>
+        <w:rPr>
+          <w:rFonts w:eastAsiaTheme="minorEastAsia"/>
+        </w:rPr>
+        <w:tab/>
+        <w:t>7600 / 7900</w:t>
+      </w:r>
+    </w:p>
+    <w:p>
+      <w:pPr>
+        <w:rPr>
+          <w:rFonts w:eastAsiaTheme="minorEastAsia"/>
+        </w:rPr>
+      </w:pPr>
+      <w:r>
+        <w:rPr>
+          <w:rFonts w:eastAsiaTheme="minorEastAsia"/>
+        </w:rPr>
+        <w:t>SPOT / October</w:t>
+      </w:r>
+      <w:r>
+        <w:rPr>
+          <w:rFonts w:eastAsiaTheme="minorEastAsia"/>
+        </w:rPr>
+        <w:tab/>
+      </w:r>
+      <w:r>
+        <w:rPr>
+          <w:rFonts w:eastAsiaTheme="minorEastAsia"/>
+        </w:rPr>
+        <w:tab/>
+      </w:r>
+      <w:r>
+        <w:rPr>
+          <w:rFonts w:eastAsiaTheme="minorEastAsia"/>
+        </w:rPr>
+        <w:tab/>
+      </w:r>
+      <w:r>
+        <w:rPr>
+          <w:rFonts w:eastAsiaTheme="minorEastAsia"/>
+        </w:rPr>
+        <w:tab/>
+        <w:t>5600 / 5700</w:t>
+      </w:r>
+      <w:r>
+        <w:rPr>
+          <w:rFonts w:eastAsiaTheme="minorEastAsia"/>
+        </w:rPr>
+        <w:tab/>
+      </w:r>
+    </w:p>
+    <w:p>
+      <w:pPr>
+        <w:rPr>
+          <w:rFonts w:eastAsiaTheme="minorEastAsia"/>
+        </w:rPr>
+      </w:pPr>
+      <w:r>
+        <w:rPr>
+          <w:rFonts w:eastAsiaTheme="minorEastAsia"/>
+        </w:rPr>
+        <w:t xml:space="preserve">Calculate the exchange rate and the rupee amount payable to the customer, 1) you require an exchange margin of 0.080 to be loaded in the rate, 2) rupee equivalent to be nearest to the old rupee </w:t>
+      </w:r>
+    </w:p>
+    <w:p>
+      <w:pPr>
+        <w:rPr>
+          <w:rFonts w:eastAsiaTheme="minorEastAsia"/>
+        </w:rPr>
+      </w:pPr>
+    </w:p>
+    <w:p>
+      <w:pPr>
+        <w:rPr>
+          <w:rFonts w:eastAsiaTheme="minorEastAsia"/>
+        </w:rPr>
+      </w:pPr>
+    </w:p>
+    <w:p>
+      <w:pPr>
+        <w:rPr>
+          <w:rFonts w:eastAsiaTheme="minorEastAsia"/>
+        </w:rPr>
+      </w:pPr>
+      <w:r>
+        <w:rPr>
+          <w:rFonts w:eastAsiaTheme="minorEastAsia"/>
+        </w:rPr>
+        <w:t>21/09/2026</w:t>
+      </w:r>
+    </w:p>
+    <w:p>
+      <w:pPr>
+        <w:rPr>
+          <w:rFonts w:eastAsiaTheme="minorEastAsia"/>
+        </w:rPr>
+      </w:pPr>
+      <w:r>
+        <w:rPr>
+          <w:rFonts w:eastAsiaTheme="minorEastAsia"/>
+        </w:rPr>
+        <w:lastRenderedPageBreak/>
+        <w:t>SOL:</w:t>
+      </w:r>
+    </w:p>
+    <w:p>
+      <w:pPr>
+        <w:pStyle w:val="ListParagraph"/>
+        <w:numPr>
+          <w:ilvl w:val="0"/>
+          <w:numId w:val="29"/>
+        </w:numPr>
+        <w:rPr>
+          <w:rFonts w:eastAsiaTheme="minorEastAsia"/>
+        </w:rPr>
+      </w:pPr>
+      <w:r>
+        <w:rPr>
+          <w:rFonts w:eastAsiaTheme="minorEastAsia"/>
+        </w:rPr>
+        <w:t>The rate applicable is the TT buying rate</w:t>
+      </w:r>
+    </w:p>
+    <w:p>
+      <w:pPr>
+        <w:pStyle w:val="ListParagraph"/>
+        <w:numPr>
+          <w:ilvl w:val="0"/>
+          <w:numId w:val="29"/>
+        </w:numPr>
+        <w:rPr>
+          <w:rFonts w:eastAsiaTheme="minorEastAsia"/>
+        </w:rPr>
+      </w:pPr>
+      <w:r>
+        <w:rPr>
+          <w:rFonts w:eastAsiaTheme="minorEastAsia"/>
+        </w:rPr>
+        <w:t>Quoted to customer will be based on the market buying rate of 95.00</w:t>
+      </w:r>
+    </w:p>
+    <w:p>
+      <w:pPr>
+        <w:pStyle w:val="ListParagraph"/>
+        <w:rPr>
+          <w:rFonts w:eastAsiaTheme="minorEastAsia"/>
+        </w:rPr>
+      </w:pPr>
+      <w:r>
+        <w:rPr>
+          <w:rFonts w:eastAsiaTheme="minorEastAsia"/>
+        </w:rPr>
+        <w:t>Dollar / Rupee market SPOT buying rate</w:t>
+      </w:r>
+    </w:p>
+    <w:p>
+      <w:pPr>
+        <w:pStyle w:val="ListParagraph"/>
+        <w:rPr>
+          <w:rFonts w:eastAsiaTheme="minorEastAsia"/>
+        </w:rPr>
+      </w:pPr>
+      <w:r>
+        <w:rPr>
+          <w:rFonts w:eastAsiaTheme="minorEastAsia"/>
+          <w:noProof/>
+        </w:rPr>
+        <w:drawing>
+          <wp:inline distT="0" distB="0" distL="0" distR="0" wp14:anchorId="750C2C42" wp14:editId="17C191CE">
+            <wp:extent cx="3124835" cy="580390"/>
+            <wp:effectExtent l="0" t="0" r="0" b="0"/>
+            <wp:docPr id="1252738877" name="Picture 1"/>
+            <wp:cNvGraphicFramePr>
+              <a:graphicFrameLocks xmlns:a="http://schemas.openxmlformats.org/drawingml/2006/main" noChangeAspect="1"/>
+            </wp:cNvGraphicFramePr>
+            <a:graphic xmlns:a="http://schemas.openxmlformats.org/drawingml/2006/main">
+              <a:graphicData uri="http://schemas.openxmlformats.org/drawingml/2006/picture">
+                <pic:pic xmlns:pic="http://schemas.openxmlformats.org/drawingml/2006/picture">
+                  <pic:nvPicPr>
+                    <pic:cNvPr id="0" name="Picture 1"/>
+                    <pic:cNvPicPr>
+                      <a:picLocks noChangeAspect="1" noChangeArrowheads="1"/>
+                    </pic:cNvPicPr>
+                  </pic:nvPicPr>
+                  <pic:blipFill>
+                    <a:blip r:embed="rId29">
+                      <a:extLst>
+                        <a:ext uri="{28A0092B-C50C-407E-A947-70E740481C1C}">
+                          <a14:useLocalDpi xmlns:a14="http://schemas.microsoft.com/office/drawing/2010/main" val="0"/>
+                        </a:ext>
+                      </a:extLst>
+                    </a:blip>
+                    <a:srcRect/>
+                    <a:stretch>
+                      <a:fillRect/>
+                    </a:stretch>
+                  </pic:blipFill>
+                  <pic:spPr bwMode="auto">
+                    <a:xfrm>
+                      <a:off x="0" y="0"/>
+                      <a:ext cx="3124835" cy="580390"/>
+                    </a:xfrm>
+                    <a:prstGeom prst="rect">
+                      <a:avLst/>
+                    </a:prstGeom>
+                    <a:noFill/>
+                    <a:ln>
+                      <a:noFill/>
+                    </a:ln>
+                  </pic:spPr>
+                </pic:pic>
+              </a:graphicData>
+            </a:graphic>
+          </wp:inline>
+        </w:drawing>
+      </w:r>
+    </w:p>
+    <w:p>
+      <w:pPr>
+        <w:pStyle w:val="ListParagraph"/>
+        <w:rPr>
+          <w:rFonts w:eastAsiaTheme="minorEastAsia"/>
+        </w:rPr>
+      </w:pPr>
+    </w:p>
+    <w:p>
+      <w:pPr>
+        <w:pStyle w:val="ListParagraph"/>
+        <w:rPr>
+          <w:rFonts w:eastAsiaTheme="minorEastAsia"/>
+        </w:rPr>
+      </w:pPr>
+      <w:r>
+        <w:rPr>
+          <w:rFonts w:eastAsiaTheme="minorEastAsia"/>
+        </w:rPr>
+        <w:t>Rounded off = 95.6800</w:t>
+      </w:r>
+    </w:p>
+    <w:p>
+      <w:pPr>
+        <w:pStyle w:val="ListParagraph"/>
+        <w:rPr>
+          <w:rFonts w:eastAsiaTheme="minorEastAsia"/>
+        </w:rPr>
+      </w:pPr>
+    </w:p>
+    <w:p>
+      <w:pPr>
+        <w:pStyle w:val="ListParagraph"/>
+        <w:rPr>
+          <w:rFonts w:eastAsiaTheme="minorEastAsia"/>
+        </w:rPr>
+      </w:pPr>
+      <w:r>
+        <w:rPr>
+          <w:rFonts w:eastAsiaTheme="minorEastAsia"/>
+        </w:rPr>
+        <w:t>5000 USD to INR:</w:t>
+      </w:r>
+    </w:p>
+    <w:p>
+      <w:pPr>
+        <w:pStyle w:val="ListParagraph"/>
+        <w:rPr>
+          <w:rFonts w:eastAsiaTheme="minorEastAsia"/>
+        </w:rPr>
+      </w:pPr>
+      <w:r>
+        <w:rPr>
+          <w:rFonts w:eastAsiaTheme="minorEastAsia"/>
+        </w:rPr>
+        <w:t>5000 X 95.6800 = 4,78,400</w:t>
+      </w:r>
+    </w:p>
+    <w:p>
+      <w:pPr>
+        <w:rPr>
+          <w:rFonts w:eastAsiaTheme="minorEastAsia"/>
+        </w:rPr>
+      </w:pPr>
+    </w:p>
+    <w:p>
+      <w:pPr>
+        <w:rPr>
+          <w:rFonts w:eastAsiaTheme="minorEastAsia"/>
+        </w:rPr>
+      </w:pPr>
+    </w:p>
+    <w:p>
+      <w:pPr>
+        <w:rPr>
+          <w:rFonts w:eastAsiaTheme="minorEastAsia"/>
+        </w:rPr>
+      </w:pPr>
+      <w:r>
+        <w:rPr>
+          <w:rFonts w:eastAsiaTheme="minorEastAsia"/>
+        </w:rPr>
+        <w:t xml:space="preserve">Bill Buying Rate: </w:t>
+      </w:r>
+    </w:p>
+    <w:p>
+      <w:pPr>
+        <w:rPr>
+          <w:rFonts w:eastAsiaTheme="minorEastAsia"/>
+        </w:rPr>
+      </w:pPr>
+      <w:r>
+        <w:rPr>
+          <w:rFonts w:eastAsiaTheme="minorEastAsia"/>
+        </w:rPr>
+        <w:t>The rate to be applied when a foreign bill is purchased.</w:t>
+      </w:r>
+    </w:p>
+    <w:p>
+      <w:pPr>
+        <w:rPr>
+          <w:rFonts w:eastAsiaTheme="minorEastAsia"/>
+        </w:rPr>
+      </w:pPr>
+      <w:r>
+        <w:rPr>
+          <w:rFonts w:eastAsiaTheme="minorEastAsia"/>
+          <w:noProof/>
+        </w:rPr>
+        <w:drawing>
+          <wp:inline distT="0" distB="0" distL="0" distR="0" wp14:anchorId="48B72B81" wp14:editId="6F88B702">
+            <wp:extent cx="5731510" cy="2097405"/>
+            <wp:effectExtent l="0" t="0" r="2540" b="0"/>
+            <wp:docPr id="1776798250" name="Picture 3"/>
+            <wp:cNvGraphicFramePr>
+              <a:graphicFrameLocks xmlns:a="http://schemas.openxmlformats.org/drawingml/2006/main" noChangeAspect="1"/>
+            </wp:cNvGraphicFramePr>
+            <a:graphic xmlns:a="http://schemas.openxmlformats.org/drawingml/2006/main">
+              <a:graphicData uri="http://schemas.openxmlformats.org/drawingml/2006/picture">
+                <pic:pic xmlns:pic="http://schemas.openxmlformats.org/drawingml/2006/picture">
+                  <pic:nvPicPr>
+                    <pic:cNvPr id="0" name="Picture 3"/>
+                    <pic:cNvPicPr>
+                      <a:picLocks noChangeAspect="1" noChangeArrowheads="1"/>
+                    </pic:cNvPicPr>
+                  </pic:nvPicPr>
+                  <pic:blipFill>
+                    <a:blip r:embed="rId30">
+                      <a:extLst>
+                        <a:ext uri="{28A0092B-C50C-407E-A947-70E740481C1C}">
+                          <a14:useLocalDpi xmlns:a14="http://schemas.microsoft.com/office/drawing/2010/main" val="0"/>
+                        </a:ext>
+                      </a:extLst>
+                    </a:blip>
+                    <a:srcRect/>
+                    <a:stretch>
+                      <a:fillRect/>
+                    </a:stretch>
+                  </pic:blipFill>
+                  <pic:spPr bwMode="auto">
+                    <a:xfrm>
+                      <a:off x="0" y="0"/>
+                      <a:ext cx="5731510" cy="2097405"/>
+                    </a:xfrm>
+                    <a:prstGeom prst="rect">
+                      <a:avLst/>
+                    </a:prstGeom>
+                    <a:noFill/>
+                    <a:ln>
+                      <a:noFill/>
+                    </a:ln>
+                  </pic:spPr>
+                </pic:pic>
+              </a:graphicData>
+            </a:graphic>
+          </wp:inline>
+        </w:drawing>
+      </w:r>
+    </w:p>
+    <w:p>
+      <w:pPr>
+        <w:rPr>
+          <w:rFonts w:eastAsiaTheme="minorEastAsia"/>
+        </w:rPr>
+      </w:pPr>
+      <w:r>
+        <w:rPr>
+          <w:rFonts w:eastAsiaTheme="minorEastAsia"/>
+        </w:rPr>
+        <w:t>Calculation of Bill Buying rate:</w:t>
+      </w:r>
+    </w:p>
+    <w:p>
+      <w:pPr>
+        <w:rPr>
+          <w:rFonts w:eastAsiaTheme="minorEastAsia"/>
+        </w:rPr>
+      </w:pPr>
+      <w:r>
+        <w:rPr>
+          <w:rFonts w:eastAsiaTheme="minorEastAsia"/>
+        </w:rPr>
+        <w:t>Q. on 25</w:t>
+      </w:r>
+      <w:r>
+        <w:rPr>
+          <w:rFonts w:eastAsiaTheme="minorEastAsia"/>
+          <w:vertAlign w:val="superscript"/>
+        </w:rPr>
+        <w:t>th</w:t>
+      </w:r>
+      <w:r>
+        <w:rPr>
+          <w:rFonts w:eastAsiaTheme="minorEastAsia"/>
+        </w:rPr>
+        <w:t xml:space="preserve"> July your customer has presented to you at sight documents for 100,000 USD under an irrevocable letter of credit. A letter of credit provides for reimbursement by the negotiating banks own DD on the opening bank at NYC. Assuming Rupee / USD are quoted in the local interbank market as under: </w:t>
+      </w:r>
+    </w:p>
+    <w:p>
+      <w:pPr>
+        <w:rPr>
+          <w:rFonts w:eastAsiaTheme="minorEastAsia"/>
+        </w:rPr>
+      </w:pPr>
+      <w:r>
+        <w:rPr>
+          <w:rFonts w:eastAsiaTheme="minorEastAsia"/>
+        </w:rPr>
+        <w:t>SPOT</w:t>
+      </w:r>
+      <w:r>
+        <w:rPr>
+          <w:rFonts w:eastAsiaTheme="minorEastAsia"/>
+        </w:rPr>
+        <w:tab/>
+      </w:r>
+      <w:r>
+        <w:rPr>
+          <w:rFonts w:eastAsiaTheme="minorEastAsia"/>
+        </w:rPr>
+        <w:tab/>
+      </w:r>
+      <w:r>
+        <w:rPr>
+          <w:rFonts w:eastAsiaTheme="minorEastAsia"/>
+        </w:rPr>
+        <w:tab/>
+      </w:r>
+      <w:r>
+        <w:rPr>
+          <w:rFonts w:eastAsiaTheme="minorEastAsia"/>
+        </w:rPr>
+        <w:t>1 USD</w:t>
+      </w:r>
+      <w:r>
+        <w:rPr>
+          <w:rFonts w:eastAsiaTheme="minorEastAsia"/>
+        </w:rPr>
+        <w:t xml:space="preserve"> = Rs</w:t>
+      </w:r>
+      <w:r>
+        <w:rPr>
+          <w:rFonts w:eastAsiaTheme="minorEastAsia"/>
+        </w:rPr>
+        <w:tab/>
+        <w:t>95.</w:t>
+      </w:r>
+      <w:r>
+        <w:rPr>
+          <w:rFonts w:eastAsiaTheme="minorEastAsia"/>
+        </w:rPr>
+        <w:tab/>
+        <w:t xml:space="preserve"> 6525/6675</w:t>
+      </w:r>
+    </w:p>
+    <w:p>
+      <w:pPr>
+        <w:rPr>
+          <w:rFonts w:eastAsiaTheme="minorEastAsia"/>
+        </w:rPr>
+      </w:pPr>
+      <w:r>
+        <w:rPr>
+          <w:rFonts w:eastAsiaTheme="minorEastAsia"/>
+        </w:rPr>
+        <w:t>SPOT / August</w:t>
+      </w:r>
+      <w:r>
+        <w:rPr>
+          <w:rFonts w:eastAsiaTheme="minorEastAsia"/>
+        </w:rPr>
+        <w:tab/>
+      </w:r>
+      <w:r>
+        <w:rPr>
+          <w:rFonts w:eastAsiaTheme="minorEastAsia"/>
+        </w:rPr>
+        <w:tab/>
+      </w:r>
+      <w:r>
+        <w:rPr>
+          <w:rFonts w:eastAsiaTheme="minorEastAsia"/>
+        </w:rPr>
+        <w:tab/>
+      </w:r>
+      <w:r>
+        <w:rPr>
+          <w:rFonts w:eastAsiaTheme="minorEastAsia"/>
+        </w:rPr>
+        <w:tab/>
+        <w:t xml:space="preserve"> 6000/5700</w:t>
+      </w:r>
+    </w:p>
+    <w:p>
+      <w:pPr>
+        <w:rPr>
+          <w:rFonts w:eastAsiaTheme="minorEastAsia"/>
+        </w:rPr>
+      </w:pPr>
+      <w:r>
+        <w:rPr>
+          <w:rFonts w:eastAsiaTheme="minorEastAsia"/>
+        </w:rPr>
+        <w:t>SPOT / September</w:t>
+      </w:r>
+      <w:r>
+        <w:rPr>
+          <w:rFonts w:eastAsiaTheme="minorEastAsia"/>
+        </w:rPr>
+        <w:tab/>
+      </w:r>
+      <w:r>
+        <w:rPr>
+          <w:rFonts w:eastAsiaTheme="minorEastAsia"/>
+        </w:rPr>
+        <w:tab/>
+      </w:r>
+      <w:r>
+        <w:rPr>
+          <w:rFonts w:eastAsiaTheme="minorEastAsia"/>
+        </w:rPr>
+        <w:tab/>
+        <w:t xml:space="preserve">   1.</w:t>
+      </w:r>
+      <w:r>
+        <w:rPr>
+          <w:rFonts w:eastAsiaTheme="minorEastAsia"/>
+        </w:rPr>
+        <w:tab/>
+        <w:t xml:space="preserve"> 0000/0.9700</w:t>
+      </w:r>
+    </w:p>
+    <w:p>
+      <w:pPr>
+        <w:rPr>
+          <w:rFonts w:eastAsiaTheme="minorEastAsia"/>
+        </w:rPr>
+      </w:pPr>
+      <w:r>
+        <w:rPr>
+          <w:rFonts w:eastAsiaTheme="minorEastAsia"/>
+        </w:rPr>
+        <w:t>SPOT / October</w:t>
+      </w:r>
+      <w:r>
+        <w:rPr>
+          <w:rFonts w:eastAsiaTheme="minorEastAsia"/>
+        </w:rPr>
+        <w:tab/>
+      </w:r>
+      <w:r>
+        <w:rPr>
+          <w:rFonts w:eastAsiaTheme="minorEastAsia"/>
+        </w:rPr>
+        <w:tab/>
+      </w:r>
+      <w:r>
+        <w:rPr>
+          <w:rFonts w:eastAsiaTheme="minorEastAsia"/>
+        </w:rPr>
+        <w:tab/>
+        <w:t xml:space="preserve">   1.</w:t>
+      </w:r>
+      <w:r>
+        <w:rPr>
+          <w:rFonts w:eastAsiaTheme="minorEastAsia"/>
+        </w:rPr>
+        <w:tab/>
+        <w:t>1.4000/3900</w:t>
+      </w:r>
+      <w:r>
+        <w:rPr>
+          <w:rFonts w:eastAsiaTheme="minorEastAsia"/>
+        </w:rPr>
+        <w:tab/>
+        <w:t xml:space="preserve"> </w:t>
+      </w:r>
+      <w:r>
+        <w:rPr>
+          <w:rFonts w:eastAsiaTheme="minorEastAsia"/>
+        </w:rPr>
+        <w:tab/>
+        <w:t xml:space="preserve"> </w:t>
+      </w:r>
+    </w:p>
+    <w:p>
+      <w:pPr>
+        <w:rPr>
+          <w:rFonts w:eastAsiaTheme="minorEastAsia"/>
+        </w:rPr>
+      </w:pPr>
+      <w:r>
+        <w:rPr>
+          <w:rFonts w:eastAsiaTheme="minorEastAsia"/>
+        </w:rPr>
+        <w:lastRenderedPageBreak/>
+        <w:t xml:space="preserve">Transit period for bill is 25 days at what rate will you quote to your customer provided you require </w:t>
+      </w:r>
+      <w:proofErr w:type="gramStart"/>
+      <w:r>
+        <w:rPr>
+          <w:rFonts w:eastAsiaTheme="minorEastAsia"/>
+        </w:rPr>
+        <w:t>a</w:t>
+      </w:r>
+      <w:proofErr w:type="gramEnd"/>
+      <w:r>
+        <w:rPr>
+          <w:rFonts w:eastAsiaTheme="minorEastAsia"/>
+        </w:rPr>
+        <w:t xml:space="preserve"> exchange margin of 0.15</w:t>
+      </w:r>
+      <w:r>
+        <w:rPr>
+          <w:rFonts w:eastAsiaTheme="minorEastAsia"/>
+        </w:rPr>
+        <w:t xml:space="preserve">? also calculate and show the amount in INR payable to the customer. </w:t>
+      </w:r>
+    </w:p>
+    <w:p>
+      <w:pPr>
+        <w:rPr>
+          <w:rFonts w:eastAsiaTheme="minorEastAsia"/>
+        </w:rPr>
+      </w:pPr>
+    </w:p>
+    <w:p>
+      <w:pPr>
+        <w:rPr>
+          <w:rFonts w:eastAsiaTheme="minorEastAsia"/>
+        </w:rPr>
+      </w:pPr>
+      <w:r>
+        <w:rPr>
+          <w:rFonts w:eastAsiaTheme="minorEastAsia"/>
+        </w:rPr>
+        <w:t>SOL:</w:t>
+      </w:r>
+    </w:p>
+    <w:p>
+      <w:pPr>
+        <w:rPr>
+          <w:rFonts w:eastAsiaTheme="minorEastAsia"/>
+        </w:rPr>
+      </w:pPr>
+    </w:p>
+    <w:p>
+      <w:pPr>
+        <w:pStyle w:val="ListParagraph"/>
+        <w:numPr>
+          <w:ilvl w:val="0"/>
+          <w:numId w:val="40"/>
+        </w:numPr>
+        <w:rPr>
+          <w:rFonts w:eastAsiaTheme="minorEastAsia"/>
+        </w:rPr>
+      </w:pPr>
+      <w:r>
+        <w:rPr>
+          <w:rFonts w:eastAsiaTheme="minorEastAsia"/>
+        </w:rPr>
+        <w:t>The rate applicable is the bill buying rate</w:t>
+      </w:r>
+    </w:p>
+    <w:p>
+      <w:pPr>
+        <w:pStyle w:val="ListParagraph"/>
+        <w:numPr>
+          <w:ilvl w:val="0"/>
+          <w:numId w:val="40"/>
+        </w:numPr>
+        <w:rPr>
+          <w:rFonts w:eastAsiaTheme="minorEastAsia"/>
+        </w:rPr>
+      </w:pPr>
+      <w:r>
+        <w:rPr>
+          <w:rFonts w:eastAsiaTheme="minorEastAsia"/>
+        </w:rPr>
+        <w:t>Quoted to customer will be based on the market buying rate of 95.6525</w:t>
+      </w:r>
+    </w:p>
+    <w:p>
+      <w:pPr>
+        <w:pStyle w:val="ListParagraph"/>
+        <w:rPr>
+          <w:rFonts w:eastAsiaTheme="minorEastAsia"/>
+        </w:rPr>
+      </w:pPr>
+    </w:p>
+    <w:p>
+      <w:pPr>
+        <w:pStyle w:val="ListParagraph"/>
+        <w:rPr>
+          <w:rFonts w:eastAsiaTheme="minorEastAsia"/>
+        </w:rPr>
+      </w:pPr>
+      <w:r>
+        <w:rPr>
+          <w:rFonts w:eastAsiaTheme="minorEastAsia"/>
+          <w:noProof/>
+        </w:rPr>
+        <w:drawing>
+          <wp:inline distT="0" distB="0" distL="0" distR="0" wp14:anchorId="6B7A9E6E" wp14:editId="5FD9ABCF">
+            <wp:extent cx="5731510" cy="1340485"/>
+            <wp:effectExtent l="0" t="0" r="2540" b="0"/>
+            <wp:docPr id="1739756108" name="Picture 5"/>
+            <wp:cNvGraphicFramePr>
+              <a:graphicFrameLocks xmlns:a="http://schemas.openxmlformats.org/drawingml/2006/main" noChangeAspect="1"/>
+            </wp:cNvGraphicFramePr>
+            <a:graphic xmlns:a="http://schemas.openxmlformats.org/drawingml/2006/main">
+              <a:graphicData uri="http://schemas.openxmlformats.org/drawingml/2006/picture">
+                <pic:pic xmlns:pic="http://schemas.openxmlformats.org/drawingml/2006/picture">
+                  <pic:nvPicPr>
+                    <pic:cNvPr id="0" name="Picture 5"/>
+                    <pic:cNvPicPr>
+                      <a:picLocks noChangeAspect="1" noChangeArrowheads="1"/>
+                    </pic:cNvPicPr>
+                  </pic:nvPicPr>
+                  <pic:blipFill>
+                    <a:blip r:embed="rId31">
+                      <a:extLst>
+                        <a:ext uri="{28A0092B-C50C-407E-A947-70E740481C1C}">
+                          <a14:useLocalDpi xmlns:a14="http://schemas.microsoft.com/office/drawing/2010/main" val="0"/>
+                        </a:ext>
+                      </a:extLst>
+                    </a:blip>
+                    <a:srcRect/>
+                    <a:stretch>
+                      <a:fillRect/>
+                    </a:stretch>
+                  </pic:blipFill>
+                  <pic:spPr bwMode="auto">
+                    <a:xfrm>
+                      <a:off x="0" y="0"/>
+                      <a:ext cx="5731510" cy="1340485"/>
+                    </a:xfrm>
+                    <a:prstGeom prst="rect">
+                      <a:avLst/>
+                    </a:prstGeom>
+                    <a:noFill/>
+                    <a:ln>
+                      <a:noFill/>
+                    </a:ln>
+                  </pic:spPr>
+                </pic:pic>
+              </a:graphicData>
+            </a:graphic>
+          </wp:inline>
+        </w:drawing>
+      </w:r>
+      <w:r>
+        <w:rPr>
+          <w:rFonts w:eastAsiaTheme="minorEastAsia"/>
+        </w:rPr>
+        <w:t xml:space="preserve"> </w:t>
+      </w:r>
+    </w:p>
+    <w:p>
+      <w:pPr>
+        <w:pStyle w:val="ListParagraph"/>
+        <w:rPr>
+          <w:rFonts w:eastAsiaTheme="minorEastAsia"/>
+        </w:rPr>
+      </w:pPr>
+    </w:p>
+    <w:p>
+      <w:pPr>
+        <w:pStyle w:val="ListParagraph"/>
+        <w:rPr>
+          <w:rFonts w:eastAsiaTheme="minorEastAsia"/>
+        </w:rPr>
+      </w:pPr>
+      <w:r>
+        <w:rPr>
+          <w:rFonts w:eastAsiaTheme="minorEastAsia"/>
+        </w:rPr>
+        <w:t>Rounded off = 94.91000</w:t>
+      </w:r>
+    </w:p>
+    <w:p>
+      <w:pPr>
+        <w:pStyle w:val="ListParagraph"/>
+        <w:rPr>
+          <w:rFonts w:eastAsiaTheme="minorEastAsia"/>
+        </w:rPr>
+      </w:pPr>
+      <w:r>
+        <w:rPr>
+          <w:rFonts w:eastAsiaTheme="minorEastAsia"/>
+        </w:rPr>
+        <w:t>Conversion of USD: 1,00,000 x 94.91000 = 9491000</w:t>
+      </w:r>
+    </w:p>
+    <w:p>
+      <w:pPr>
+        <w:rPr>
+          <w:rFonts w:eastAsiaTheme="minorEastAsia"/>
+        </w:rPr>
+      </w:pPr>
+    </w:p>
+    <w:p>
+      <w:pPr>
+        <w:rPr>
+          <w:rFonts w:eastAsiaTheme="minorEastAsia"/>
+        </w:rPr>
+      </w:pPr>
+      <w:r>
+        <w:rPr>
+          <w:rFonts w:eastAsiaTheme="minorEastAsia"/>
+        </w:rPr>
+        <w:t xml:space="preserve">Premium: where the forward margin for a month is giving ascending order as in quotation. </w:t>
+      </w:r>
+      <w:proofErr w:type="spellStart"/>
+      <w:r>
+        <w:rPr>
+          <w:rFonts w:eastAsiaTheme="minorEastAsia"/>
+        </w:rPr>
+        <w:t>Eg.</w:t>
+      </w:r>
+      <w:proofErr w:type="spellEnd"/>
+      <w:r>
+        <w:rPr>
+          <w:rFonts w:eastAsiaTheme="minorEastAsia"/>
+        </w:rPr>
+        <w:t xml:space="preserve"> SPOT GBP  = 95.4000, SPOT/May = 95.6000, SPOT/June = 95.7500</w:t>
+      </w:r>
+    </w:p>
+    <w:p>
+      <w:pPr>
+        <w:rPr>
+          <w:rFonts w:eastAsiaTheme="minorEastAsia"/>
+        </w:rPr>
+      </w:pPr>
+      <w:r>
+        <w:rPr>
+          <w:rFonts w:eastAsiaTheme="minorEastAsia"/>
+        </w:rPr>
+        <w:t xml:space="preserve">Discount: where the forward margin for a month is giving </w:t>
+      </w:r>
+      <w:proofErr w:type="spellStart"/>
+      <w:r>
+        <w:rPr>
+          <w:rFonts w:eastAsiaTheme="minorEastAsia"/>
+        </w:rPr>
+        <w:t>desceding</w:t>
+      </w:r>
+      <w:proofErr w:type="spellEnd"/>
+      <w:r>
+        <w:rPr>
+          <w:rFonts w:eastAsiaTheme="minorEastAsia"/>
+        </w:rPr>
+        <w:t xml:space="preserve"> order as in the quotation. </w:t>
+      </w:r>
+      <w:proofErr w:type="spellStart"/>
+      <w:r>
+        <w:rPr>
+          <w:rFonts w:eastAsiaTheme="minorEastAsia"/>
+        </w:rPr>
+        <w:t>Eg.</w:t>
+      </w:r>
+      <w:proofErr w:type="spellEnd"/>
+      <w:r>
+        <w:rPr>
+          <w:rFonts w:eastAsiaTheme="minorEastAsia"/>
+        </w:rPr>
+        <w:t xml:space="preserve"> SPOT</w:t>
+      </w:r>
+      <w:r>
+        <w:rPr>
+          <w:rFonts w:eastAsiaTheme="minorEastAsia"/>
+        </w:rPr>
+        <w:t>/</w:t>
+      </w:r>
+      <w:r>
+        <w:rPr>
+          <w:rFonts w:eastAsiaTheme="minorEastAsia"/>
+        </w:rPr>
+        <w:t>GBP = 95.4000, SPOT</w:t>
+      </w:r>
+      <w:r>
+        <w:rPr>
+          <w:rFonts w:eastAsiaTheme="minorEastAsia"/>
+        </w:rPr>
+        <w:t>/</w:t>
+      </w:r>
+      <w:r>
+        <w:rPr>
+          <w:rFonts w:eastAsiaTheme="minorEastAsia"/>
+        </w:rPr>
+        <w:t>May = 95.3800, SPOT/June = 95.3200</w:t>
+      </w:r>
+    </w:p>
+    <w:p>
+      <w:pPr>
+        <w:rPr>
+          <w:rFonts w:eastAsiaTheme="minorEastAsia"/>
+        </w:rPr>
+      </w:pPr>
+    </w:p>
+    <w:p>
+      <w:pPr>
+        <w:rPr>
+          <w:rFonts w:eastAsiaTheme="minorEastAsia"/>
+        </w:rPr>
+      </w:pPr>
+      <w:r>
+        <w:rPr>
+          <w:rFonts w:eastAsiaTheme="minorEastAsia"/>
+        </w:rPr>
+        <w:t>Recovery of interest on Bill Purchased:</w:t>
+      </w:r>
+    </w:p>
+    <w:p>
+      <w:pPr>
+        <w:pStyle w:val="ListParagraph"/>
+        <w:numPr>
+          <w:ilvl w:val="0"/>
+          <w:numId w:val="41"/>
+        </w:numPr>
+        <w:rPr>
+          <w:rFonts w:eastAsiaTheme="minorEastAsia"/>
+        </w:rPr>
+      </w:pPr>
+      <w:r>
+        <w:rPr>
+          <w:rFonts w:eastAsiaTheme="minorEastAsia"/>
+        </w:rPr>
+        <w:t>Banks buy bills from customer</w:t>
+      </w:r>
+    </w:p>
+    <w:p>
+      <w:pPr>
+        <w:pStyle w:val="ListParagraph"/>
+        <w:numPr>
+          <w:ilvl w:val="0"/>
+          <w:numId w:val="41"/>
+        </w:numPr>
+        <w:rPr>
+          <w:rFonts w:eastAsiaTheme="minorEastAsia"/>
+        </w:rPr>
+      </w:pPr>
+      <w:r>
+        <w:rPr>
+          <w:rFonts w:eastAsiaTheme="minorEastAsia"/>
+        </w:rPr>
+        <w:t>Bank claim interest from the customer (from the date of purchase)</w:t>
+      </w:r>
+    </w:p>
+    <w:p>
+      <w:pPr>
+        <w:pStyle w:val="ListParagraph"/>
+        <w:rPr>
+          <w:rFonts w:eastAsiaTheme="minorEastAsia"/>
+        </w:rPr>
+      </w:pPr>
+      <w:r>
+        <w:rPr>
+          <w:rFonts w:eastAsiaTheme="minorEastAsia"/>
+        </w:rPr>
+        <w:t xml:space="preserve">Interest on Bill </w:t>
+      </w:r>
+      <m:oMath>
+        <m:r>
+          <w:rPr>
+            <w:rFonts w:ascii="Cambria Math" w:eastAsiaTheme="minorEastAsia" w:hAnsi="Cambria Math"/>
+          </w:rPr>
+          <m:t>=</m:t>
+        </m:r>
+        <m:f>
+          <m:fPr>
+            <m:ctrlPr>
+              <w:rPr>
+                <w:rFonts w:ascii="Cambria Math" w:eastAsiaTheme="minorEastAsia" w:hAnsi="Cambria Math"/>
+                <w:i/>
+              </w:rPr>
+            </m:ctrlPr>
+          </m:fPr>
+          <m:num>
+            <m:r>
+              <w:rPr>
+                <w:rFonts w:ascii="Cambria Math" w:eastAsiaTheme="minorEastAsia" w:hAnsi="Cambria Math"/>
+              </w:rPr>
+              <m:t>Rupee value of bill ×Number of days</m:t>
+            </m:r>
+          </m:num>
+          <m:den>
+            <m:r>
+              <w:rPr>
+                <w:rFonts w:ascii="Cambria Math" w:eastAsiaTheme="minorEastAsia" w:hAnsi="Cambria Math"/>
+              </w:rPr>
+              <m:t>100×365</m:t>
+            </m:r>
+          </m:den>
+        </m:f>
+      </m:oMath>
+    </w:p>
+    <w:p>
+      <w:pPr>
+        <w:pStyle w:val="ListParagraph"/>
+        <w:rPr>
+          <w:rFonts w:eastAsiaTheme="minorEastAsia"/>
+        </w:rPr>
+      </w:pPr>
+    </w:p>
+    <w:p>
+      <w:pPr>
+        <w:pStyle w:val="ListParagraph"/>
+        <w:rPr>
+          <w:rFonts w:eastAsiaTheme="minorEastAsia"/>
+        </w:rPr>
+      </w:pPr>
+      <w:r>
+        <w:rPr>
+          <w:rFonts w:eastAsiaTheme="minorEastAsia"/>
+        </w:rPr>
+        <w:t xml:space="preserve">= </w:t>
+      </w:r>
+      <m:oMath>
+        <m:f>
+          <m:fPr>
+            <m:ctrlPr>
+              <w:rPr>
+                <w:rFonts w:ascii="Cambria Math" w:eastAsiaTheme="minorEastAsia" w:hAnsi="Cambria Math"/>
+                <w:i/>
+              </w:rPr>
+            </m:ctrlPr>
+          </m:fPr>
+          <m:num>
+            <m:r>
+              <w:rPr>
+                <w:rFonts w:ascii="Cambria Math" w:eastAsiaTheme="minorEastAsia" w:hAnsi="Cambria Math"/>
+              </w:rPr>
+              <m:t>9491000×10×25</m:t>
+            </m:r>
+          </m:num>
+          <m:den>
+            <m:r>
+              <w:rPr>
+                <w:rFonts w:ascii="Cambria Math" w:eastAsiaTheme="minorEastAsia" w:hAnsi="Cambria Math"/>
+              </w:rPr>
+              <m:t>100×365</m:t>
+            </m:r>
+          </m:den>
+        </m:f>
+        <m:r>
+          <w:rPr>
+            <w:rFonts w:ascii="Cambria Math" w:eastAsiaTheme="minorEastAsia" w:hAnsi="Cambria Math"/>
+          </w:rPr>
+          <m:t>=65006.8493</m:t>
+        </m:r>
+      </m:oMath>
+    </w:p>
+    <w:p>
+      <w:pPr>
+        <w:rPr>
+          <w:rFonts w:eastAsiaTheme="minorEastAsia"/>
+        </w:rPr>
+      </w:pPr>
+    </w:p>
+    <w:p>
+      <w:pPr>
+        <w:rPr>
+          <w:rFonts w:eastAsiaTheme="minorEastAsia"/>
+        </w:rPr>
+      </w:pPr>
+      <w:r>
+        <w:rPr>
+          <w:rFonts w:eastAsiaTheme="minorEastAsia"/>
+        </w:rPr>
+        <w:t xml:space="preserve">Types of selling rates </w:t>
+      </w:r>
+    </w:p>
+    <w:p>
+      <w:pPr>
+        <w:rPr>
+          <w:rFonts w:eastAsiaTheme="minorEastAsia"/>
+        </w:rPr>
+      </w:pPr>
+      <w:r>
+        <w:rPr>
+          <w:rFonts w:eastAsiaTheme="minorEastAsia"/>
+        </w:rPr>
+        <w:lastRenderedPageBreak/>
+        <w:t xml:space="preserve">When a bank sells a foreign </w:t>
+      </w:r>
+      <w:proofErr w:type="gramStart"/>
+      <w:r>
+        <w:rPr>
+          <w:rFonts w:eastAsiaTheme="minorEastAsia"/>
+        </w:rPr>
+        <w:t>exchange</w:t>
+      </w:r>
+      <w:proofErr w:type="gramEnd"/>
+      <w:r>
+        <w:rPr>
+          <w:rFonts w:eastAsiaTheme="minorEastAsia"/>
+        </w:rPr>
+        <w:t xml:space="preserve"> it receives INR form the customer and parts with foreign currency (sale is </w:t>
+      </w:r>
+      <w:proofErr w:type="gramStart"/>
+      <w:r>
+        <w:rPr>
+          <w:rFonts w:eastAsiaTheme="minorEastAsia"/>
+        </w:rPr>
+        <w:t>effected</w:t>
+      </w:r>
+      <w:proofErr w:type="gramEnd"/>
+      <w:r>
+        <w:rPr>
+          <w:rFonts w:eastAsiaTheme="minorEastAsia"/>
+        </w:rPr>
+        <w:t xml:space="preserve"> by issuing a payment instrument).</w:t>
+      </w:r>
+    </w:p>
+    <w:p>
+      <w:pPr>
+        <w:rPr>
+          <w:rFonts w:eastAsiaTheme="minorEastAsia"/>
+        </w:rPr>
+      </w:pPr>
+      <w:r>
+        <w:rPr>
+          <w:rFonts w:eastAsiaTheme="minorEastAsia"/>
+        </w:rPr>
+        <w:t xml:space="preserve">Two types of selling rates: TT selling rates and bill selling rates </w:t>
+      </w:r>
+    </w:p>
+    <w:p>
+      <w:pPr>
+        <w:rPr>
+          <w:rFonts w:eastAsiaTheme="minorEastAsia"/>
+        </w:rPr>
+      </w:pPr>
+    </w:p>
+    <w:p>
+      <w:pPr>
+        <w:rPr>
+          <w:rFonts w:eastAsiaTheme="minorEastAsia"/>
+        </w:rPr>
+      </w:pPr>
+      <w:r>
+        <w:rPr>
+          <w:rFonts w:eastAsiaTheme="minorEastAsia"/>
+        </w:rPr>
+        <w:t>Transactions involved in TT selling rates:</w:t>
+      </w:r>
+    </w:p>
+    <w:p>
+      <w:pPr>
+        <w:pStyle w:val="ListParagraph"/>
+        <w:numPr>
+          <w:ilvl w:val="0"/>
+          <w:numId w:val="42"/>
+        </w:numPr>
+        <w:rPr>
+          <w:rFonts w:eastAsiaTheme="minorEastAsia"/>
+        </w:rPr>
+      </w:pPr>
+      <w:r>
+        <w:rPr>
+          <w:rFonts w:eastAsiaTheme="minorEastAsia"/>
+        </w:rPr>
+        <w:t>Issue of DD, mail transfer, telegraphic transfer etc.</w:t>
+      </w:r>
+    </w:p>
+    <w:p>
+      <w:pPr>
+        <w:pStyle w:val="ListParagraph"/>
+        <w:numPr>
+          <w:ilvl w:val="0"/>
+          <w:numId w:val="42"/>
+        </w:numPr>
+        <w:rPr>
+          <w:rFonts w:eastAsiaTheme="minorEastAsia"/>
+        </w:rPr>
+      </w:pPr>
+      <w:r>
+        <w:rPr>
+          <w:rFonts w:eastAsiaTheme="minorEastAsia"/>
+        </w:rPr>
+        <w:t xml:space="preserve">Cancelation of foreign exchange purchased earlier (TT rate selling rate is calculated on the basis of interbank SPOT selling rate) </w:t>
+      </w:r>
+    </w:p>
+    <w:p>
+      <w:pPr>
+        <w:rPr>
+          <w:rFonts w:eastAsiaTheme="minorEastAsia"/>
+        </w:rPr>
+      </w:pPr>
+    </w:p>
+    <w:p>
+      <w:pPr>
+        <w:rPr>
+          <w:rFonts w:eastAsiaTheme="minorEastAsia"/>
+        </w:rPr>
+      </w:pPr>
+    </w:p>
+    <w:p>
+      <w:pPr>
+        <w:rPr>
+          <w:rFonts w:eastAsiaTheme="minorEastAsia"/>
+        </w:rPr>
+      </w:pPr>
+      <w:r>
+        <w:rPr>
+          <w:rFonts w:eastAsiaTheme="minorEastAsia"/>
+        </w:rPr>
+        <w:t>Selling rates:</w:t>
+      </w:r>
+    </w:p>
+    <w:p>
+      <w:pPr>
+        <w:rPr>
+          <w:rFonts w:eastAsiaTheme="minorEastAsia"/>
+        </w:rPr>
+      </w:pPr>
+      <w:r>
+        <w:rPr>
+          <w:rFonts w:eastAsiaTheme="minorEastAsia"/>
+          <w:noProof/>
+        </w:rPr>
+        <w:drawing>
+          <wp:inline distT="0" distB="0" distL="0" distR="0" wp14:anchorId="1FCE7B16" wp14:editId="3A4A98FA">
+            <wp:extent cx="4532630" cy="1553845"/>
+            <wp:effectExtent l="0" t="0" r="1270" b="8255"/>
+            <wp:docPr id="330968993" name="Picture 1"/>
+            <wp:cNvGraphicFramePr>
+              <a:graphicFrameLocks xmlns:a="http://schemas.openxmlformats.org/drawingml/2006/main" noChangeAspect="1"/>
+            </wp:cNvGraphicFramePr>
+            <a:graphic xmlns:a="http://schemas.openxmlformats.org/drawingml/2006/main">
+              <a:graphicData uri="http://schemas.openxmlformats.org/drawingml/2006/picture">
+                <pic:pic xmlns:pic="http://schemas.openxmlformats.org/drawingml/2006/picture">
+                  <pic:nvPicPr>
+                    <pic:cNvPr id="0" name="Picture 1"/>
+                    <pic:cNvPicPr>
+                      <a:picLocks noChangeAspect="1" noChangeArrowheads="1"/>
+                    </pic:cNvPicPr>
+                  </pic:nvPicPr>
+                  <pic:blipFill>
+                    <a:blip r:embed="rId32">
+                      <a:extLst>
+                        <a:ext uri="{28A0092B-C50C-407E-A947-70E740481C1C}">
+                          <a14:useLocalDpi xmlns:a14="http://schemas.microsoft.com/office/drawing/2010/main" val="0"/>
+                        </a:ext>
+                      </a:extLst>
+                    </a:blip>
+                    <a:srcRect/>
+                    <a:stretch>
+                      <a:fillRect/>
+                    </a:stretch>
+                  </pic:blipFill>
+                  <pic:spPr bwMode="auto">
+                    <a:xfrm>
+                      <a:off x="0" y="0"/>
+                      <a:ext cx="4532630" cy="1553845"/>
+                    </a:xfrm>
+                    <a:prstGeom prst="rect">
+                      <a:avLst/>
+                    </a:prstGeom>
+                    <a:noFill/>
+                    <a:ln>
+                      <a:noFill/>
+                    </a:ln>
+                  </pic:spPr>
+                </pic:pic>
+              </a:graphicData>
+            </a:graphic>
+          </wp:inline>
+        </w:drawing>
+      </w:r>
+    </w:p>
+    <w:p>
+      <w:pPr>
+        <w:rPr>
+          <w:rFonts w:eastAsiaTheme="minorEastAsia"/>
+        </w:rPr>
+      </w:pPr>
+      <w:r>
+        <w:rPr>
+          <w:rFonts w:eastAsiaTheme="minorEastAsia"/>
+        </w:rPr>
+        <w:t xml:space="preserve">Q. your customer requested you to issue a DD on London, 25000 EUR. Assuming ongoing spot rates in the local market for EUR are as under: </w:t>
+      </w:r>
+    </w:p>
+    <w:p>
+      <w:pPr>
+        <w:rPr>
+          <w:rFonts w:eastAsiaTheme="minorEastAsia"/>
+        </w:rPr>
+      </w:pPr>
+      <w:r>
+        <w:rPr>
+          <w:rFonts w:eastAsiaTheme="minorEastAsia"/>
+        </w:rPr>
+        <w:t xml:space="preserve">SPOT </w:t>
+      </w:r>
+      <w:r>
+        <w:rPr>
+          <w:rFonts w:eastAsiaTheme="minorEastAsia"/>
+        </w:rPr>
+        <w:tab/>
+      </w:r>
+      <w:r>
+        <w:rPr>
+          <w:rFonts w:eastAsiaTheme="minorEastAsia"/>
+        </w:rPr>
+        <w:tab/>
+      </w:r>
+      <w:r>
+        <w:rPr>
+          <w:rFonts w:eastAsiaTheme="minorEastAsia"/>
+        </w:rPr>
+        <w:tab/>
+        <w:t>1EUR = Rs. 109.3575/3825</w:t>
+      </w:r>
+    </w:p>
+    <w:p>
+      <w:pPr>
+        <w:rPr>
+          <w:rFonts w:eastAsiaTheme="minorEastAsia"/>
+        </w:rPr>
+      </w:pPr>
+      <w:r>
+        <w:rPr>
+          <w:rFonts w:eastAsiaTheme="minorEastAsia"/>
+        </w:rPr>
+        <w:t>1 Month Forward</w:t>
+      </w:r>
+      <w:r>
+        <w:rPr>
+          <w:rFonts w:eastAsiaTheme="minorEastAsia"/>
+        </w:rPr>
+        <w:tab/>
+        <w:t xml:space="preserve">   EUR = Rs. 109.7825/8250</w:t>
+      </w:r>
+    </w:p>
+    <w:p>
+      <w:pPr>
+        <w:rPr>
+          <w:rFonts w:eastAsiaTheme="minorEastAsia"/>
+        </w:rPr>
+      </w:pPr>
+    </w:p>
+    <w:p>
+      <w:pPr>
+        <w:rPr>
+          <w:rFonts w:eastAsiaTheme="minorEastAsia"/>
+        </w:rPr>
+      </w:pPr>
+      <w:r>
+        <w:rPr>
+          <w:rFonts w:eastAsiaTheme="minorEastAsia"/>
+        </w:rPr>
+        <w:t>An exchange margin of 0.15%</w:t>
+      </w:r>
+      <w:r>
+        <w:rPr>
+          <w:rFonts w:eastAsiaTheme="minorEastAsia"/>
+        </w:rPr>
+        <w:t xml:space="preserve">. At what rate will you quote to the customer and what is INR to be payable by the customer </w:t>
+      </w:r>
+    </w:p>
+    <w:p>
+      <w:pPr>
+        <w:rPr>
+          <w:rFonts w:eastAsiaTheme="minorEastAsia"/>
+        </w:rPr>
+      </w:pPr>
+      <w:r>
+        <w:rPr>
+          <w:rFonts w:eastAsiaTheme="minorEastAsia"/>
+        </w:rPr>
+        <w:t>SOL:</w:t>
+      </w:r>
+    </w:p>
+    <w:p>
+      <w:pPr>
+        <w:rPr>
+          <w:rFonts w:eastAsiaTheme="minorEastAsia"/>
+        </w:rPr>
+      </w:pPr>
+      <w:r>
+        <w:rPr>
+          <w:rFonts w:eastAsiaTheme="minorEastAsia"/>
+          <w:noProof/>
+        </w:rPr>
+        <w:drawing>
+          <wp:inline distT="0" distB="0" distL="0" distR="0" wp14:anchorId="557FAA78" wp14:editId="5FA553ED">
+            <wp:extent cx="5553710" cy="959485"/>
+            <wp:effectExtent l="0" t="0" r="8890" b="0"/>
+            <wp:docPr id="1391609050" name="Picture 2"/>
+            <wp:cNvGraphicFramePr>
+              <a:graphicFrameLocks xmlns:a="http://schemas.openxmlformats.org/drawingml/2006/main" noChangeAspect="1"/>
+            </wp:cNvGraphicFramePr>
+            <a:graphic xmlns:a="http://schemas.openxmlformats.org/drawingml/2006/main">
+              <a:graphicData uri="http://schemas.openxmlformats.org/drawingml/2006/picture">
+                <pic:pic xmlns:pic="http://schemas.openxmlformats.org/drawingml/2006/picture">
+                  <pic:nvPicPr>
+                    <pic:cNvPr id="0" name="Picture 2"/>
+                    <pic:cNvPicPr>
+                      <a:picLocks noChangeAspect="1" noChangeArrowheads="1"/>
+                    </pic:cNvPicPr>
+                  </pic:nvPicPr>
+                  <pic:blipFill>
+                    <a:blip r:embed="rId33">
+                      <a:extLst>
+                        <a:ext uri="{28A0092B-C50C-407E-A947-70E740481C1C}">
+                          <a14:useLocalDpi xmlns:a14="http://schemas.microsoft.com/office/drawing/2010/main" val="0"/>
+                        </a:ext>
+                      </a:extLst>
+                    </a:blip>
+                    <a:srcRect/>
+                    <a:stretch>
+                      <a:fillRect/>
+                    </a:stretch>
+                  </pic:blipFill>
+                  <pic:spPr bwMode="auto">
+                    <a:xfrm>
+                      <a:off x="0" y="0"/>
+                      <a:ext cx="5553710" cy="959485"/>
+                    </a:xfrm>
+                    <a:prstGeom prst="rect">
+                      <a:avLst/>
+                    </a:prstGeom>
+                    <a:noFill/>
+                    <a:ln>
+                      <a:noFill/>
+                    </a:ln>
+                  </pic:spPr>
+                </pic:pic>
+              </a:graphicData>
+            </a:graphic>
+          </wp:inline>
+        </w:drawing>
+      </w:r>
+    </w:p>
+    <w:p>
+      <w:pPr>
+        <w:rPr>
+          <w:rFonts w:eastAsiaTheme="minorEastAsia"/>
+        </w:rPr>
+      </w:pPr>
+      <w:r>
+        <w:rPr>
+          <w:rFonts w:eastAsiaTheme="minorEastAsia"/>
+        </w:rPr>
+        <w:t>Amount payable in INR = 109.5400 x 25000 = 2738500</w:t>
+      </w:r>
+    </w:p>
+    <w:p>
+      <w:pPr>
+        <w:rPr>
+          <w:rFonts w:eastAsiaTheme="minorEastAsia"/>
+        </w:rPr>
+      </w:pPr>
+      <w:r>
+        <w:rPr>
+          <w:rFonts w:eastAsiaTheme="minorEastAsia"/>
+        </w:rPr>
+        <w:t xml:space="preserve"> </w:t>
       </w:r>
     </w:p>
     <w:sectPr>
@@ -5526,9 +8166,9 @@
     </w:lvl>
   </w:abstractNum>
   <w:abstractNum w:abstractNumId="3" w15:restartNumberingAfterBreak="0">
-    <w:nsid w:val="0A0C1CFD"/>
+    <w:nsid w:val="08333370"/>
     <w:multiLevelType w:val="hybridMultilevel"/>
-    <w:tmpl w:val="917E232C"/>
+    <w:tmpl w:val="0E50630E"/>
     <w:lvl w:ilvl="0" w:tplc="40090001">
       <w:start w:val="1"/>
       <w:numFmt w:val="bullet"/>
@@ -5639,6 +8279,205 @@
     </w:lvl>
   </w:abstractNum>
   <w:abstractNum w:abstractNumId="4" w15:restartNumberingAfterBreak="0">
+    <w:nsid w:val="09D43263"/>
+    <w:multiLevelType w:val="hybridMultilevel"/>
+    <w:tmpl w:val="8C3418DA"/>
+    <w:lvl w:ilvl="0" w:tplc="4009000F">
+      <w:start w:val="1"/>
+      <w:numFmt w:val="decimal"/>
+      <w:lvlText w:val="%1."/>
+      <w:lvlJc w:val="left"/>
+      <w:pPr>
+        <w:ind w:left="720" w:hanging="360"/>
+      </w:pPr>
+    </w:lvl>
+    <w:lvl w:ilvl="1" w:tplc="40090019" w:tentative="1">
+      <w:start w:val="1"/>
+      <w:numFmt w:val="lowerLetter"/>
+      <w:lvlText w:val="%2."/>
+      <w:lvlJc w:val="left"/>
+      <w:pPr>
+        <w:ind w:left="1440" w:hanging="360"/>
+      </w:pPr>
+    </w:lvl>
+    <w:lvl w:ilvl="2" w:tplc="4009001B" w:tentative="1">
+      <w:start w:val="1"/>
+      <w:numFmt w:val="lowerRoman"/>
+      <w:lvlText w:val="%3."/>
+      <w:lvlJc w:val="right"/>
+      <w:pPr>
+        <w:ind w:left="2160" w:hanging="180"/>
+      </w:pPr>
+    </w:lvl>
+    <w:lvl w:ilvl="3" w:tplc="4009000F" w:tentative="1">
+      <w:start w:val="1"/>
+      <w:numFmt w:val="decimal"/>
+      <w:lvlText w:val="%4."/>
+      <w:lvlJc w:val="left"/>
+      <w:pPr>
+        <w:ind w:left="2880" w:hanging="360"/>
+      </w:pPr>
+    </w:lvl>
+    <w:lvl w:ilvl="4" w:tplc="40090019" w:tentative="1">
+      <w:start w:val="1"/>
+      <w:numFmt w:val="lowerLetter"/>
+      <w:lvlText w:val="%5."/>
+      <w:lvlJc w:val="left"/>
+      <w:pPr>
+        <w:ind w:left="3600" w:hanging="360"/>
+      </w:pPr>
+    </w:lvl>
+    <w:lvl w:ilvl="5" w:tplc="4009001B" w:tentative="1">
+      <w:start w:val="1"/>
+      <w:numFmt w:val="lowerRoman"/>
+      <w:lvlText w:val="%6."/>
+      <w:lvlJc w:val="right"/>
+      <w:pPr>
+        <w:ind w:left="4320" w:hanging="180"/>
+      </w:pPr>
+    </w:lvl>
+    <w:lvl w:ilvl="6" w:tplc="4009000F" w:tentative="1">
+      <w:start w:val="1"/>
+      <w:numFmt w:val="decimal"/>
+      <w:lvlText w:val="%7."/>
+      <w:lvlJc w:val="left"/>
+      <w:pPr>
+        <w:ind w:left="5040" w:hanging="360"/>
+      </w:pPr>
+    </w:lvl>
+    <w:lvl w:ilvl="7" w:tplc="40090019" w:tentative="1">
+      <w:start w:val="1"/>
+      <w:numFmt w:val="lowerLetter"/>
+      <w:lvlText w:val="%8."/>
+      <w:lvlJc w:val="left"/>
+      <w:pPr>
+        <w:ind w:left="5760" w:hanging="360"/>
+      </w:pPr>
+    </w:lvl>
+    <w:lvl w:ilvl="8" w:tplc="4009001B" w:tentative="1">
+      <w:start w:val="1"/>
+      <w:numFmt w:val="lowerRoman"/>
+      <w:lvlText w:val="%9."/>
+      <w:lvlJc w:val="right"/>
+      <w:pPr>
+        <w:ind w:left="6480" w:hanging="180"/>
+      </w:pPr>
+    </w:lvl>
+  </w:abstractNum>
+  <w:abstractNum w:abstractNumId="5" w15:restartNumberingAfterBreak="0">
+    <w:nsid w:val="0A0C1CFD"/>
+    <w:multiLevelType w:val="hybridMultilevel"/>
+    <w:tmpl w:val="A57CEE9E"/>
+    <w:lvl w:ilvl="0" w:tplc="40090001">
+      <w:start w:val="1"/>
+      <w:numFmt w:val="bullet"/>
+      <w:lvlText w:val=""/>
+      <w:lvlJc w:val="left"/>
+      <w:pPr>
+        <w:ind w:left="720" w:hanging="360"/>
+      </w:pPr>
+      <w:rPr>
+        <w:rFonts w:ascii="Symbol" w:hAnsi="Symbol" w:hint="default"/>
+      </w:rPr>
+    </w:lvl>
+    <w:lvl w:ilvl="1" w:tplc="40090003" w:tentative="1">
+      <w:start w:val="1"/>
+      <w:numFmt w:val="bullet"/>
+      <w:lvlText w:val="o"/>
+      <w:lvlJc w:val="left"/>
+      <w:pPr>
+        <w:ind w:left="1440" w:hanging="360"/>
+      </w:pPr>
+      <w:rPr>
+        <w:rFonts w:ascii="Courier New" w:hAnsi="Courier New" w:cs="Courier New" w:hint="default"/>
+      </w:rPr>
+    </w:lvl>
+    <w:lvl w:ilvl="2" w:tplc="40090005" w:tentative="1">
+      <w:start w:val="1"/>
+      <w:numFmt w:val="bullet"/>
+      <w:lvlText w:val=""/>
+      <w:lvlJc w:val="left"/>
+      <w:pPr>
+        <w:ind w:left="2160" w:hanging="360"/>
+      </w:pPr>
+      <w:rPr>
+        <w:rFonts w:ascii="Wingdings" w:hAnsi="Wingdings" w:hint="default"/>
+      </w:rPr>
+    </w:lvl>
+    <w:lvl w:ilvl="3" w:tplc="40090001" w:tentative="1">
+      <w:start w:val="1"/>
+      <w:numFmt w:val="bullet"/>
+      <w:lvlText w:val=""/>
+      <w:lvlJc w:val="left"/>
+      <w:pPr>
+        <w:ind w:left="2880" w:hanging="360"/>
+      </w:pPr>
+      <w:rPr>
+        <w:rFonts w:ascii="Symbol" w:hAnsi="Symbol" w:hint="default"/>
+      </w:rPr>
+    </w:lvl>
+    <w:lvl w:ilvl="4" w:tplc="40090003" w:tentative="1">
+      <w:start w:val="1"/>
+      <w:numFmt w:val="bullet"/>
+      <w:lvlText w:val="o"/>
+      <w:lvlJc w:val="left"/>
+      <w:pPr>
+        <w:ind w:left="3600" w:hanging="360"/>
+      </w:pPr>
+      <w:rPr>
+        <w:rFonts w:ascii="Courier New" w:hAnsi="Courier New" w:cs="Courier New" w:hint="default"/>
+      </w:rPr>
+    </w:lvl>
+    <w:lvl w:ilvl="5" w:tplc="40090005" w:tentative="1">
+      <w:start w:val="1"/>
+      <w:numFmt w:val="bullet"/>
+      <w:lvlText w:val=""/>
+      <w:lvlJc w:val="left"/>
+      <w:pPr>
+        <w:ind w:left="4320" w:hanging="360"/>
+      </w:pPr>
+      <w:rPr>
+        <w:rFonts w:ascii="Wingdings" w:hAnsi="Wingdings" w:hint="default"/>
+      </w:rPr>
+    </w:lvl>
+    <w:lvl w:ilvl="6" w:tplc="40090001" w:tentative="1">
+      <w:start w:val="1"/>
+      <w:numFmt w:val="bullet"/>
+      <w:lvlText w:val=""/>
+      <w:lvlJc w:val="left"/>
+      <w:pPr>
+        <w:ind w:left="5040" w:hanging="360"/>
+      </w:pPr>
+      <w:rPr>
+        <w:rFonts w:ascii="Symbol" w:hAnsi="Symbol" w:hint="default"/>
+      </w:rPr>
+    </w:lvl>
+    <w:lvl w:ilvl="7" w:tplc="40090003" w:tentative="1">
+      <w:start w:val="1"/>
+      <w:numFmt w:val="bullet"/>
+      <w:lvlText w:val="o"/>
+      <w:lvlJc w:val="left"/>
+      <w:pPr>
+        <w:ind w:left="5760" w:hanging="360"/>
+      </w:pPr>
+      <w:rPr>
+        <w:rFonts w:ascii="Courier New" w:hAnsi="Courier New" w:cs="Courier New" w:hint="default"/>
+      </w:rPr>
+    </w:lvl>
+    <w:lvl w:ilvl="8" w:tplc="40090005" w:tentative="1">
+      <w:start w:val="1"/>
+      <w:numFmt w:val="bullet"/>
+      <w:lvlText w:val=""/>
+      <w:lvlJc w:val="left"/>
+      <w:pPr>
+        <w:ind w:left="6480" w:hanging="360"/>
+      </w:pPr>
+      <w:rPr>
+        <w:rFonts w:ascii="Wingdings" w:hAnsi="Wingdings" w:hint="default"/>
+      </w:rPr>
+    </w:lvl>
+  </w:abstractNum>
+  <w:abstractNum w:abstractNumId="6" w15:restartNumberingAfterBreak="0">
     <w:nsid w:val="0A9107CB"/>
     <w:multiLevelType w:val="hybridMultilevel"/>
     <w:tmpl w:val="398AC74A"/>
@@ -5724,7 +8563,7 @@
       </w:pPr>
     </w:lvl>
   </w:abstractNum>
-  <w:abstractNum w:abstractNumId="5" w15:restartNumberingAfterBreak="0">
+  <w:abstractNum w:abstractNumId="7" w15:restartNumberingAfterBreak="0">
     <w:nsid w:val="0BCE7DF0"/>
     <w:multiLevelType w:val="hybridMultilevel"/>
     <w:tmpl w:val="4502F46E"/>
@@ -5837,7 +8676,7 @@
       </w:rPr>
     </w:lvl>
   </w:abstractNum>
-  <w:abstractNum w:abstractNumId="6" w15:restartNumberingAfterBreak="0">
+  <w:abstractNum w:abstractNumId="8" w15:restartNumberingAfterBreak="0">
     <w:nsid w:val="0C0C5C67"/>
     <w:multiLevelType w:val="hybridMultilevel"/>
     <w:tmpl w:val="5924474E"/>
@@ -5923,7 +8762,7 @@
       </w:pPr>
     </w:lvl>
   </w:abstractNum>
-  <w:abstractNum w:abstractNumId="7" w15:restartNumberingAfterBreak="0">
+  <w:abstractNum w:abstractNumId="9" w15:restartNumberingAfterBreak="0">
     <w:nsid w:val="0CE72736"/>
     <w:multiLevelType w:val="hybridMultilevel"/>
     <w:tmpl w:val="DB328FD2"/>
@@ -6009,7 +8848,7 @@
       </w:pPr>
     </w:lvl>
   </w:abstractNum>
-  <w:abstractNum w:abstractNumId="8" w15:restartNumberingAfterBreak="0">
+  <w:abstractNum w:abstractNumId="10" w15:restartNumberingAfterBreak="0">
     <w:nsid w:val="0DF5196A"/>
     <w:multiLevelType w:val="hybridMultilevel"/>
     <w:tmpl w:val="42C02A96"/>
@@ -6122,7 +8961,7 @@
       </w:rPr>
     </w:lvl>
   </w:abstractNum>
-  <w:abstractNum w:abstractNumId="9" w15:restartNumberingAfterBreak="0">
+  <w:abstractNum w:abstractNumId="11" w15:restartNumberingAfterBreak="0">
     <w:nsid w:val="1039038F"/>
     <w:multiLevelType w:val="hybridMultilevel"/>
     <w:tmpl w:val="4AF28FCE"/>
@@ -6235,7 +9074,7 @@
       </w:rPr>
     </w:lvl>
   </w:abstractNum>
-  <w:abstractNum w:abstractNumId="10" w15:restartNumberingAfterBreak="0">
+  <w:abstractNum w:abstractNumId="12" w15:restartNumberingAfterBreak="0">
     <w:nsid w:val="124A5982"/>
     <w:multiLevelType w:val="hybridMultilevel"/>
     <w:tmpl w:val="CC346F0E"/>
@@ -6348,7 +9187,7 @@
       </w:rPr>
     </w:lvl>
   </w:abstractNum>
-  <w:abstractNum w:abstractNumId="11" w15:restartNumberingAfterBreak="0">
+  <w:abstractNum w:abstractNumId="13" w15:restartNumberingAfterBreak="0">
     <w:nsid w:val="12F73C13"/>
     <w:multiLevelType w:val="hybridMultilevel"/>
     <w:tmpl w:val="A456F852"/>
@@ -6461,7 +9300,93 @@
       </w:rPr>
     </w:lvl>
   </w:abstractNum>
-  <w:abstractNum w:abstractNumId="12" w15:restartNumberingAfterBreak="0">
+  <w:abstractNum w:abstractNumId="14" w15:restartNumberingAfterBreak="0">
+    <w:nsid w:val="1A0E3817"/>
+    <w:multiLevelType w:val="hybridMultilevel"/>
+    <w:tmpl w:val="F684AEEC"/>
+    <w:lvl w:ilvl="0" w:tplc="4009001B">
+      <w:start w:val="1"/>
+      <w:numFmt w:val="lowerRoman"/>
+      <w:lvlText w:val="%1."/>
+      <w:lvlJc w:val="right"/>
+      <w:pPr>
+        <w:ind w:left="720" w:hanging="360"/>
+      </w:pPr>
+    </w:lvl>
+    <w:lvl w:ilvl="1" w:tplc="40090019" w:tentative="1">
+      <w:start w:val="1"/>
+      <w:numFmt w:val="lowerLetter"/>
+      <w:lvlText w:val="%2."/>
+      <w:lvlJc w:val="left"/>
+      <w:pPr>
+        <w:ind w:left="1440" w:hanging="360"/>
+      </w:pPr>
+    </w:lvl>
+    <w:lvl w:ilvl="2" w:tplc="4009001B" w:tentative="1">
+      <w:start w:val="1"/>
+      <w:numFmt w:val="lowerRoman"/>
+      <w:lvlText w:val="%3."/>
+      <w:lvlJc w:val="right"/>
+      <w:pPr>
+        <w:ind w:left="2160" w:hanging="180"/>
+      </w:pPr>
+    </w:lvl>
+    <w:lvl w:ilvl="3" w:tplc="4009000F" w:tentative="1">
+      <w:start w:val="1"/>
+      <w:numFmt w:val="decimal"/>
+      <w:lvlText w:val="%4."/>
+      <w:lvlJc w:val="left"/>
+      <w:pPr>
+        <w:ind w:left="2880" w:hanging="360"/>
+      </w:pPr>
+    </w:lvl>
+    <w:lvl w:ilvl="4" w:tplc="40090019" w:tentative="1">
+      <w:start w:val="1"/>
+      <w:numFmt w:val="lowerLetter"/>
+      <w:lvlText w:val="%5."/>
+      <w:lvlJc w:val="left"/>
+      <w:pPr>
+        <w:ind w:left="3600" w:hanging="360"/>
+      </w:pPr>
+    </w:lvl>
+    <w:lvl w:ilvl="5" w:tplc="4009001B" w:tentative="1">
+      <w:start w:val="1"/>
+      <w:numFmt w:val="lowerRoman"/>
+      <w:lvlText w:val="%6."/>
+      <w:lvlJc w:val="right"/>
+      <w:pPr>
+        <w:ind w:left="4320" w:hanging="180"/>
+      </w:pPr>
+    </w:lvl>
+    <w:lvl w:ilvl="6" w:tplc="4009000F" w:tentative="1">
+      <w:start w:val="1"/>
+      <w:numFmt w:val="decimal"/>
+      <w:lvlText w:val="%7."/>
+      <w:lvlJc w:val="left"/>
+      <w:pPr>
+        <w:ind w:left="5040" w:hanging="360"/>
+      </w:pPr>
+    </w:lvl>
+    <w:lvl w:ilvl="7" w:tplc="40090019" w:tentative="1">
+      <w:start w:val="1"/>
+      <w:numFmt w:val="lowerLetter"/>
+      <w:lvlText w:val="%8."/>
+      <w:lvlJc w:val="left"/>
+      <w:pPr>
+        <w:ind w:left="5760" w:hanging="360"/>
+      </w:pPr>
+    </w:lvl>
+    <w:lvl w:ilvl="8" w:tplc="4009001B" w:tentative="1">
+      <w:start w:val="1"/>
+      <w:numFmt w:val="lowerRoman"/>
+      <w:lvlText w:val="%9."/>
+      <w:lvlJc w:val="right"/>
+      <w:pPr>
+        <w:ind w:left="6480" w:hanging="180"/>
+      </w:pPr>
+    </w:lvl>
+  </w:abstractNum>
+  <w:abstractNum w:abstractNumId="15" w15:restartNumberingAfterBreak="0">
     <w:nsid w:val="1C4F2E27"/>
     <w:multiLevelType w:val="hybridMultilevel"/>
     <w:tmpl w:val="A8D0E3AA"/>
@@ -6547,7 +9472,7 @@
       </w:pPr>
     </w:lvl>
   </w:abstractNum>
-  <w:abstractNum w:abstractNumId="13" w15:restartNumberingAfterBreak="0">
+  <w:abstractNum w:abstractNumId="16" w15:restartNumberingAfterBreak="0">
     <w:nsid w:val="1C936017"/>
     <w:multiLevelType w:val="hybridMultilevel"/>
     <w:tmpl w:val="4844B798"/>
@@ -6660,7 +9585,7 @@
       </w:rPr>
     </w:lvl>
   </w:abstractNum>
-  <w:abstractNum w:abstractNumId="14" w15:restartNumberingAfterBreak="0">
+  <w:abstractNum w:abstractNumId="17" w15:restartNumberingAfterBreak="0">
     <w:nsid w:val="23C02DA6"/>
     <w:multiLevelType w:val="hybridMultilevel"/>
     <w:tmpl w:val="0DC828C4"/>
@@ -6746,7 +9671,93 @@
       </w:pPr>
     </w:lvl>
   </w:abstractNum>
-  <w:abstractNum w:abstractNumId="15" w15:restartNumberingAfterBreak="0">
+  <w:abstractNum w:abstractNumId="18" w15:restartNumberingAfterBreak="0">
+    <w:nsid w:val="263A373E"/>
+    <w:multiLevelType w:val="hybridMultilevel"/>
+    <w:tmpl w:val="054ECD42"/>
+    <w:lvl w:ilvl="0" w:tplc="4009000F">
+      <w:start w:val="1"/>
+      <w:numFmt w:val="decimal"/>
+      <w:lvlText w:val="%1."/>
+      <w:lvlJc w:val="left"/>
+      <w:pPr>
+        <w:ind w:left="720" w:hanging="360"/>
+      </w:pPr>
+    </w:lvl>
+    <w:lvl w:ilvl="1" w:tplc="40090019" w:tentative="1">
+      <w:start w:val="1"/>
+      <w:numFmt w:val="lowerLetter"/>
+      <w:lvlText w:val="%2."/>
+      <w:lvlJc w:val="left"/>
+      <w:pPr>
+        <w:ind w:left="1440" w:hanging="360"/>
+      </w:pPr>
+    </w:lvl>
+    <w:lvl w:ilvl="2" w:tplc="4009001B" w:tentative="1">
+      <w:start w:val="1"/>
+      <w:numFmt w:val="lowerRoman"/>
+      <w:lvlText w:val="%3."/>
+      <w:lvlJc w:val="right"/>
+      <w:pPr>
+        <w:ind w:left="2160" w:hanging="180"/>
+      </w:pPr>
+    </w:lvl>
+    <w:lvl w:ilvl="3" w:tplc="4009000F" w:tentative="1">
+      <w:start w:val="1"/>
+      <w:numFmt w:val="decimal"/>
+      <w:lvlText w:val="%4."/>
+      <w:lvlJc w:val="left"/>
+      <w:pPr>
+        <w:ind w:left="2880" w:hanging="360"/>
+      </w:pPr>
+    </w:lvl>
+    <w:lvl w:ilvl="4" w:tplc="40090019" w:tentative="1">
+      <w:start w:val="1"/>
+      <w:numFmt w:val="lowerLetter"/>
+      <w:lvlText w:val="%5."/>
+      <w:lvlJc w:val="left"/>
+      <w:pPr>
+        <w:ind w:left="3600" w:hanging="360"/>
+      </w:pPr>
+    </w:lvl>
+    <w:lvl w:ilvl="5" w:tplc="4009001B" w:tentative="1">
+      <w:start w:val="1"/>
+      <w:numFmt w:val="lowerRoman"/>
+      <w:lvlText w:val="%6."/>
+      <w:lvlJc w:val="right"/>
+      <w:pPr>
+        <w:ind w:left="4320" w:hanging="180"/>
+      </w:pPr>
+    </w:lvl>
+    <w:lvl w:ilvl="6" w:tplc="4009000F" w:tentative="1">
+      <w:start w:val="1"/>
+      <w:numFmt w:val="decimal"/>
+      <w:lvlText w:val="%7."/>
+      <w:lvlJc w:val="left"/>
+      <w:pPr>
+        <w:ind w:left="5040" w:hanging="360"/>
+      </w:pPr>
+    </w:lvl>
+    <w:lvl w:ilvl="7" w:tplc="40090019" w:tentative="1">
+      <w:start w:val="1"/>
+      <w:numFmt w:val="lowerLetter"/>
+      <w:lvlText w:val="%8."/>
+      <w:lvlJc w:val="left"/>
+      <w:pPr>
+        <w:ind w:left="5760" w:hanging="360"/>
+      </w:pPr>
+    </w:lvl>
+    <w:lvl w:ilvl="8" w:tplc="4009001B" w:tentative="1">
+      <w:start w:val="1"/>
+      <w:numFmt w:val="lowerRoman"/>
+      <w:lvlText w:val="%9."/>
+      <w:lvlJc w:val="right"/>
+      <w:pPr>
+        <w:ind w:left="6480" w:hanging="180"/>
+      </w:pPr>
+    </w:lvl>
+  </w:abstractNum>
+  <w:abstractNum w:abstractNumId="19" w15:restartNumberingAfterBreak="0">
     <w:nsid w:val="29863564"/>
     <w:multiLevelType w:val="hybridMultilevel"/>
     <w:tmpl w:val="E7869C1E"/>
@@ -6859,7 +9870,7 @@
       </w:rPr>
     </w:lvl>
   </w:abstractNum>
-  <w:abstractNum w:abstractNumId="16" w15:restartNumberingAfterBreak="0">
+  <w:abstractNum w:abstractNumId="20" w15:restartNumberingAfterBreak="0">
     <w:nsid w:val="30D214BF"/>
     <w:multiLevelType w:val="hybridMultilevel"/>
     <w:tmpl w:val="3DA6656C"/>
@@ -6945,7 +9956,7 @@
       </w:pPr>
     </w:lvl>
   </w:abstractNum>
-  <w:abstractNum w:abstractNumId="17" w15:restartNumberingAfterBreak="0">
+  <w:abstractNum w:abstractNumId="21" w15:restartNumberingAfterBreak="0">
     <w:nsid w:val="36B91AAD"/>
     <w:multiLevelType w:val="hybridMultilevel"/>
     <w:tmpl w:val="25E400EA"/>
@@ -7031,7 +10042,120 @@
       </w:pPr>
     </w:lvl>
   </w:abstractNum>
-  <w:abstractNum w:abstractNumId="18" w15:restartNumberingAfterBreak="0">
+  <w:abstractNum w:abstractNumId="22" w15:restartNumberingAfterBreak="0">
+    <w:nsid w:val="3BA84B9D"/>
+    <w:multiLevelType w:val="hybridMultilevel"/>
+    <w:tmpl w:val="228846F4"/>
+    <w:lvl w:ilvl="0" w:tplc="40090001">
+      <w:start w:val="1"/>
+      <w:numFmt w:val="bullet"/>
+      <w:lvlText w:val=""/>
+      <w:lvlJc w:val="left"/>
+      <w:pPr>
+        <w:ind w:left="720" w:hanging="360"/>
+      </w:pPr>
+      <w:rPr>
+        <w:rFonts w:ascii="Symbol" w:hAnsi="Symbol" w:hint="default"/>
+      </w:rPr>
+    </w:lvl>
+    <w:lvl w:ilvl="1" w:tplc="40090003" w:tentative="1">
+      <w:start w:val="1"/>
+      <w:numFmt w:val="bullet"/>
+      <w:lvlText w:val="o"/>
+      <w:lvlJc w:val="left"/>
+      <w:pPr>
+        <w:ind w:left="1440" w:hanging="360"/>
+      </w:pPr>
+      <w:rPr>
+        <w:rFonts w:ascii="Courier New" w:hAnsi="Courier New" w:cs="Courier New" w:hint="default"/>
+      </w:rPr>
+    </w:lvl>
+    <w:lvl w:ilvl="2" w:tplc="40090005" w:tentative="1">
+      <w:start w:val="1"/>
+      <w:numFmt w:val="bullet"/>
+      <w:lvlText w:val=""/>
+      <w:lvlJc w:val="left"/>
+      <w:pPr>
+        <w:ind w:left="2160" w:hanging="360"/>
+      </w:pPr>
+      <w:rPr>
+        <w:rFonts w:ascii="Wingdings" w:hAnsi="Wingdings" w:hint="default"/>
+      </w:rPr>
+    </w:lvl>
+    <w:lvl w:ilvl="3" w:tplc="40090001" w:tentative="1">
+      <w:start w:val="1"/>
+      <w:numFmt w:val="bullet"/>
+      <w:lvlText w:val=""/>
+      <w:lvlJc w:val="left"/>
+      <w:pPr>
+        <w:ind w:left="2880" w:hanging="360"/>
+      </w:pPr>
+      <w:rPr>
+        <w:rFonts w:ascii="Symbol" w:hAnsi="Symbol" w:hint="default"/>
+      </w:rPr>
+    </w:lvl>
+    <w:lvl w:ilvl="4" w:tplc="40090003" w:tentative="1">
+      <w:start w:val="1"/>
+      <w:numFmt w:val="bullet"/>
+      <w:lvlText w:val="o"/>
+      <w:lvlJc w:val="left"/>
+      <w:pPr>
+        <w:ind w:left="3600" w:hanging="360"/>
+      </w:pPr>
+      <w:rPr>
+        <w:rFonts w:ascii="Courier New" w:hAnsi="Courier New" w:cs="Courier New" w:hint="default"/>
+      </w:rPr>
+    </w:lvl>
+    <w:lvl w:ilvl="5" w:tplc="40090005" w:tentative="1">
+      <w:start w:val="1"/>
+      <w:numFmt w:val="bullet"/>
+      <w:lvlText w:val=""/>
+      <w:lvlJc w:val="left"/>
+      <w:pPr>
+        <w:ind w:left="4320" w:hanging="360"/>
+      </w:pPr>
+      <w:rPr>
+        <w:rFonts w:ascii="Wingdings" w:hAnsi="Wingdings" w:hint="default"/>
+      </w:rPr>
+    </w:lvl>
+    <w:lvl w:ilvl="6" w:tplc="40090001" w:tentative="1">
+      <w:start w:val="1"/>
+      <w:numFmt w:val="bullet"/>
+      <w:lvlText w:val=""/>
+      <w:lvlJc w:val="left"/>
+      <w:pPr>
+        <w:ind w:left="5040" w:hanging="360"/>
+      </w:pPr>
+      <w:rPr>
+        <w:rFonts w:ascii="Symbol" w:hAnsi="Symbol" w:hint="default"/>
+      </w:rPr>
+    </w:lvl>
+    <w:lvl w:ilvl="7" w:tplc="40090003" w:tentative="1">
+      <w:start w:val="1"/>
+      <w:numFmt w:val="bullet"/>
+      <w:lvlText w:val="o"/>
+      <w:lvlJc w:val="left"/>
+      <w:pPr>
+        <w:ind w:left="5760" w:hanging="360"/>
+      </w:pPr>
+      <w:rPr>
+        <w:rFonts w:ascii="Courier New" w:hAnsi="Courier New" w:cs="Courier New" w:hint="default"/>
+      </w:rPr>
+    </w:lvl>
+    <w:lvl w:ilvl="8" w:tplc="40090005" w:tentative="1">
+      <w:start w:val="1"/>
+      <w:numFmt w:val="bullet"/>
+      <w:lvlText w:val=""/>
+      <w:lvlJc w:val="left"/>
+      <w:pPr>
+        <w:ind w:left="6480" w:hanging="360"/>
+      </w:pPr>
+      <w:rPr>
+        <w:rFonts w:ascii="Wingdings" w:hAnsi="Wingdings" w:hint="default"/>
+      </w:rPr>
+    </w:lvl>
+  </w:abstractNum>
+  <w:abstractNum w:abstractNumId="23" w15:restartNumberingAfterBreak="0">
     <w:nsid w:val="3C8E5C31"/>
     <w:multiLevelType w:val="hybridMultilevel"/>
     <w:tmpl w:val="EA44B09A"/>
@@ -7144,7 +10268,7 @@
       </w:rPr>
     </w:lvl>
   </w:abstractNum>
-  <w:abstractNum w:abstractNumId="19" w15:restartNumberingAfterBreak="0">
+  <w:abstractNum w:abstractNumId="24" w15:restartNumberingAfterBreak="0">
     <w:nsid w:val="41AD58C6"/>
     <w:multiLevelType w:val="multilevel"/>
     <w:tmpl w:val="7E38A916"/>
@@ -7257,7 +10381,7 @@
       </w:rPr>
     </w:lvl>
   </w:abstractNum>
-  <w:abstractNum w:abstractNumId="20" w15:restartNumberingAfterBreak="0">
+  <w:abstractNum w:abstractNumId="25" w15:restartNumberingAfterBreak="0">
     <w:nsid w:val="431D7608"/>
     <w:multiLevelType w:val="hybridMultilevel"/>
     <w:tmpl w:val="C5E69A72"/>
@@ -7370,7 +10494,7 @@
       </w:rPr>
     </w:lvl>
   </w:abstractNum>
-  <w:abstractNum w:abstractNumId="21" w15:restartNumberingAfterBreak="0">
+  <w:abstractNum w:abstractNumId="26" w15:restartNumberingAfterBreak="0">
     <w:nsid w:val="44A9496F"/>
     <w:multiLevelType w:val="hybridMultilevel"/>
     <w:tmpl w:val="E2CE8262"/>
@@ -7483,7 +10607,7 @@
       </w:rPr>
     </w:lvl>
   </w:abstractNum>
-  <w:abstractNum w:abstractNumId="22" w15:restartNumberingAfterBreak="0">
+  <w:abstractNum w:abstractNumId="27" w15:restartNumberingAfterBreak="0">
     <w:nsid w:val="493004AE"/>
     <w:multiLevelType w:val="hybridMultilevel"/>
     <w:tmpl w:val="636822A0"/>
@@ -7569,7 +10693,7 @@
       </w:pPr>
     </w:lvl>
   </w:abstractNum>
-  <w:abstractNum w:abstractNumId="23" w15:restartNumberingAfterBreak="0">
+  <w:abstractNum w:abstractNumId="28" w15:restartNumberingAfterBreak="0">
     <w:nsid w:val="4A8F11C9"/>
     <w:multiLevelType w:val="hybridMultilevel"/>
     <w:tmpl w:val="08621260"/>
@@ -7655,7 +10779,7 @@
       </w:pPr>
     </w:lvl>
   </w:abstractNum>
-  <w:abstractNum w:abstractNumId="24" w15:restartNumberingAfterBreak="0">
+  <w:abstractNum w:abstractNumId="29" w15:restartNumberingAfterBreak="0">
     <w:nsid w:val="4B0D7441"/>
     <w:multiLevelType w:val="hybridMultilevel"/>
     <w:tmpl w:val="80606AB2"/>
@@ -7768,7 +10892,7 @@
       </w:rPr>
     </w:lvl>
   </w:abstractNum>
-  <w:abstractNum w:abstractNumId="25" w15:restartNumberingAfterBreak="0">
+  <w:abstractNum w:abstractNumId="30" w15:restartNumberingAfterBreak="0">
     <w:nsid w:val="4ED20252"/>
     <w:multiLevelType w:val="hybridMultilevel"/>
     <w:tmpl w:val="5080C704"/>
@@ -7854,7 +10978,7 @@
       </w:pPr>
     </w:lvl>
   </w:abstractNum>
-  <w:abstractNum w:abstractNumId="26" w15:restartNumberingAfterBreak="0">
+  <w:abstractNum w:abstractNumId="31" w15:restartNumberingAfterBreak="0">
     <w:nsid w:val="4F0B2763"/>
     <w:multiLevelType w:val="hybridMultilevel"/>
     <w:tmpl w:val="6B24D6BE"/>
@@ -7967,7 +11091,7 @@
       </w:rPr>
     </w:lvl>
   </w:abstractNum>
-  <w:abstractNum w:abstractNumId="27" w15:restartNumberingAfterBreak="0">
+  <w:abstractNum w:abstractNumId="32" w15:restartNumberingAfterBreak="0">
     <w:nsid w:val="516669BC"/>
     <w:multiLevelType w:val="hybridMultilevel"/>
     <w:tmpl w:val="606ECE32"/>
@@ -8080,7 +11204,7 @@
       </w:rPr>
     </w:lvl>
   </w:abstractNum>
-  <w:abstractNum w:abstractNumId="28" w15:restartNumberingAfterBreak="0">
+  <w:abstractNum w:abstractNumId="33" w15:restartNumberingAfterBreak="0">
     <w:nsid w:val="533A2A17"/>
     <w:multiLevelType w:val="hybridMultilevel"/>
     <w:tmpl w:val="E932A4B4"/>
@@ -8193,7 +11317,93 @@
       </w:rPr>
     </w:lvl>
   </w:abstractNum>
-  <w:abstractNum w:abstractNumId="29" w15:restartNumberingAfterBreak="0">
+  <w:abstractNum w:abstractNumId="34" w15:restartNumberingAfterBreak="0">
+    <w:nsid w:val="54575B1B"/>
+    <w:multiLevelType w:val="hybridMultilevel"/>
+    <w:tmpl w:val="B9DEE94E"/>
+    <w:lvl w:ilvl="0" w:tplc="4009000F">
+      <w:start w:val="1"/>
+      <w:numFmt w:val="decimal"/>
+      <w:lvlText w:val="%1."/>
+      <w:lvlJc w:val="left"/>
+      <w:pPr>
+        <w:ind w:left="720" w:hanging="360"/>
+      </w:pPr>
+    </w:lvl>
+    <w:lvl w:ilvl="1" w:tplc="40090019" w:tentative="1">
+      <w:start w:val="1"/>
+      <w:numFmt w:val="lowerLetter"/>
+      <w:lvlText w:val="%2."/>
+      <w:lvlJc w:val="left"/>
+      <w:pPr>
+        <w:ind w:left="1440" w:hanging="360"/>
+      </w:pPr>
+    </w:lvl>
+    <w:lvl w:ilvl="2" w:tplc="4009001B" w:tentative="1">
+      <w:start w:val="1"/>
+      <w:numFmt w:val="lowerRoman"/>
+      <w:lvlText w:val="%3."/>
+      <w:lvlJc w:val="right"/>
+      <w:pPr>
+        <w:ind w:left="2160" w:hanging="180"/>
+      </w:pPr>
+    </w:lvl>
+    <w:lvl w:ilvl="3" w:tplc="4009000F" w:tentative="1">
+      <w:start w:val="1"/>
+      <w:numFmt w:val="decimal"/>
+      <w:lvlText w:val="%4."/>
+      <w:lvlJc w:val="left"/>
+      <w:pPr>
+        <w:ind w:left="2880" w:hanging="360"/>
+      </w:pPr>
+    </w:lvl>
+    <w:lvl w:ilvl="4" w:tplc="40090019" w:tentative="1">
+      <w:start w:val="1"/>
+      <w:numFmt w:val="lowerLetter"/>
+      <w:lvlText w:val="%5."/>
+      <w:lvlJc w:val="left"/>
+      <w:pPr>
+        <w:ind w:left="3600" w:hanging="360"/>
+      </w:pPr>
+    </w:lvl>
+    <w:lvl w:ilvl="5" w:tplc="4009001B" w:tentative="1">
+      <w:start w:val="1"/>
+      <w:numFmt w:val="lowerRoman"/>
+      <w:lvlText w:val="%6."/>
+      <w:lvlJc w:val="right"/>
+      <w:pPr>
+        <w:ind w:left="4320" w:hanging="180"/>
+      </w:pPr>
+    </w:lvl>
+    <w:lvl w:ilvl="6" w:tplc="4009000F" w:tentative="1">
+      <w:start w:val="1"/>
+      <w:numFmt w:val="decimal"/>
+      <w:lvlText w:val="%7."/>
+      <w:lvlJc w:val="left"/>
+      <w:pPr>
+        <w:ind w:left="5040" w:hanging="360"/>
+      </w:pPr>
+    </w:lvl>
+    <w:lvl w:ilvl="7" w:tplc="40090019" w:tentative="1">
+      <w:start w:val="1"/>
+      <w:numFmt w:val="lowerLetter"/>
+      <w:lvlText w:val="%8."/>
+      <w:lvlJc w:val="left"/>
+      <w:pPr>
+        <w:ind w:left="5760" w:hanging="360"/>
+      </w:pPr>
+    </w:lvl>
+    <w:lvl w:ilvl="8" w:tplc="4009001B" w:tentative="1">
+      <w:start w:val="1"/>
+      <w:numFmt w:val="lowerRoman"/>
+      <w:lvlText w:val="%9."/>
+      <w:lvlJc w:val="right"/>
+      <w:pPr>
+        <w:ind w:left="6480" w:hanging="180"/>
+      </w:pPr>
+    </w:lvl>
+  </w:abstractNum>
+  <w:abstractNum w:abstractNumId="35" w15:restartNumberingAfterBreak="0">
     <w:nsid w:val="56C46957"/>
     <w:multiLevelType w:val="hybridMultilevel"/>
     <w:tmpl w:val="1D52446E"/>
@@ -8306,7 +11516,7 @@
       </w:rPr>
     </w:lvl>
   </w:abstractNum>
-  <w:abstractNum w:abstractNumId="30" w15:restartNumberingAfterBreak="0">
+  <w:abstractNum w:abstractNumId="36" w15:restartNumberingAfterBreak="0">
     <w:nsid w:val="61374F98"/>
     <w:multiLevelType w:val="hybridMultilevel"/>
     <w:tmpl w:val="6EC269A2"/>
@@ -8419,7 +11629,7 @@
       </w:rPr>
     </w:lvl>
   </w:abstractNum>
-  <w:abstractNum w:abstractNumId="31" w15:restartNumberingAfterBreak="0">
+  <w:abstractNum w:abstractNumId="37" w15:restartNumberingAfterBreak="0">
     <w:nsid w:val="70FC340C"/>
     <w:multiLevelType w:val="hybridMultilevel"/>
     <w:tmpl w:val="D91C80BE"/>
@@ -8505,7 +11715,7 @@
       </w:pPr>
     </w:lvl>
   </w:abstractNum>
-  <w:abstractNum w:abstractNumId="32" w15:restartNumberingAfterBreak="0">
+  <w:abstractNum w:abstractNumId="38" w15:restartNumberingAfterBreak="0">
     <w:nsid w:val="749305D2"/>
     <w:multiLevelType w:val="hybridMultilevel"/>
     <w:tmpl w:val="FAE02A4E"/>
@@ -8618,7 +11828,7 @@
       </w:rPr>
     </w:lvl>
   </w:abstractNum>
-  <w:abstractNum w:abstractNumId="33" w15:restartNumberingAfterBreak="0">
+  <w:abstractNum w:abstractNumId="39" w15:restartNumberingAfterBreak="0">
     <w:nsid w:val="74E66899"/>
     <w:multiLevelType w:val="hybridMultilevel"/>
     <w:tmpl w:val="1EF632D0"/>
@@ -8731,7 +11941,93 @@
       </w:rPr>
     </w:lvl>
   </w:abstractNum>
-  <w:abstractNum w:abstractNumId="34" w15:restartNumberingAfterBreak="0">
+  <w:abstractNum w:abstractNumId="40" w15:restartNumberingAfterBreak="0">
+    <w:nsid w:val="7B5945A4"/>
+    <w:multiLevelType w:val="hybridMultilevel"/>
+    <w:tmpl w:val="E98C4D22"/>
+    <w:lvl w:ilvl="0" w:tplc="4009000F">
+      <w:start w:val="1"/>
+      <w:numFmt w:val="decimal"/>
+      <w:lvlText w:val="%1."/>
+      <w:lvlJc w:val="left"/>
+      <w:pPr>
+        <w:ind w:left="720" w:hanging="360"/>
+      </w:pPr>
+    </w:lvl>
+    <w:lvl w:ilvl="1" w:tplc="40090019" w:tentative="1">
+      <w:start w:val="1"/>
+      <w:numFmt w:val="lowerLetter"/>
+      <w:lvlText w:val="%2."/>
+      <w:lvlJc w:val="left"/>
+      <w:pPr>
+        <w:ind w:left="1440" w:hanging="360"/>
+      </w:pPr>
+    </w:lvl>
+    <w:lvl w:ilvl="2" w:tplc="4009001B" w:tentative="1">
+      <w:start w:val="1"/>
+      <w:numFmt w:val="lowerRoman"/>
+      <w:lvlText w:val="%3."/>
+      <w:lvlJc w:val="right"/>
+      <w:pPr>
+        <w:ind w:left="2160" w:hanging="180"/>
+      </w:pPr>
+    </w:lvl>
+    <w:lvl w:ilvl="3" w:tplc="4009000F" w:tentative="1">
+      <w:start w:val="1"/>
+      <w:numFmt w:val="decimal"/>
+      <w:lvlText w:val="%4."/>
+      <w:lvlJc w:val="left"/>
+      <w:pPr>
+        <w:ind w:left="2880" w:hanging="360"/>
+      </w:pPr>
+    </w:lvl>
+    <w:lvl w:ilvl="4" w:tplc="40090019" w:tentative="1">
+      <w:start w:val="1"/>
+      <w:numFmt w:val="lowerLetter"/>
+      <w:lvlText w:val="%5."/>
+      <w:lvlJc w:val="left"/>
+      <w:pPr>
+        <w:ind w:left="3600" w:hanging="360"/>
+      </w:pPr>
+    </w:lvl>
+    <w:lvl w:ilvl="5" w:tplc="4009001B" w:tentative="1">
+      <w:start w:val="1"/>
+      <w:numFmt w:val="lowerRoman"/>
+      <w:lvlText w:val="%6."/>
+      <w:lvlJc w:val="right"/>
+      <w:pPr>
+        <w:ind w:left="4320" w:hanging="180"/>
+      </w:pPr>
+    </w:lvl>
+    <w:lvl w:ilvl="6" w:tplc="4009000F" w:tentative="1">
+      <w:start w:val="1"/>
+      <w:numFmt w:val="decimal"/>
+      <w:lvlText w:val="%7."/>
+      <w:lvlJc w:val="left"/>
+      <w:pPr>
+        <w:ind w:left="5040" w:hanging="360"/>
+      </w:pPr>
+    </w:lvl>
+    <w:lvl w:ilvl="7" w:tplc="40090019" w:tentative="1">
+      <w:start w:val="1"/>
+      <w:numFmt w:val="lowerLetter"/>
+      <w:lvlText w:val="%8."/>
+      <w:lvlJc w:val="left"/>
+      <w:pPr>
+        <w:ind w:left="5760" w:hanging="360"/>
+      </w:pPr>
+    </w:lvl>
+    <w:lvl w:ilvl="8" w:tplc="4009001B" w:tentative="1">
+      <w:start w:val="1"/>
+      <w:numFmt w:val="lowerRoman"/>
+      <w:lvlText w:val="%9."/>
+      <w:lvlJc w:val="right"/>
+      <w:pPr>
+        <w:ind w:left="6480" w:hanging="180"/>
+      </w:pPr>
+    </w:lvl>
+  </w:abstractNum>
+  <w:abstractNum w:abstractNumId="41" w15:restartNumberingAfterBreak="0">
     <w:nsid w:val="7BFD5BE7"/>
     <w:multiLevelType w:val="hybridMultilevel"/>
     <w:tmpl w:val="F7E81324"/>
@@ -8818,109 +12114,130 @@
     </w:lvl>
   </w:abstractNum>
   <w:num w:numId="1" w16cid:durableId="1540973067">
-    <w:abstractNumId w:val="9"/>
+    <w:abstractNumId w:val="11"/>
   </w:num>
   <w:num w:numId="2" w16cid:durableId="499740590">
-    <w:abstractNumId w:val="14"/>
+    <w:abstractNumId w:val="17"/>
   </w:num>
   <w:num w:numId="3" w16cid:durableId="541132239">
-    <w:abstractNumId w:val="6"/>
+    <w:abstractNumId w:val="8"/>
   </w:num>
   <w:num w:numId="4" w16cid:durableId="568883010">
-    <w:abstractNumId w:val="33"/>
+    <w:abstractNumId w:val="39"/>
   </w:num>
   <w:num w:numId="5" w16cid:durableId="845677584">
-    <w:abstractNumId w:val="11"/>
+    <w:abstractNumId w:val="13"/>
   </w:num>
   <w:num w:numId="6" w16cid:durableId="1637027404">
-    <w:abstractNumId w:val="12"/>
+    <w:abstractNumId w:val="15"/>
   </w:num>
   <w:num w:numId="7" w16cid:durableId="1472675406">
     <w:abstractNumId w:val="1"/>
   </w:num>
   <w:num w:numId="8" w16cid:durableId="200286158">
-    <w:abstractNumId w:val="23"/>
+    <w:abstractNumId w:val="28"/>
   </w:num>
   <w:num w:numId="9" w16cid:durableId="1176503610">
-    <w:abstractNumId w:val="20"/>
+    <w:abstractNumId w:val="25"/>
   </w:num>
   <w:num w:numId="10" w16cid:durableId="1796833049">
-    <w:abstractNumId w:val="19"/>
+    <w:abstractNumId w:val="24"/>
   </w:num>
   <w:num w:numId="11" w16cid:durableId="1996957847">
-    <w:abstractNumId w:val="29"/>
+    <w:abstractNumId w:val="35"/>
   </w:num>
   <w:num w:numId="12" w16cid:durableId="2063482358">
-    <w:abstractNumId w:val="25"/>
+    <w:abstractNumId w:val="30"/>
   </w:num>
   <w:num w:numId="13" w16cid:durableId="1546021224">
     <w:abstractNumId w:val="2"/>
   </w:num>
   <w:num w:numId="14" w16cid:durableId="222566674">
-    <w:abstractNumId w:val="32"/>
+    <w:abstractNumId w:val="38"/>
   </w:num>
   <w:num w:numId="15" w16cid:durableId="1727487960">
-    <w:abstractNumId w:val="13"/>
+    <w:abstractNumId w:val="16"/>
   </w:num>
   <w:num w:numId="16" w16cid:durableId="444738084">
-    <w:abstractNumId w:val="31"/>
+    <w:abstractNumId w:val="37"/>
   </w:num>
   <w:num w:numId="17" w16cid:durableId="1318805403">
     <w:abstractNumId w:val="0"/>
   </w:num>
   <w:num w:numId="18" w16cid:durableId="1115296937">
+    <w:abstractNumId w:val="31"/>
+  </w:num>
+  <w:num w:numId="19" w16cid:durableId="968587252">
+    <w:abstractNumId w:val="12"/>
+  </w:num>
+  <w:num w:numId="20" w16cid:durableId="1912739065">
+    <w:abstractNumId w:val="32"/>
+  </w:num>
+  <w:num w:numId="21" w16cid:durableId="1010789758">
+    <w:abstractNumId w:val="33"/>
+  </w:num>
+  <w:num w:numId="22" w16cid:durableId="129137299">
+    <w:abstractNumId w:val="23"/>
+  </w:num>
+  <w:num w:numId="23" w16cid:durableId="171720229">
+    <w:abstractNumId w:val="36"/>
+  </w:num>
+  <w:num w:numId="24" w16cid:durableId="1035621125">
+    <w:abstractNumId w:val="19"/>
+  </w:num>
+  <w:num w:numId="25" w16cid:durableId="1597206483">
     <w:abstractNumId w:val="26"/>
   </w:num>
-  <w:num w:numId="19" w16cid:durableId="968587252">
+  <w:num w:numId="26" w16cid:durableId="1486238112">
     <w:abstractNumId w:val="10"/>
   </w:num>
-  <w:num w:numId="20" w16cid:durableId="1912739065">
+  <w:num w:numId="27" w16cid:durableId="1873151886">
+    <w:abstractNumId w:val="7"/>
+  </w:num>
+  <w:num w:numId="28" w16cid:durableId="454952784">
+    <w:abstractNumId w:val="29"/>
+  </w:num>
+  <w:num w:numId="29" w16cid:durableId="1457530685">
+    <w:abstractNumId w:val="5"/>
+  </w:num>
+  <w:num w:numId="30" w16cid:durableId="451821470">
     <w:abstractNumId w:val="27"/>
   </w:num>
-  <w:num w:numId="21" w16cid:durableId="1010789758">
-    <w:abstractNumId w:val="28"/>
+  <w:num w:numId="31" w16cid:durableId="839076228">
+    <w:abstractNumId w:val="9"/>
   </w:num>
-  <w:num w:numId="22" w16cid:durableId="129137299">
+  <w:num w:numId="32" w16cid:durableId="617685457">
+    <w:abstractNumId w:val="6"/>
+  </w:num>
+  <w:num w:numId="33" w16cid:durableId="901405144">
+    <w:abstractNumId w:val="41"/>
+  </w:num>
+  <w:num w:numId="34" w16cid:durableId="962734310">
+    <w:abstractNumId w:val="20"/>
+  </w:num>
+  <w:num w:numId="35" w16cid:durableId="1098015298">
+    <w:abstractNumId w:val="21"/>
+  </w:num>
+  <w:num w:numId="36" w16cid:durableId="1380471266">
+    <w:abstractNumId w:val="4"/>
+  </w:num>
+  <w:num w:numId="37" w16cid:durableId="327055515">
     <w:abstractNumId w:val="18"/>
   </w:num>
-  <w:num w:numId="23" w16cid:durableId="171720229">
-    <w:abstractNumId w:val="30"/>
+  <w:num w:numId="38" w16cid:durableId="2126995001">
+    <w:abstractNumId w:val="40"/>
   </w:num>
-  <w:num w:numId="24" w16cid:durableId="1035621125">
-    <w:abstractNumId w:val="15"/>
+  <w:num w:numId="39" w16cid:durableId="1577664898">
+    <w:abstractNumId w:val="34"/>
   </w:num>
-  <w:num w:numId="25" w16cid:durableId="1597206483">
-    <w:abstractNumId w:val="21"/>
-  </w:num>
-  <w:num w:numId="26" w16cid:durableId="1486238112">
-    <w:abstractNumId w:val="8"/>
-  </w:num>
-  <w:num w:numId="27" w16cid:durableId="1873151886">
-    <w:abstractNumId w:val="5"/>
-  </w:num>
-  <w:num w:numId="28" w16cid:durableId="454952784">
-    <w:abstractNumId w:val="24"/>
-  </w:num>
-  <w:num w:numId="29" w16cid:durableId="1457530685">
+  <w:num w:numId="40" w16cid:durableId="241839119">
     <w:abstractNumId w:val="3"/>
   </w:num>
-  <w:num w:numId="30" w16cid:durableId="451821470">
+  <w:num w:numId="41" w16cid:durableId="707879319">
     <w:abstractNumId w:val="22"/>
   </w:num>
-  <w:num w:numId="31" w16cid:durableId="839076228">
-    <w:abstractNumId w:val="7"/>
-  </w:num>
-  <w:num w:numId="32" w16cid:durableId="617685457">
-    <w:abstractNumId w:val="4"/>
-  </w:num>
-  <w:num w:numId="33" w16cid:durableId="901405144">
-    <w:abstractNumId w:val="34"/>
-  </w:num>
-  <w:num w:numId="34" w16cid:durableId="962734310">
-    <w:abstractNumId w:val="16"/>
-  </w:num>
-  <w:num w:numId="35" w16cid:durableId="1098015298">
-    <w:abstractNumId w:val="17"/>
+  <w:num w:numId="42" w16cid:durableId="1666206902">
+    <w:abstractNumId w:val="14"/>
   </w:num>
 </w:numbering>
 </file>
@@ -9528,6 +12845,7 @@
   <w:style w:type="character" w:default="1" w:styleId="DefaultParagraphFont">
     <w:name w:val="Default Paragraph Font"/>
     <w:uiPriority w:val="1"/>
+    <w:semiHidden/>
     <w:unhideWhenUsed/>
   </w:style>
   <w:style w:type="table" w:default="1" w:styleId="TableNormal">

</xml_diff>

<commit_message>
Elevate FMCG equity valuation assignment: integrate market-implied growth g*, multi-firm sensitivity, and academic references
</commit_message>
<xml_diff>
--- a/Global Financial Management/notes (GFM).docx
+++ b/Global Financial Management/notes (GFM).docx
@@ -879,15 +879,7 @@
         </w:numPr>
       </w:pPr>
       <w:r>
-        <w:t xml:space="preserve">Initiate to cut the </w:t>
-      </w:r>
-      <w:proofErr w:type="spellStart"/>
-      <w:r>
-        <w:t>green house</w:t>
-      </w:r>
-      <w:proofErr w:type="spellEnd"/>
-      <w:r>
-        <w:t xml:space="preserve"> effect </w:t>
+        <w:t xml:space="preserve">Initiate to cut the green house effect </w:t>
       </w:r>
     </w:p>
     <w:p>
@@ -1581,15 +1573,7 @@
         </w:numPr>
       </w:pPr>
       <w:r>
-        <w:t xml:space="preserve">Acquisition or disposal of </w:t>
-      </w:r>
-      <w:proofErr w:type="spellStart"/>
-      <w:r>
-        <w:t>non produced</w:t>
-      </w:r>
-      <w:proofErr w:type="spellEnd"/>
-      <w:r>
-        <w:t xml:space="preserve"> assets </w:t>
+        <w:t xml:space="preserve">Acquisition or disposal of non produced assets </w:t>
       </w:r>
     </w:p>
     <w:p>
@@ -1864,13 +1848,8 @@
         </w:numPr>
       </w:pPr>
       <w:r>
-        <w:t xml:space="preserve">Major functions of </w:t>
-      </w:r>
-      <w:proofErr w:type="spellStart"/>
-      <w:r>
-        <w:t>imf</w:t>
-      </w:r>
-      <w:proofErr w:type="spellEnd"/>
+        <w:t>Major functions of imf</w:t>
+      </w:r>
     </w:p>
     <w:p>
       <w:pPr>
@@ -1880,13 +1859,8 @@
           <w:numId w:val="10"/>
         </w:numPr>
       </w:pPr>
-      <w:proofErr w:type="spellStart"/>
-      <w:r>
-        <w:t>Surveylance</w:t>
-      </w:r>
-      <w:proofErr w:type="spellEnd"/>
-      <w:r>
-        <w:t>, lending, capacity building</w:t>
+      <w:r>
+        <w:t>Surveylance, lending, capacity building</w:t>
       </w:r>
     </w:p>
     <w:p>
@@ -2602,15 +2576,7 @@
         </w:numPr>
       </w:pPr>
       <w:r>
-        <w:t>Support infrastructure development (</w:t>
-      </w:r>
-      <w:proofErr w:type="spellStart"/>
-      <w:r>
-        <w:t>eg.</w:t>
-      </w:r>
-      <w:proofErr w:type="spellEnd"/>
-      <w:r>
-        <w:t xml:space="preserve"> Transport, energy)</w:t>
+        <w:t>Support infrastructure development (eg. Transport, energy)</w:t>
       </w:r>
     </w:p>
     <w:p>
@@ -2777,22 +2743,8 @@
                 <w:lang w:eastAsia="en-IN"/>
                 <w14:ligatures w14:val="none"/>
               </w:rPr>
-              <w:t xml:space="preserve">regional </w:t>
+              <w:t>regional instituition</w:t>
             </w:r>
-            <w:proofErr w:type="spellStart"/>
-            <w:r>
-              <w:rPr>
-                <w:rFonts w:ascii="Calibri" w:eastAsia="Times New Roman" w:hAnsi="Calibri" w:cs="Calibri"/>
-                <w:color w:val="000000"/>
-                <w:kern w:val="0"/>
-                <w:sz w:val="22"/>
-                <w:szCs w:val="22"/>
-                <w:lang w:eastAsia="en-IN"/>
-                <w14:ligatures w14:val="none"/>
-              </w:rPr>
-              <w:t>instituition</w:t>
-            </w:r>
-            <w:proofErr w:type="spellEnd"/>
           </w:p>
         </w:tc>
         <w:tc>
@@ -2814,22 +2766,8 @@
                 <w:lang w:eastAsia="en-IN"/>
                 <w14:ligatures w14:val="none"/>
               </w:rPr>
-              <w:t xml:space="preserve">global </w:t>
+              <w:t>global instituition</w:t>
             </w:r>
-            <w:proofErr w:type="spellStart"/>
-            <w:r>
-              <w:rPr>
-                <w:rFonts w:ascii="Calibri" w:eastAsia="Times New Roman" w:hAnsi="Calibri" w:cs="Calibri"/>
-                <w:color w:val="000000"/>
-                <w:kern w:val="0"/>
-                <w:sz w:val="22"/>
-                <w:szCs w:val="22"/>
-                <w:lang w:eastAsia="en-IN"/>
-                <w14:ligatures w14:val="none"/>
-              </w:rPr>
-              <w:t>instituition</w:t>
-            </w:r>
-            <w:proofErr w:type="spellEnd"/>
           </w:p>
         </w:tc>
       </w:tr>
@@ -2897,33 +2835,7 @@
                 <w:lang w:eastAsia="en-IN"/>
                 <w14:ligatures w14:val="none"/>
               </w:rPr>
-              <w:t xml:space="preserve">support BOP difficulties and macros economic </w:t>
-            </w:r>
-            <w:proofErr w:type="spellStart"/>
-            <w:r>
-              <w:rPr>
-                <w:rFonts w:ascii="Calibri" w:eastAsia="Times New Roman" w:hAnsi="Calibri" w:cs="Calibri"/>
-                <w:color w:val="000000"/>
-                <w:kern w:val="0"/>
-                <w:sz w:val="22"/>
-                <w:szCs w:val="22"/>
-                <w:lang w:eastAsia="en-IN"/>
-                <w14:ligatures w14:val="none"/>
-              </w:rPr>
-              <w:t>stablility</w:t>
-            </w:r>
-            <w:proofErr w:type="spellEnd"/>
-            <w:r>
-              <w:rPr>
-                <w:rFonts w:ascii="Calibri" w:eastAsia="Times New Roman" w:hAnsi="Calibri" w:cs="Calibri"/>
-                <w:color w:val="000000"/>
-                <w:kern w:val="0"/>
-                <w:sz w:val="22"/>
-                <w:szCs w:val="22"/>
-                <w:lang w:eastAsia="en-IN"/>
-                <w14:ligatures w14:val="none"/>
-              </w:rPr>
-              <w:t xml:space="preserve"> </w:t>
+              <w:t xml:space="preserve">support BOP difficulties and macros economic stablility </w:t>
             </w:r>
           </w:p>
         </w:tc>
@@ -3410,15 +3322,7 @@
         </w:numPr>
       </w:pPr>
       <w:r>
-        <w:t xml:space="preserve">tariff and </w:t>
-      </w:r>
-      <w:proofErr w:type="spellStart"/>
-      <w:r>
-        <w:t>non tariff</w:t>
-      </w:r>
-      <w:proofErr w:type="spellEnd"/>
-      <w:r>
-        <w:t xml:space="preserve"> barriers</w:t>
+        <w:t>tariff and non tariff barriers</w:t>
       </w:r>
     </w:p>
     <w:p>
@@ -3492,13 +3396,8 @@
           <w:numId w:val="23"/>
         </w:numPr>
       </w:pPr>
-      <w:proofErr w:type="spellStart"/>
-      <w:r>
-        <w:t>interactual</w:t>
-      </w:r>
-      <w:proofErr w:type="spellEnd"/>
-      <w:r>
-        <w:t xml:space="preserve"> property rights (IPR)</w:t>
+      <w:r>
+        <w:t>interactual property rights (IPR)</w:t>
       </w:r>
     </w:p>
     <w:p>
@@ -3678,15 +3577,7 @@
     </w:p>
     <w:p>
       <w:r>
-        <w:t xml:space="preserve">Foreign exchange market is the market </w:t>
-      </w:r>
-      <w:proofErr w:type="spellStart"/>
-      <w:r>
-        <w:t>market</w:t>
-      </w:r>
-      <w:proofErr w:type="spellEnd"/>
-      <w:r>
-        <w:t xml:space="preserve"> where the currency of one country is exchanged for another country’s currency</w:t>
+        <w:t>Foreign exchange market is the market market where the currency of one country is exchanged for another country’s currency</w:t>
       </w:r>
     </w:p>
     <w:p/>
@@ -3843,15 +3734,7 @@
         <w:ind w:left="360"/>
       </w:pPr>
       <w:r>
-        <w:t xml:space="preserve">1. direct quotation – so many units of foreign currency as equivalent to a fixed number of units of home currency. Eg in </w:t>
-      </w:r>
-      <w:proofErr w:type="spellStart"/>
-      <w:r>
-        <w:t>india</w:t>
-      </w:r>
-      <w:proofErr w:type="spellEnd"/>
-      <w:r>
-        <w:t xml:space="preserve"> 95.88 INR = 1 USD (is a direct quotation for USD in India)</w:t>
+        <w:t>1. direct quotation – so many units of foreign currency as equivalent to a fixed number of units of home currency. Eg in india 95.88 INR = 1 USD (is a direct quotation for USD in India)</w:t>
       </w:r>
       <w:r>
         <w:t xml:space="preserve"> </w:t>
@@ -4032,19 +3915,11 @@
           <w:rFonts w:eastAsiaTheme="minorEastAsia"/>
         </w:rPr>
       </w:pPr>
-      <w:proofErr w:type="spellStart"/>
-      <w:r>
-        <w:rPr>
-          <w:rFonts w:eastAsiaTheme="minorEastAsia"/>
-        </w:rPr>
-        <w:t>Eg.</w:t>
-      </w:r>
-      <w:proofErr w:type="spellEnd"/>
-      <w:r>
-        <w:rPr>
-          <w:rFonts w:eastAsiaTheme="minorEastAsia"/>
-        </w:rPr>
-        <w:t xml:space="preserve"> USD for EUR, JPY/CNY </w:t>
+      <w:r>
+        <w:rPr>
+          <w:rFonts w:eastAsiaTheme="minorEastAsia"/>
+        </w:rPr>
+        <w:t xml:space="preserve">Eg. USD for EUR, JPY/CNY </w:t>
       </w:r>
     </w:p>
     <w:p>
@@ -4281,21 +4156,7 @@
         <w:rPr>
           <w:rFonts w:eastAsiaTheme="minorEastAsia"/>
         </w:rPr>
-        <w:t xml:space="preserve">Communications network for international </w:t>
-      </w:r>
-      <w:proofErr w:type="spellStart"/>
-      <w:r>
-        <w:rPr>
-          <w:rFonts w:eastAsiaTheme="minorEastAsia"/>
-        </w:rPr>
-        <w:t>finciacial</w:t>
-      </w:r>
-      <w:proofErr w:type="spellEnd"/>
-      <w:r>
-        <w:rPr>
-          <w:rFonts w:eastAsiaTheme="minorEastAsia"/>
-        </w:rPr>
-        <w:t xml:space="preserve"> market transaction</w:t>
+        <w:t>Communications network for international finciacial market transaction</w:t>
       </w:r>
     </w:p>
     <w:p>
@@ -4417,21 +4278,7 @@
         <w:rPr>
           <w:rFonts w:eastAsiaTheme="minorEastAsia"/>
         </w:rPr>
-        <w:t xml:space="preserve">In </w:t>
-      </w:r>
-      <w:proofErr w:type="spellStart"/>
-      <w:r>
-        <w:rPr>
-          <w:rFonts w:eastAsiaTheme="minorEastAsia"/>
-        </w:rPr>
-        <w:t>india</w:t>
-      </w:r>
-      <w:proofErr w:type="spellEnd"/>
-      <w:r>
-        <w:rPr>
-          <w:rFonts w:eastAsiaTheme="minorEastAsia"/>
-        </w:rPr>
-        <w:t xml:space="preserve"> regional processing centre is situated in Mumbai</w:t>
+        <w:t>In india regional processing centre is situated in Mumbai</w:t>
       </w:r>
     </w:p>
     <w:p>
@@ -4487,21 +4334,7 @@
         <w:rPr>
           <w:rFonts w:eastAsiaTheme="minorEastAsia"/>
         </w:rPr>
-        <w:t xml:space="preserve">Provide reliable method of sending and </w:t>
-      </w:r>
-      <w:proofErr w:type="spellStart"/>
-      <w:r>
-        <w:rPr>
-          <w:rFonts w:eastAsiaTheme="minorEastAsia"/>
-        </w:rPr>
-        <w:t>receing</w:t>
-      </w:r>
-      <w:proofErr w:type="spellEnd"/>
-      <w:r>
-        <w:rPr>
-          <w:rFonts w:eastAsiaTheme="minorEastAsia"/>
-        </w:rPr>
-        <w:t xml:space="preserve"> messages form of vast number of locations </w:t>
+        <w:t xml:space="preserve">Provide reliable method of sending and receing messages form of vast number of locations </w:t>
       </w:r>
     </w:p>
     <w:p>
@@ -4533,53 +4366,31 @@
           <w:rFonts w:eastAsiaTheme="minorEastAsia"/>
         </w:rPr>
       </w:pPr>
-      <w:proofErr w:type="spellStart"/>
-      <w:r>
-        <w:rPr>
-          <w:rFonts w:eastAsiaTheme="minorEastAsia"/>
-        </w:rPr>
-        <w:t>Enalbling</w:t>
-      </w:r>
-      <w:proofErr w:type="spellEnd"/>
-      <w:r>
-        <w:rPr>
-          <w:rFonts w:eastAsiaTheme="minorEastAsia"/>
-        </w:rPr>
-        <w:t xml:space="preserve"> the counter party to respond immediately</w:t>
-      </w:r>
-    </w:p>
-    <w:p>
-      <w:pPr>
-        <w:rPr>
-          <w:rFonts w:eastAsiaTheme="minorEastAsia"/>
-        </w:rPr>
-      </w:pPr>
-    </w:p>
-    <w:p>
-      <w:pPr>
-        <w:rPr>
-          <w:rFonts w:eastAsiaTheme="minorEastAsia"/>
-        </w:rPr>
-      </w:pPr>
-      <w:r>
-        <w:rPr>
-          <w:rFonts w:eastAsiaTheme="minorEastAsia"/>
-        </w:rPr>
-        <w:t xml:space="preserve">CHIPS – clearing house </w:t>
-      </w:r>
-      <w:proofErr w:type="spellStart"/>
-      <w:r>
-        <w:rPr>
-          <w:rFonts w:eastAsiaTheme="minorEastAsia"/>
-        </w:rPr>
-        <w:t>inter bank</w:t>
-      </w:r>
-      <w:proofErr w:type="spellEnd"/>
-      <w:r>
-        <w:rPr>
-          <w:rFonts w:eastAsiaTheme="minorEastAsia"/>
-        </w:rPr>
-        <w:t xml:space="preserve"> payment system</w:t>
+      <w:r>
+        <w:rPr>
+          <w:rFonts w:eastAsiaTheme="minorEastAsia"/>
+        </w:rPr>
+        <w:t>Enalbling the counter party to respond immediately</w:t>
+      </w:r>
+    </w:p>
+    <w:p>
+      <w:pPr>
+        <w:rPr>
+          <w:rFonts w:eastAsiaTheme="minorEastAsia"/>
+        </w:rPr>
+      </w:pPr>
+    </w:p>
+    <w:p>
+      <w:pPr>
+        <w:rPr>
+          <w:rFonts w:eastAsiaTheme="minorEastAsia"/>
+        </w:rPr>
+      </w:pPr>
+      <w:r>
+        <w:rPr>
+          <w:rFonts w:eastAsiaTheme="minorEastAsia"/>
+        </w:rPr>
+        <w:t>CHIPS – clearing house inter bank payment system</w:t>
       </w:r>
     </w:p>
     <w:p>
@@ -4620,21 +4431,7 @@
         <w:rPr>
           <w:rFonts w:eastAsiaTheme="minorEastAsia"/>
         </w:rPr>
-        <w:t xml:space="preserve"> </w:t>
-      </w:r>
-      <w:proofErr w:type="spellStart"/>
-      <w:r>
-        <w:rPr>
-          <w:rFonts w:eastAsiaTheme="minorEastAsia"/>
-        </w:rPr>
-        <w:t>transations</w:t>
-      </w:r>
-      <w:proofErr w:type="spellEnd"/>
-      <w:r>
-        <w:rPr>
-          <w:rFonts w:eastAsiaTheme="minorEastAsia"/>
-        </w:rPr>
-        <w:t xml:space="preserve"> are settled in CHIPS</w:t>
+        <w:t xml:space="preserve"> transations are settled in CHIPS</w:t>
       </w:r>
     </w:p>
     <w:p>
@@ -4852,19 +4649,11 @@
           <w:rFonts w:eastAsiaTheme="minorEastAsia"/>
         </w:rPr>
       </w:pPr>
-      <w:proofErr w:type="spellStart"/>
-      <w:r>
-        <w:rPr>
-          <w:rFonts w:eastAsiaTheme="minorEastAsia"/>
-        </w:rPr>
-        <w:t>Eg.</w:t>
-      </w:r>
-      <w:proofErr w:type="spellEnd"/>
-      <w:r>
-        <w:rPr>
-          <w:rFonts w:eastAsiaTheme="minorEastAsia"/>
-        </w:rPr>
-        <w:t xml:space="preserve"> 1 USD = 95.1525 INR</w:t>
+      <w:r>
+        <w:rPr>
+          <w:rFonts w:eastAsiaTheme="minorEastAsia"/>
+        </w:rPr>
+        <w:t>Eg. 1 USD = 95.1525 INR</w:t>
       </w:r>
     </w:p>
     <w:p>
@@ -5131,21 +4920,7 @@
         <w:rPr>
           <w:rFonts w:eastAsiaTheme="minorEastAsia"/>
         </w:rPr>
-        <w:t xml:space="preserve">The item </w:t>
-      </w:r>
-      <w:proofErr w:type="spellStart"/>
-      <w:r>
-        <w:rPr>
-          <w:rFonts w:eastAsiaTheme="minorEastAsia"/>
-        </w:rPr>
-        <w:t>refered</w:t>
-      </w:r>
-      <w:proofErr w:type="spellEnd"/>
-      <w:r>
-        <w:rPr>
-          <w:rFonts w:eastAsiaTheme="minorEastAsia"/>
-        </w:rPr>
-        <w:t xml:space="preserve"> to is foreign currencies </w:t>
+        <w:t xml:space="preserve">The item refered to is foreign currencies </w:t>
       </w:r>
     </w:p>
     <w:p>
@@ -5998,21 +5773,7 @@
         <w:rPr>
           <w:rFonts w:eastAsiaTheme="minorEastAsia"/>
         </w:rPr>
-        <w:t xml:space="preserve">Two types of buying rates in </w:t>
-      </w:r>
-      <w:proofErr w:type="spellStart"/>
-      <w:r>
-        <w:rPr>
-          <w:rFonts w:eastAsiaTheme="minorEastAsia"/>
-        </w:rPr>
-        <w:t>india</w:t>
-      </w:r>
-      <w:proofErr w:type="spellEnd"/>
-      <w:r>
-        <w:rPr>
-          <w:rFonts w:eastAsiaTheme="minorEastAsia"/>
-        </w:rPr>
-        <w:t xml:space="preserve">, namely: </w:t>
+        <w:t xml:space="preserve">Two types of buying rates in india, namely: </w:t>
       </w:r>
     </w:p>
     <w:p>
@@ -6267,21 +6028,7 @@
         <w:rPr>
           <w:rFonts w:eastAsiaTheme="minorEastAsia"/>
         </w:rPr>
-        <w:t xml:space="preserve"> September you will receive a mail transfer </w:t>
-      </w:r>
-      <w:proofErr w:type="spellStart"/>
-      <w:r>
-        <w:rPr>
-          <w:rFonts w:eastAsiaTheme="minorEastAsia"/>
-        </w:rPr>
-        <w:t>form</w:t>
-      </w:r>
-      <w:proofErr w:type="spellEnd"/>
-      <w:r>
-        <w:rPr>
-          <w:rFonts w:eastAsiaTheme="minorEastAsia"/>
-        </w:rPr>
-        <w:t xml:space="preserve"> </w:t>
+        <w:t xml:space="preserve"> September you will receive a mail transfer form </w:t>
       </w:r>
       <w:proofErr w:type="gramStart"/>
       <w:r>
@@ -7165,62 +6912,20 @@
         <w:rPr>
           <w:rFonts w:eastAsiaTheme="minorEastAsia"/>
         </w:rPr>
-        <w:t xml:space="preserve">Premium: where the forward margin for a month is giving ascending order as in quotation. </w:t>
-      </w:r>
-      <w:proofErr w:type="spellStart"/>
-      <w:r>
-        <w:rPr>
-          <w:rFonts w:eastAsiaTheme="minorEastAsia"/>
-        </w:rPr>
-        <w:t>Eg.</w:t>
-      </w:r>
-      <w:proofErr w:type="spellEnd"/>
-      <w:r>
-        <w:rPr>
-          <w:rFonts w:eastAsiaTheme="minorEastAsia"/>
-        </w:rPr>
-        <w:t xml:space="preserve"> SPOT GBP  = 95.4000, SPOT/May = 95.6000, SPOT/June = 95.7500</w:t>
-      </w:r>
-    </w:p>
-    <w:p>
-      <w:pPr>
-        <w:rPr>
-          <w:rFonts w:eastAsiaTheme="minorEastAsia"/>
-        </w:rPr>
-      </w:pPr>
-      <w:r>
-        <w:rPr>
-          <w:rFonts w:eastAsiaTheme="minorEastAsia"/>
-        </w:rPr>
-        <w:t xml:space="preserve">Discount: where the forward margin for a month is giving </w:t>
-      </w:r>
-      <w:proofErr w:type="spellStart"/>
-      <w:r>
-        <w:rPr>
-          <w:rFonts w:eastAsiaTheme="minorEastAsia"/>
-        </w:rPr>
-        <w:t>desceding</w:t>
-      </w:r>
-      <w:proofErr w:type="spellEnd"/>
-      <w:r>
-        <w:rPr>
-          <w:rFonts w:eastAsiaTheme="minorEastAsia"/>
-        </w:rPr>
-        <w:t xml:space="preserve"> order as in the quotation. </w:t>
-      </w:r>
-      <w:proofErr w:type="spellStart"/>
-      <w:r>
-        <w:rPr>
-          <w:rFonts w:eastAsiaTheme="minorEastAsia"/>
-        </w:rPr>
-        <w:t>Eg.</w:t>
-      </w:r>
-      <w:proofErr w:type="spellEnd"/>
-      <w:r>
-        <w:rPr>
-          <w:rFonts w:eastAsiaTheme="minorEastAsia"/>
-        </w:rPr>
-        <w:t xml:space="preserve"> SPOT</w:t>
+        <w:t>Premium: where the forward margin for a month is giving ascending order as in quotation. Eg. SPOT GBP  = 95.4000, SPOT/May = 95.6000, SPOT/June = 95.7500</w:t>
+      </w:r>
+    </w:p>
+    <w:p>
+      <w:pPr>
+        <w:rPr>
+          <w:rFonts w:eastAsiaTheme="minorEastAsia"/>
+        </w:rPr>
+      </w:pPr>
+      <w:r>
+        <w:rPr>
+          <w:rFonts w:eastAsiaTheme="minorEastAsia"/>
+        </w:rPr>
+        <w:t>Discount: where the forward margin for a month is giving desceding order as in the quotation. Eg. SPOT</w:t>
       </w:r>
       <w:r>
         <w:rPr>
@@ -7861,35 +7566,7 @@
         <w:rPr>
           <w:rFonts w:eastAsiaTheme="minorEastAsia"/>
         </w:rPr>
-        <w:t xml:space="preserve">The exchange rates for other currencies (foreign currency) are quoted to customers based on the rates for the currency prevailing in internation foreign exchange markets, like London, Singapore and </w:t>
-      </w:r>
-      <w:proofErr w:type="spellStart"/>
-      <w:r>
-        <w:rPr>
-          <w:rFonts w:eastAsiaTheme="minorEastAsia"/>
-        </w:rPr>
-        <w:t>hong</w:t>
-      </w:r>
-      <w:proofErr w:type="spellEnd"/>
-      <w:r>
-        <w:rPr>
-          <w:rFonts w:eastAsiaTheme="minorEastAsia"/>
-        </w:rPr>
-        <w:t xml:space="preserve"> </w:t>
-      </w:r>
-      <w:proofErr w:type="spellStart"/>
-      <w:r>
-        <w:rPr>
-          <w:rFonts w:eastAsiaTheme="minorEastAsia"/>
-        </w:rPr>
-        <w:t>kong</w:t>
-      </w:r>
-      <w:proofErr w:type="spellEnd"/>
-      <w:r>
-        <w:rPr>
-          <w:rFonts w:eastAsiaTheme="minorEastAsia"/>
-        </w:rPr>
-        <w:t xml:space="preserve">. </w:t>
+        <w:t xml:space="preserve">The exchange rates for other currencies (foreign currency) are quoted to customers based on the rates for the currency prevailing in internation foreign exchange markets, like London, Singapore and hong kong. </w:t>
       </w:r>
     </w:p>
     <w:p>
@@ -8435,10 +8112,10 @@
           <w:noProof/>
         </w:rPr>
         <w:drawing>
-          <wp:inline distT="0" distB="0" distL="0" distR="0" wp14:anchorId="327642F5" wp14:editId="1413FAED">
-            <wp:extent cx="5731510" cy="1889760"/>
+          <wp:inline distT="0" distB="0" distL="0" distR="0" wp14:anchorId="33FA32EF" wp14:editId="274F394F">
+            <wp:extent cx="5731510" cy="2528570"/>
             <wp:effectExtent l="0" t="0" r="0" b="0"/>
-            <wp:docPr id="301799878" name="Picture 1"/>
+            <wp:docPr id="1997181951" name="Picture 4"/>
             <wp:cNvGraphicFramePr>
               <a:graphicFrameLocks xmlns:a="http://schemas.openxmlformats.org/drawingml/2006/main" noChangeAspect="1"/>
             </wp:cNvGraphicFramePr>
@@ -8446,7 +8123,7 @@
               <a:graphicData uri="http://schemas.openxmlformats.org/drawingml/2006/picture">
                 <pic:pic xmlns:pic="http://schemas.openxmlformats.org/drawingml/2006/picture">
                   <pic:nvPicPr>
-                    <pic:cNvPr id="0" name="Picture 1"/>
+                    <pic:cNvPr id="0" name="Picture 4"/>
                     <pic:cNvPicPr>
                       <a:picLocks noChangeAspect="1" noChangeArrowheads="1"/>
                     </pic:cNvPicPr>
@@ -8467,7 +8144,7 @@
                   <pic:spPr bwMode="auto">
                     <a:xfrm>
                       <a:off x="0" y="0"/>
-                      <a:ext cx="5731510" cy="1889760"/>
+                      <a:ext cx="5731510" cy="2528570"/>
                     </a:xfrm>
                     <a:prstGeom prst="rect">
                       <a:avLst/>
@@ -8490,26 +8167,6 @@
           <w:rFonts w:eastAsiaTheme="minorEastAsia"/>
         </w:rPr>
       </w:pPr>
-      <w:r>
-        <w:rPr>
-          <w:rFonts w:eastAsiaTheme="minorEastAsia"/>
-        </w:rPr>
-        <w:t>Amount received by the customer on cancellation of DD for 50,000 CAD and 65.6952 INR (50,000 x 65.695) = 32,84,760</w:t>
-      </w:r>
-    </w:p>
-    <w:p>
-      <w:pPr>
-        <w:rPr>
-          <w:rFonts w:eastAsiaTheme="minorEastAsia"/>
-        </w:rPr>
-      </w:pPr>
-    </w:p>
-    <w:p>
-      <w:pPr>
-        <w:rPr>
-          <w:rFonts w:eastAsiaTheme="minorEastAsia"/>
-        </w:rPr>
-      </w:pPr>
     </w:p>
     <w:p>
       <w:pPr>
@@ -8589,10 +8246,10 @@
         </w:rPr>
         <w:lastRenderedPageBreak/>
         <w:drawing>
-          <wp:inline distT="0" distB="0" distL="0" distR="0" wp14:anchorId="3D339F55" wp14:editId="52175D88">
-            <wp:extent cx="5731510" cy="2249805"/>
+          <wp:inline distT="0" distB="0" distL="0" distR="0" wp14:anchorId="574EDB8A" wp14:editId="321196F7">
+            <wp:extent cx="5731510" cy="2348230"/>
             <wp:effectExtent l="0" t="0" r="0" b="0"/>
-            <wp:docPr id="1148572867" name="Picture 1"/>
+            <wp:docPr id="1973711452" name="Picture 3"/>
             <wp:cNvGraphicFramePr>
               <a:graphicFrameLocks xmlns:a="http://schemas.openxmlformats.org/drawingml/2006/main" noChangeAspect="1"/>
             </wp:cNvGraphicFramePr>
@@ -8600,7 +8257,7 @@
               <a:graphicData uri="http://schemas.openxmlformats.org/drawingml/2006/picture">
                 <pic:pic xmlns:pic="http://schemas.openxmlformats.org/drawingml/2006/picture">
                   <pic:nvPicPr>
-                    <pic:cNvPr id="0" name="Picture 1"/>
+                    <pic:cNvPr id="0" name="Picture 3"/>
                     <pic:cNvPicPr>
                       <a:picLocks noChangeAspect="1" noChangeArrowheads="1"/>
                     </pic:cNvPicPr>
@@ -8621,7 +8278,7 @@
                   <pic:spPr bwMode="auto">
                     <a:xfrm>
                       <a:off x="0" y="0"/>
-                      <a:ext cx="5731510" cy="2249805"/>
+                      <a:ext cx="5731510" cy="2348230"/>
                     </a:xfrm>
                     <a:prstGeom prst="rect">
                       <a:avLst/>
@@ -8749,21 +8406,7 @@
         <w:rPr>
           <w:rFonts w:eastAsiaTheme="minorEastAsia"/>
         </w:rPr>
-        <w:t xml:space="preserve">According to rule of 7 FEDAI (foreign exchange dealers association of India) forward contract is deliverable at a future data duration of the contract being  computed from the spot value date of the transaction </w:t>
-      </w:r>
-      <w:proofErr w:type="spellStart"/>
-      <w:r>
-        <w:rPr>
-          <w:rFonts w:eastAsiaTheme="minorEastAsia"/>
-        </w:rPr>
-        <w:t>Eg.</w:t>
-      </w:r>
-      <w:proofErr w:type="spellEnd"/>
-      <w:r>
-        <w:rPr>
-          <w:rFonts w:eastAsiaTheme="minorEastAsia"/>
-        </w:rPr>
-        <w:t xml:space="preserve"> </w:t>
+        <w:t xml:space="preserve">According to rule of 7 FEDAI (foreign exchange dealers association of India) forward contract is deliverable at a future data duration of the contract being  computed from the spot value date of the transaction Eg. </w:t>
       </w:r>
       <w:proofErr w:type="gramStart"/>
       <w:r>
@@ -16455,7 +16098,7 @@
 </file>
 
 <file path=word/diagrams/colors3.xml><?xml version="1.0" encoding="utf-8"?>
-<dgm:colorsDef xmlns:dgm="http://schemas.openxmlformats.org/drawingml/2006/diagram" xmlns:a="http://schemas.openxmlformats.org/drawingml/2006/main" uniqueId="urn:microsoft.com/office/officeart/2005/8/colors/accent1_2">
+<dgm:colorsDef xmlns:dgm="http://schemas.openxmlformats.org/drawingml/2006/diagram" xmlns:a="http://schemas.openxmlformats.org/drawingml/2006/main" uniqueId="urn:microsoft.com/office/officeart/2005/8/colors/accent1_2#3">
   <dgm:title val=""/>
   <dgm:desc val=""/>
   <dgm:catLst>
@@ -17306,7 +16949,7 @@
 </file>
 
 <file path=word/diagrams/colors4.xml><?xml version="1.0" encoding="utf-8"?>
-<dgm:colorsDef xmlns:dgm="http://schemas.openxmlformats.org/drawingml/2006/diagram" xmlns:a="http://schemas.openxmlformats.org/drawingml/2006/main" uniqueId="urn:microsoft.com/office/officeart/2005/8/colors/accent1_2">
+<dgm:colorsDef xmlns:dgm="http://schemas.openxmlformats.org/drawingml/2006/diagram" xmlns:a="http://schemas.openxmlformats.org/drawingml/2006/main" uniqueId="urn:microsoft.com/office/officeart/2005/8/colors/accent1_2#4">
   <dgm:title val=""/>
   <dgm:desc val=""/>
   <dgm:catLst>
@@ -19316,7 +18959,7 @@
 <dgm:dataModel xmlns:dgm="http://schemas.openxmlformats.org/drawingml/2006/diagram" xmlns:a="http://schemas.openxmlformats.org/drawingml/2006/main">
   <dgm:ptLst>
     <dgm:pt modelId="{4AC32F54-C178-48A3-B9B8-9B621A06A5AF}" type="doc">
-      <dgm:prSet loTypeId="urn:microsoft.com/office/officeart/2005/8/layout/orgChart1" loCatId="hierarchy" qsTypeId="urn:microsoft.com/office/officeart/2005/8/quickstyle/simple1" qsCatId="simple" csTypeId="urn:microsoft.com/office/officeart/2005/8/colors/accent1_2" csCatId="accent1"/>
+      <dgm:prSet loTypeId="urn:microsoft.com/office/officeart/2005/8/layout/orgChart1" loCatId="hierarchy" qsTypeId="urn:microsoft.com/office/officeart/2005/8/quickstyle/simple1#3" qsCatId="simple" csTypeId="urn:microsoft.com/office/officeart/2005/8/colors/accent1_2#3" csCatId="accent1"/>
       <dgm:spPr/>
       <dgm:t>
         <a:bodyPr/>
@@ -19687,7 +19330,7 @@
 <dgm:dataModel xmlns:dgm="http://schemas.openxmlformats.org/drawingml/2006/diagram" xmlns:a="http://schemas.openxmlformats.org/drawingml/2006/main">
   <dgm:ptLst>
     <dgm:pt modelId="{47A90E81-BD10-4373-9382-49C921028069}" type="doc">
-      <dgm:prSet loTypeId="urn:microsoft.com/office/officeart/2005/8/layout/hierarchy6" loCatId="hierarchy" qsTypeId="urn:microsoft.com/office/officeart/2005/8/quickstyle/simple1" qsCatId="simple" csTypeId="urn:microsoft.com/office/officeart/2005/8/colors/accent1_2" csCatId="accent1"/>
+      <dgm:prSet loTypeId="urn:microsoft.com/office/officeart/2005/8/layout/hierarchy6" loCatId="hierarchy" qsTypeId="urn:microsoft.com/office/officeart/2005/8/quickstyle/simple1#4" qsCatId="simple" csTypeId="urn:microsoft.com/office/officeart/2005/8/colors/accent1_2#4" csCatId="accent1"/>
       <dgm:spPr/>
       <dgm:t>
         <a:bodyPr/>
@@ -29727,7 +29370,7 @@
 </file>
 
 <file path=word/diagrams/quickStyle3.xml><?xml version="1.0" encoding="utf-8"?>
-<dgm:styleDef xmlns:dgm="http://schemas.openxmlformats.org/drawingml/2006/diagram" xmlns:a="http://schemas.openxmlformats.org/drawingml/2006/main" uniqueId="urn:microsoft.com/office/officeart/2005/8/quickstyle/simple1">
+<dgm:styleDef xmlns:dgm="http://schemas.openxmlformats.org/drawingml/2006/diagram" xmlns:a="http://schemas.openxmlformats.org/drawingml/2006/main" uniqueId="urn:microsoft.com/office/officeart/2005/8/quickstyle/simple1#3">
   <dgm:title val=""/>
   <dgm:desc val=""/>
   <dgm:catLst>
@@ -30915,7 +30558,7 @@
 </file>
 
 <file path=word/diagrams/quickStyle4.xml><?xml version="1.0" encoding="utf-8"?>
-<dgm:styleDef xmlns:dgm="http://schemas.openxmlformats.org/drawingml/2006/diagram" xmlns:a="http://schemas.openxmlformats.org/drawingml/2006/main" uniqueId="urn:microsoft.com/office/officeart/2005/8/quickstyle/simple1">
+<dgm:styleDef xmlns:dgm="http://schemas.openxmlformats.org/drawingml/2006/diagram" xmlns:a="http://schemas.openxmlformats.org/drawingml/2006/main" uniqueId="urn:microsoft.com/office/officeart/2005/8/quickstyle/simple1#4">
   <dgm:title val=""/>
   <dgm:desc val=""/>
   <dgm:catLst>

</xml_diff>